<commit_message>
docs: resolver observaciones finales de ET0
</commit_message>
<xml_diff>
--- a/docs/memoria/TFM_entrega_final_2026-10-29.docx
+++ b/docs/memoria/TFM_entrega_final_2026-10-29.docx
@@ -26690,21 +26690,17 @@
     </w:p>
     <w:p>
       <w:r>
-        <w:t>La validación con origen rodante prueba 2023, 2024 y 2025 entrenando solo con años anteriores. Ridge completo obtuvo menor MAE puntual que la media de siete días en las 81 combinaciones estación–año–horizonte. El bootstrap por bloques produjo 63 intervalos favorables a Ridge y 18 no concluyentes; ninguno favoreció a la referencia. Frente a la persistencia estacional, los 81 intervalos favorecieron a Ridge. En la ablación entre Ridge completo y reducido, 74 intervalos cruzaron cero, dos favorecieron al completo y cinco al reducido; por tanto, no se atribuye una ganancia estable a las variables meteorológicas auxiliares.</w:t>
-      </w:r>
-    </w:p>
-    <w:p>
-      <w:r>
-        <w:t>La comprobación operativa de 2026 distinguió cobertura del CSV agronómico y disponibilidad de la serie ET0 consultada. El CSV de alfalfa Z06 contiene 239 jornadas de campaña, pero una consulta concreta al servicio de datos devolvió solo 13 jornadas continuas para la ventana solicitada. Tras exigir 14 observaciones completas, aquella ejecución tuvo 0 % de cobertura Ridge. Esta cifra describe una limitación de esa consulta y del flujo operativo, no una ausencia estructural de datos en la estación. AL01 y BA08 alcanzaron aproximadamente un 97 % de cobertura. Cuando faltan ventanas completas, el sistema utiliza la media de siete días durante un máximo de siete días y después declara la recomendación no disponible.</w:t>
-      </w:r>
-    </w:p>
-    <w:p>
-      <w:r>
-        <w:t xml:space="preserve">Streamlit genera una ET0 distinta para cada fecha, aplica ET0 × Kc, descuenta la lluvia AEMET utilizable y muestra el método y un intervalo residual central del 80 %. Antes de reunir 30 casos prospectivos consolidados y pareados, Ridge se utiliza de forma provisional por su evidencia retrospectiva, con el método identificado y el respaldo disponible cuando faltan datos. Alcanzado ese umbral, la puerta evalúa como máximo los 60 casos más recientes y mantiene Ridge solo si reduce al menos un 5 % el MAE de la media de siete días; de lo contrario activa automáticamente el respaldo. Una tarea diaria emite h=1…9, conserva el primer valor SiAR provisional, detecta </w:t>
-      </w:r>
-      <w:r>
-        <w:lastRenderedPageBreak/>
-        <w:t>revisiones y consolida tras siete días. El reentrenamiento es anual y está sujeto al mismo control temporal.</w:t>
+        <w:t>La validación con origen rodante prueba 2023, 2024 y 2025 entrenando solo con años anteriores. Ridge completo obtuvo menor MAE puntual que la media de siete días en las 81 combinaciones estación–año–horizonte. El bootstrap por bloques produjo 63 intervalos favorables a Ridge y 18 no concluyentes; ninguno favoreció a la referencia. Frente a la persistencia estacional, los 81 intervalos favorecieron a Ridge. Esta referencia suma a la ET0 observada en el origen el cambio climatológico medio entre el día del año de origen y el día objetivo, estimado solo con los años de entrenamiento: ET0(t+h) = ET0(t) + climatología(día t+h) − climatología(día t). En la ablación entre Ridge completo y reducido, 74 intervalos cruzaron cero, dos favorecieron al completo y cinco al reducido; no se atribuye una ganancia estable a las variables meteorológicas auxiliares.</w:t>
+      </w:r>
+    </w:p>
+    <w:p>
+      <w:r>
+        <w:t>La comprobación operativa de 2026 distinguió la cobertura del CSV agronómico y la disponibilidad de la serie ET0 consultada. El CSV de alfalfa Z06 contiene 239 jornadas, mientras que la consulta pública repetida el 30 de octubre de 2026, con 60 días solicitados, devolvió 13 registros hasta el 28 de octubre. El 0 % obtenido por la simulación con ventanas completas describe ese protocolo, no una ausencia estructural de datos ni una indisponibilidad absoluta de Ridge. Con una sola entrada ausente el selector utilizó Ridge a un día; para el objetivo del día 30 activó la media de siete días porque requería dos imputaciones y la política admite como máximo una. AL01 y BA08 alcanzaron aproximadamente un 97 % de cobertura.</w:t>
+      </w:r>
+    </w:p>
+    <w:p>
+      <w:r>
+        <w:t>Streamlit genera una ET0 distinta para cada fecha, aplica ET0 × Kc, descuenta la lluvia AEMET utilizable y muestra el método y un intervalo residual central del 80 %. Antes de reunir 30 casos prospectivos consolidados y pareados, Ridge se utiliza de forma provisional. Alcanzado ese umbral, la puerta evalúa como máximo los 60 casos más recientes y mantiene Ridge solo si reduce al menos un 5 % el MAE de la media de siete días; de lo contrario activa automáticamente el respaldo. Una tarea diaria emite h=1–9, conserva el primer valor SiAR provisional, detecta revisiones y consolida tras siete días. El reentrenamiento es anual y está sujeto al mismo control temporal. La aplicación publicada ejecuta desde main el módulo src/dss/app_streamlit.py, que invoca los artefactos Ridge mediante src/dss/predict_et0.py.</w:t>
       </w:r>
     </w:p>
     <w:p>
@@ -26731,7 +26727,7 @@
       <w:tr>
         <w:tc>
           <w:tcPr>
-            <w:tcW w:w="737" w:type="dxa"/>
+            <w:tcW w:w="1134" w:type="dxa"/>
             <w:tcBorders>
               <w:top w:val="single" w:sz="4" w:space="0" w:color="D9D9D9"/>
               <w:left w:val="single" w:sz="4" w:space="0" w:color="D9D9D9"/>
@@ -26839,7 +26835,7 @@
         </w:tc>
         <w:tc>
           <w:tcPr>
-            <w:tcW w:w="3175" w:type="dxa"/>
+            <w:tcW w:w="2778" w:type="dxa"/>
             <w:tcBorders>
               <w:top w:val="single" w:sz="4" w:space="0" w:color="D9D9D9"/>
               <w:left w:val="single" w:sz="4" w:space="0" w:color="D9D9D9"/>
@@ -26867,7 +26863,7 @@
       <w:tr>
         <w:tc>
           <w:tcPr>
-            <w:tcW w:w="737" w:type="dxa"/>
+            <w:tcW w:w="1134" w:type="dxa"/>
             <w:tcBorders>
               <w:top w:val="single" w:sz="4" w:space="0" w:color="D9D9D9"/>
               <w:left w:val="single" w:sz="4" w:space="0" w:color="D9D9D9"/>
@@ -26967,7 +26963,7 @@
         </w:tc>
         <w:tc>
           <w:tcPr>
-            <w:tcW w:w="3175" w:type="dxa"/>
+            <w:tcW w:w="2778" w:type="dxa"/>
             <w:tcBorders>
               <w:top w:val="single" w:sz="4" w:space="0" w:color="D9D9D9"/>
               <w:left w:val="single" w:sz="4" w:space="0" w:color="D9D9D9"/>
@@ -26993,7 +26989,7 @@
       <w:tr>
         <w:tc>
           <w:tcPr>
-            <w:tcW w:w="737" w:type="dxa"/>
+            <w:tcW w:w="1134" w:type="dxa"/>
             <w:tcBorders>
               <w:top w:val="single" w:sz="4" w:space="0" w:color="D9D9D9"/>
               <w:left w:val="single" w:sz="4" w:space="0" w:color="D9D9D9"/>
@@ -27093,7 +27089,7 @@
         </w:tc>
         <w:tc>
           <w:tcPr>
-            <w:tcW w:w="3175" w:type="dxa"/>
+            <w:tcW w:w="2778" w:type="dxa"/>
             <w:tcBorders>
               <w:top w:val="single" w:sz="4" w:space="0" w:color="D9D9D9"/>
               <w:left w:val="single" w:sz="4" w:space="0" w:color="D9D9D9"/>
@@ -27125,7 +27121,7 @@
       <w:tr>
         <w:tc>
           <w:tcPr>
-            <w:tcW w:w="737" w:type="dxa"/>
+            <w:tcW w:w="1134" w:type="dxa"/>
             <w:tcBorders>
               <w:top w:val="single" w:sz="4" w:space="0" w:color="D9D9D9"/>
               <w:left w:val="single" w:sz="4" w:space="0" w:color="D9D9D9"/>
@@ -27225,7 +27221,7 @@
         </w:tc>
         <w:tc>
           <w:tcPr>
-            <w:tcW w:w="3175" w:type="dxa"/>
+            <w:tcW w:w="2778" w:type="dxa"/>
             <w:tcBorders>
               <w:top w:val="single" w:sz="4" w:space="0" w:color="D9D9D9"/>
               <w:left w:val="single" w:sz="4" w:space="0" w:color="D9D9D9"/>
@@ -27251,7 +27247,7 @@
       <w:tr>
         <w:tc>
           <w:tcPr>
-            <w:tcW w:w="737" w:type="dxa"/>
+            <w:tcW w:w="1134" w:type="dxa"/>
             <w:tcBorders>
               <w:top w:val="single" w:sz="4" w:space="0" w:color="D9D9D9"/>
               <w:left w:val="single" w:sz="4" w:space="0" w:color="D9D9D9"/>
@@ -27351,7 +27347,7 @@
         </w:tc>
         <w:tc>
           <w:tcPr>
-            <w:tcW w:w="3175" w:type="dxa"/>
+            <w:tcW w:w="2778" w:type="dxa"/>
             <w:tcBorders>
               <w:top w:val="single" w:sz="4" w:space="0" w:color="D9D9D9"/>
               <w:left w:val="single" w:sz="4" w:space="0" w:color="D9D9D9"/>
@@ -27377,7 +27373,7 @@
       <w:tr>
         <w:tc>
           <w:tcPr>
-            <w:tcW w:w="737" w:type="dxa"/>
+            <w:tcW w:w="1134" w:type="dxa"/>
             <w:tcBorders>
               <w:top w:val="single" w:sz="4" w:space="0" w:color="D9D9D9"/>
               <w:left w:val="single" w:sz="4" w:space="0" w:color="D9D9D9"/>
@@ -27477,7 +27473,7 @@
         </w:tc>
         <w:tc>
           <w:tcPr>
-            <w:tcW w:w="3175" w:type="dxa"/>
+            <w:tcW w:w="2778" w:type="dxa"/>
             <w:tcBorders>
               <w:top w:val="single" w:sz="4" w:space="0" w:color="D9D9D9"/>
               <w:left w:val="single" w:sz="4" w:space="0" w:color="D9D9D9"/>
@@ -27503,7 +27499,7 @@
       <w:tr>
         <w:tc>
           <w:tcPr>
-            <w:tcW w:w="737" w:type="dxa"/>
+            <w:tcW w:w="1134" w:type="dxa"/>
             <w:tcBorders>
               <w:top w:val="single" w:sz="4" w:space="0" w:color="D9D9D9"/>
               <w:left w:val="single" w:sz="4" w:space="0" w:color="D9D9D9"/>
@@ -27603,7 +27599,7 @@
         </w:tc>
         <w:tc>
           <w:tcPr>
-            <w:tcW w:w="3175" w:type="dxa"/>
+            <w:tcW w:w="2778" w:type="dxa"/>
             <w:tcBorders>
               <w:top w:val="single" w:sz="4" w:space="0" w:color="D9D9D9"/>
               <w:left w:val="single" w:sz="4" w:space="0" w:color="D9D9D9"/>
@@ -27629,7 +27625,7 @@
       <w:tr>
         <w:tc>
           <w:tcPr>
-            <w:tcW w:w="737" w:type="dxa"/>
+            <w:tcW w:w="1134" w:type="dxa"/>
             <w:tcBorders>
               <w:top w:val="single" w:sz="4" w:space="0" w:color="D9D9D9"/>
               <w:left w:val="single" w:sz="4" w:space="0" w:color="D9D9D9"/>
@@ -27729,7 +27725,7 @@
         </w:tc>
         <w:tc>
           <w:tcPr>
-            <w:tcW w:w="3175" w:type="dxa"/>
+            <w:tcW w:w="2778" w:type="dxa"/>
             <w:tcBorders>
               <w:top w:val="single" w:sz="4" w:space="0" w:color="D9D9D9"/>
               <w:left w:val="single" w:sz="4" w:space="0" w:color="D9D9D9"/>
@@ -27755,7 +27751,7 @@
       <w:tr>
         <w:tc>
           <w:tcPr>
-            <w:tcW w:w="737" w:type="dxa"/>
+            <w:tcW w:w="1134" w:type="dxa"/>
             <w:tcBorders>
               <w:top w:val="single" w:sz="4" w:space="0" w:color="D9D9D9"/>
               <w:left w:val="single" w:sz="4" w:space="0" w:color="D9D9D9"/>
@@ -27855,7 +27851,7 @@
         </w:tc>
         <w:tc>
           <w:tcPr>
-            <w:tcW w:w="3175" w:type="dxa"/>
+            <w:tcW w:w="2778" w:type="dxa"/>
             <w:tcBorders>
               <w:top w:val="single" w:sz="4" w:space="0" w:color="D9D9D9"/>
               <w:left w:val="single" w:sz="4" w:space="0" w:color="D9D9D9"/>
@@ -27881,7 +27877,7 @@
       <w:tr>
         <w:tc>
           <w:tcPr>
-            <w:tcW w:w="737" w:type="dxa"/>
+            <w:tcW w:w="1134" w:type="dxa"/>
             <w:tcBorders>
               <w:top w:val="single" w:sz="4" w:space="0" w:color="D9D9D9"/>
               <w:left w:val="single" w:sz="4" w:space="0" w:color="D9D9D9"/>
@@ -27981,7 +27977,7 @@
         </w:tc>
         <w:tc>
           <w:tcPr>
-            <w:tcW w:w="3175" w:type="dxa"/>
+            <w:tcW w:w="2778" w:type="dxa"/>
             <w:tcBorders>
               <w:top w:val="single" w:sz="4" w:space="0" w:color="D9D9D9"/>
               <w:left w:val="single" w:sz="4" w:space="0" w:color="D9D9D9"/>
@@ -28010,10 +28006,7 @@
         <w:spacing w:before="60"/>
       </w:pPr>
       <w:r>
-        <w:t xml:space="preserve">Nota: los MAE son medias de nueve ventanas (tres estaciones × tres años de prueba). La </w:t>
-      </w:r>
-      <w:r>
-        <w:t>aplicación utiliza h=2…8 cuando recomienda desde hoy y h=3…9 cuando comienza mañana. Los resultados proceden de docs/data_samples/et0_multiyear_robustness.csv y et0_multiyear_uncertainty_by_horizon.csv. La evaluación extremo a extremo de necesidad neta solo se realizó a un día en pimiento, maíz y algodón, con mejoras relativas del 18,6 %, 23,3 % y 18,2 %, respectivamente; no se extrapola esa mejora a h=2…8.</w:t>
+        <w:t>Nota: los MAE son medias de nueve ventanas (tres estaciones × tres años de prueba), calculadas directamente desde docs/data_samples/et0_multiyear_robustness.csv y redondeadas a tres decimales; el valor exacto de h=1 es 0,471970 mm/día y se muestra como 0,472. La aplicación utiliza h=2–8 cuando recomienda desde hoy y h=3–9 cuando comienza mañana. La evaluación extremo a extremo de necesidad neta solo se realizó a un día en pimiento, maíz y algodón, con mejoras relativas del 18,6 %, 23,3 % y 18,2 %, respectivamente; no se extrapola esa mejora a h=2–8.</w:t>
       </w:r>
     </w:p>
     <w:p>
@@ -36721,7 +36714,7 @@
     </w:p>
     <w:p>
       <w:r>
-        <w:t>La tercera afecta a la cobertura predictiva. El sistema dispone de ET0 Ridge multianual por horizonte y descuenta la lluvia AEMET disponible, pero su validación prospectiva acaba de comenzar y aún no contiene 30 casos consolidados. La cobertura retrospectiva de 2026 es cercana al 97 % en AL01 y BA08, pero nula para Ridge en Z06 porque la fuente solo devolvió 13 días continuos. Los intervalos mostrados son cuantiles empíricos de residuo, no una garantía probabilística calibrada para una parcela concreta.</w:t>
+        <w:t>La tercera afecta a la cobertura predictiva. El sistema dispone de ET0 Ridge multianual por horizonte y descuenta la lluvia AEMET disponible, pero su validación prospectiva aún no contiene 30 casos consolidados. La simulación con ventanas completas alcanza cerca del 97 % en AL01 y BA08 y 0 % en la consulta operativa de Z06 que devolvió 13 jornadas. Ese porcentaje no describe el CSV de alfalfa, con 239 jornadas, ni implica que Ridge sea siempre imposible: la comprobación pública del 30 de octubre permitió Ridge a un día con una imputación y activó la media de siete días a dos días al requerir dos imputaciones. Los intervalos son cuantiles empíricos de residuo, no una garantía probabilística calibrada para una parcela concreta.</w:t>
       </w:r>
     </w:p>
     <w:p>
@@ -37019,7 +37012,7 @@
           </w:tcPr>
           <w:p>
             <w:r>
-              <w:t>ET0 prevista sin evidencia prospectiva suficiente y cobertura nula de Ridge en Z06</w:t>
+              <w:t>ET0 sin evidencia prospectiva suficiente; Z06 devuelve 13 jornadas y alterna Ridge o respaldo según horizonte e imputaciones</w:t>
             </w:r>
           </w:p>
         </w:tc>
@@ -37037,7 +37030,7 @@
           </w:tcPr>
           <w:p>
             <w:r>
-              <w:t>Que la mejora retrospectiva se mantenga operativamente en todas las estaciones</w:t>
+              <w:t>Que la mejora retrospectiva se mantenga en todas las estaciones y horizontes</w:t>
             </w:r>
           </w:p>
         </w:tc>
@@ -37367,7 +37360,7 @@
     </w:p>
     <w:p>
       <w:r>
-        <w:t>La segunda prioridad ya no es construir una primera ET0 prevista, sino validar prospectivamente la predicción Ridge h=1…9, ampliar la cobertura de Z06 y vigilar la deriva. Una tarea diaria archiva cada emisión y la contrasta con el primer valor SiAR disponible y con sus revisiones. El umbral exige al menos 30 casos consolidados y un MAE inferior al respaldo de media de siete días; si deja de cumplirse, el sistema vuelve automáticamente a ese respaldo. El reentrenamiento es anual y solo sustituye el artefacto vigente si supera el mismo control temporal. Como evolución adicional, el archivo de emisiones AEMET permitirá evaluar y corregir el error local de la lluvia prevista.</w:t>
+        <w:t>La segunda prioridad ya no es construir una primera ET0 prevista, sino validar prospectivamente Ridge h=1–9, ampliar la cobertura de Z06 y vigilar la deriva. Una tarea diaria archiva cada emisión y la contrasta con el primer valor SiAR disponible y sus revisiones. La puerta exige al menos 30 casos consolidados y pareados; sobre una ventana móvil máxima de 60 casos, Ridge debe reducir al menos un 5 % el MAE del respaldo de media de siete días. Si deja de cumplirse, el sistema vuelve automáticamente al respaldo. El reentrenamiento es anual y solo sustituye el artefacto vigente si supera el mismo control temporal. El archivo de emisiones AEMET permitirá evaluar y corregir el error local de la lluvia prevista.</w:t>
       </w:r>
     </w:p>
     <w:p>

</xml_diff>

<commit_message>
docs: cerrar reproducibilidad de la entrega final
</commit_message>
<xml_diff>
--- a/docs/memoria/TFM_entrega_final_2026-10-29.docx
+++ b/docs/memoria/TFM_entrega_final_2026-10-29.docx
@@ -26695,7 +26695,7 @@
     </w:p>
     <w:p>
       <w:r>
-        <w:t>La comprobación operativa de 2026 distinguió la cobertura del CSV agronómico y la disponibilidad de la serie ET0 consultada. El CSV de alfalfa Z06 contiene 239 jornadas, mientras que la consulta pública repetida el 30 de octubre de 2026, con 60 días solicitados, devolvió 13 registros hasta el 28 de octubre. El 0 % obtenido por la simulación con ventanas completas describe ese protocolo, no una ausencia estructural de datos ni una indisponibilidad absoluta de Ridge. Con una sola entrada ausente el selector utilizó Ridge a un día; para el objetivo del día 30 activó la media de siete días porque requería dos imputaciones y la política admite como máximo una. AL01 y BA08 alcanzaron aproximadamente un 97 % de cobertura.</w:t>
+        <w:t>La comprobación operativa de 2026 distinguió la cobertura del CSV agronómico y la disponibilidad de la serie ET0 consultada. El CSV de alfalfa Z06 contiene 239 jornadas, mientras que la consulta pública repetida el 30 de octubre de 2026, con 60 días solicitados, devolvió 13 registros hasta el 28 de octubre. El 0 % obtenido por la simulación con ventanas completas describe ese protocolo. Con la evidencia disponible no se ha determinado si la devolución parcial obedece a una incidencia, a un retraso de publicación o a una limitación de la consulta. Con una sola entrada ausente el selector utilizó Ridge a un día; para el objetivo del día 30 activó la media de siete días porque requería dos imputaciones y la política admite como máximo una. AL01 y BA08 alcanzaron aproximadamente un 97 % de cobertura.</w:t>
       </w:r>
     </w:p>
     <w:p>
@@ -36714,7 +36714,7 @@
     </w:p>
     <w:p>
       <w:r>
-        <w:t>La tercera afecta a la cobertura predictiva. El sistema dispone de ET0 Ridge multianual por horizonte y descuenta la lluvia AEMET disponible, pero su validación prospectiva aún no contiene 30 casos consolidados. La simulación con ventanas completas alcanza cerca del 97 % en AL01 y BA08 y 0 % en la consulta operativa de Z06 que devolvió 13 jornadas. Ese porcentaje no describe el CSV de alfalfa, con 239 jornadas, ni implica que Ridge sea siempre imposible: la comprobación pública del 30 de octubre permitió Ridge a un día con una imputación y activó la media de siete días a dos días al requerir dos imputaciones. Los intervalos son cuantiles empíricos de residuo, no una garantía probabilística calibrada para una parcela concreta.</w:t>
+        <w:t>La tercera afecta a la cobertura predictiva. El sistema dispone de ET0 Ridge multianual por horizonte y descuenta la lluvia AEMET disponible, pero su validación prospectiva aún no contiene 30 casos consolidados. La simulación con ventanas completas alcanza cerca del 97 % en AL01 y BA08 y 0 % en la consulta operativa de Z06 que devolvió 13 jornadas. No se ha determinado si esta devolución parcial responde a una incidencia, a un retraso de publicación o a una limitación de la consulta. Ese porcentaje no describe el CSV de alfalfa, con 239 jornadas, ni implica que Ridge sea siempre imposible: la comprobación pública del 30 de octubre permitió Ridge a un día con una imputación y activó la media de siete días a dos días al requerir dos imputaciones. Los intervalos son cuantiles empíricos de residuo, no una garantía probabilística calibrada para una parcela concreta.</w:t>
       </w:r>
     </w:p>
     <w:p>
@@ -38250,16 +38250,7 @@
         <w:pStyle w:val="BibliografaAPA"/>
       </w:pPr>
       <w:r>
-        <w:t xml:space="preserve">Sui, R. (2017). Soil moisture sensing. </w:t>
-      </w:r>
-      <w:r>
-        <w:rPr>
-          <w:i/>
-        </w:rPr>
-        <w:t>Irrigation Today, 1</w:t>
-      </w:r>
-      <w:r>
-        <w:t xml:space="preserve">(3), 16–17. </w:t>
+        <w:t xml:space="preserve">Sui, R. (2017). Use of soil moisture sensors for irrigation scheduling. Trade Journal Publication, 1(3), 16–17. </w:t>
       </w:r>
       <w:hyperlink r:id="rId57">
         <w:r>
@@ -38474,6 +38465,9 @@
       </w:hyperlink>
       <w:r>
         <w:t xml:space="preserve"> Las consultas nuevas a AEMET requieren una clave privada fuera de Git.</w:t>
+      </w:r>
+      <w:r>
+        <w:t xml:space="preserve"> El estado reproducible de esta entrega queda fijado en la etiqueta v1.0.6-entrega-final de main; los comandos de este anexo deben ejecutarse desde esa referencia.</w:t>
       </w:r>
     </w:p>
     <w:p>

</xml_diff>

<commit_message>
fix: cerrar auditoria de entrega y destacar disponibilidad en Streamlit
</commit_message>
<xml_diff>
--- a/docs/memoria/TFM_entrega_final_2026-10-29.docx
+++ b/docs/memoria/TFM_entrega_final_2026-10-29.docx
@@ -381,7 +381,7 @@
       <w:r>
         <w:fldChar w:fldCharType="separate"/>
       </w:r>
-      <w:hyperlink w:anchor="_Toc244210897" w:history="1">
+      <w:hyperlink w:anchor="_Toc244254006" w:history="1">
         <w:r>
           <w:rPr>
             <w:rStyle w:val="Hipervnculo"/>
@@ -408,7 +408,7 @@
             <w:noProof/>
             <w:webHidden/>
           </w:rPr>
-          <w:instrText xml:space="preserve"> PAGEREF _Toc244210897 \h </w:instrText>
+          <w:instrText xml:space="preserve"> PAGEREF _Toc244254006 \h </w:instrText>
         </w:r>
         <w:r>
           <w:rPr>
@@ -455,7 +455,7 @@
           <w14:ligatures w14:val="standardContextual"/>
         </w:rPr>
       </w:pPr>
-      <w:hyperlink w:anchor="_Toc244210898" w:history="1">
+      <w:hyperlink w:anchor="_Toc244254007" w:history="1">
         <w:r>
           <w:rPr>
             <w:rStyle w:val="Hipervnculo"/>
@@ -482,7 +482,7 @@
             <w:noProof/>
             <w:webHidden/>
           </w:rPr>
-          <w:instrText xml:space="preserve"> PAGEREF _Toc244210898 \h </w:instrText>
+          <w:instrText xml:space="preserve"> PAGEREF _Toc244254007 \h </w:instrText>
         </w:r>
         <w:r>
           <w:rPr>
@@ -529,7 +529,7 @@
           <w14:ligatures w14:val="standardContextual"/>
         </w:rPr>
       </w:pPr>
-      <w:hyperlink w:anchor="_Toc244210899" w:history="1">
+      <w:hyperlink w:anchor="_Toc244254008" w:history="1">
         <w:r>
           <w:rPr>
             <w:rStyle w:val="Hipervnculo"/>
@@ -556,7 +556,7 @@
             <w:noProof/>
             <w:webHidden/>
           </w:rPr>
-          <w:instrText xml:space="preserve"> PAGEREF _Toc244210899 \h </w:instrText>
+          <w:instrText xml:space="preserve"> PAGEREF _Toc244254008 \h </w:instrText>
         </w:r>
         <w:r>
           <w:rPr>
@@ -603,7 +603,7 @@
           <w14:ligatures w14:val="standardContextual"/>
         </w:rPr>
       </w:pPr>
-      <w:hyperlink w:anchor="_Toc244210900" w:history="1">
+      <w:hyperlink w:anchor="_Toc244254009" w:history="1">
         <w:r>
           <w:rPr>
             <w:rStyle w:val="Hipervnculo"/>
@@ -630,7 +630,7 @@
             <w:noProof/>
             <w:webHidden/>
           </w:rPr>
-          <w:instrText xml:space="preserve"> PAGEREF _Toc244210900 \h </w:instrText>
+          <w:instrText xml:space="preserve"> PAGEREF _Toc244254009 \h </w:instrText>
         </w:r>
         <w:r>
           <w:rPr>
@@ -677,7 +677,7 @@
           <w14:ligatures w14:val="standardContextual"/>
         </w:rPr>
       </w:pPr>
-      <w:hyperlink w:anchor="_Toc244210901" w:history="1">
+      <w:hyperlink w:anchor="_Toc244254010" w:history="1">
         <w:r>
           <w:rPr>
             <w:rStyle w:val="Hipervnculo"/>
@@ -704,7 +704,7 @@
             <w:noProof/>
             <w:webHidden/>
           </w:rPr>
-          <w:instrText xml:space="preserve"> PAGEREF _Toc244210901 \h </w:instrText>
+          <w:instrText xml:space="preserve"> PAGEREF _Toc244254010 \h </w:instrText>
         </w:r>
         <w:r>
           <w:rPr>
@@ -751,7 +751,7 @@
           <w14:ligatures w14:val="standardContextual"/>
         </w:rPr>
       </w:pPr>
-      <w:hyperlink w:anchor="_Toc244210902" w:history="1">
+      <w:hyperlink w:anchor="_Toc244254011" w:history="1">
         <w:r>
           <w:rPr>
             <w:rStyle w:val="Hipervnculo"/>
@@ -778,7 +778,7 @@
             <w:noProof/>
             <w:webHidden/>
           </w:rPr>
-          <w:instrText xml:space="preserve"> PAGEREF _Toc244210902 \h </w:instrText>
+          <w:instrText xml:space="preserve"> PAGEREF _Toc244254011 \h </w:instrText>
         </w:r>
         <w:r>
           <w:rPr>
@@ -825,7 +825,7 @@
           <w14:ligatures w14:val="standardContextual"/>
         </w:rPr>
       </w:pPr>
-      <w:hyperlink w:anchor="_Toc244210903" w:history="1">
+      <w:hyperlink w:anchor="_Toc244254012" w:history="1">
         <w:r>
           <w:rPr>
             <w:rStyle w:val="Hipervnculo"/>
@@ -852,7 +852,7 @@
             <w:noProof/>
             <w:webHidden/>
           </w:rPr>
-          <w:instrText xml:space="preserve"> PAGEREF _Toc244210903 \h </w:instrText>
+          <w:instrText xml:space="preserve"> PAGEREF _Toc244254012 \h </w:instrText>
         </w:r>
         <w:r>
           <w:rPr>
@@ -899,7 +899,7 @@
           <w14:ligatures w14:val="standardContextual"/>
         </w:rPr>
       </w:pPr>
-      <w:hyperlink w:anchor="_Toc244210904" w:history="1">
+      <w:hyperlink w:anchor="_Toc244254013" w:history="1">
         <w:r>
           <w:rPr>
             <w:rStyle w:val="Hipervnculo"/>
@@ -926,7 +926,7 @@
             <w:noProof/>
             <w:webHidden/>
           </w:rPr>
-          <w:instrText xml:space="preserve"> PAGEREF _Toc244210904 \h </w:instrText>
+          <w:instrText xml:space="preserve"> PAGEREF _Toc244254013 \h </w:instrText>
         </w:r>
         <w:r>
           <w:rPr>
@@ -973,7 +973,7 @@
           <w14:ligatures w14:val="standardContextual"/>
         </w:rPr>
       </w:pPr>
-      <w:hyperlink w:anchor="_Toc244210905" w:history="1">
+      <w:hyperlink w:anchor="_Toc244254014" w:history="1">
         <w:r>
           <w:rPr>
             <w:rStyle w:val="Hipervnculo"/>
@@ -1000,7 +1000,7 @@
             <w:noProof/>
             <w:webHidden/>
           </w:rPr>
-          <w:instrText xml:space="preserve"> PAGEREF _Toc244210905 \h </w:instrText>
+          <w:instrText xml:space="preserve"> PAGEREF _Toc244254014 \h </w:instrText>
         </w:r>
         <w:r>
           <w:rPr>
@@ -1047,7 +1047,7 @@
           <w14:ligatures w14:val="standardContextual"/>
         </w:rPr>
       </w:pPr>
-      <w:hyperlink w:anchor="_Toc244210906" w:history="1">
+      <w:hyperlink w:anchor="_Toc244254015" w:history="1">
         <w:r>
           <w:rPr>
             <w:rStyle w:val="Hipervnculo"/>
@@ -1074,7 +1074,7 @@
             <w:noProof/>
             <w:webHidden/>
           </w:rPr>
-          <w:instrText xml:space="preserve"> PAGEREF _Toc244210906 \h </w:instrText>
+          <w:instrText xml:space="preserve"> PAGEREF _Toc244254015 \h </w:instrText>
         </w:r>
         <w:r>
           <w:rPr>
@@ -1121,7 +1121,7 @@
           <w14:ligatures w14:val="standardContextual"/>
         </w:rPr>
       </w:pPr>
-      <w:hyperlink w:anchor="_Toc244210907" w:history="1">
+      <w:hyperlink w:anchor="_Toc244254016" w:history="1">
         <w:r>
           <w:rPr>
             <w:rStyle w:val="Hipervnculo"/>
@@ -1148,7 +1148,7 @@
             <w:noProof/>
             <w:webHidden/>
           </w:rPr>
-          <w:instrText xml:space="preserve"> PAGEREF _Toc244210907 \h </w:instrText>
+          <w:instrText xml:space="preserve"> PAGEREF _Toc244254016 \h </w:instrText>
         </w:r>
         <w:r>
           <w:rPr>
@@ -1195,7 +1195,7 @@
           <w14:ligatures w14:val="standardContextual"/>
         </w:rPr>
       </w:pPr>
-      <w:hyperlink w:anchor="_Toc244210908" w:history="1">
+      <w:hyperlink w:anchor="_Toc244254017" w:history="1">
         <w:r>
           <w:rPr>
             <w:rStyle w:val="Hipervnculo"/>
@@ -1222,7 +1222,7 @@
             <w:noProof/>
             <w:webHidden/>
           </w:rPr>
-          <w:instrText xml:space="preserve"> PAGEREF _Toc244210908 \h </w:instrText>
+          <w:instrText xml:space="preserve"> PAGEREF _Toc244254017 \h </w:instrText>
         </w:r>
         <w:r>
           <w:rPr>
@@ -1269,7 +1269,7 @@
           <w14:ligatures w14:val="standardContextual"/>
         </w:rPr>
       </w:pPr>
-      <w:hyperlink w:anchor="_Toc244210909" w:history="1">
+      <w:hyperlink w:anchor="_Toc244254018" w:history="1">
         <w:r>
           <w:rPr>
             <w:rStyle w:val="Hipervnculo"/>
@@ -1296,7 +1296,7 @@
             <w:noProof/>
             <w:webHidden/>
           </w:rPr>
-          <w:instrText xml:space="preserve"> PAGEREF _Toc244210909 \h </w:instrText>
+          <w:instrText xml:space="preserve"> PAGEREF _Toc244254018 \h </w:instrText>
         </w:r>
         <w:r>
           <w:rPr>
@@ -1343,7 +1343,7 @@
           <w14:ligatures w14:val="standardContextual"/>
         </w:rPr>
       </w:pPr>
-      <w:hyperlink w:anchor="_Toc244210910" w:history="1">
+      <w:hyperlink w:anchor="_Toc244254019" w:history="1">
         <w:r>
           <w:rPr>
             <w:rStyle w:val="Hipervnculo"/>
@@ -1370,7 +1370,7 @@
             <w:noProof/>
             <w:webHidden/>
           </w:rPr>
-          <w:instrText xml:space="preserve"> PAGEREF _Toc244210910 \h </w:instrText>
+          <w:instrText xml:space="preserve"> PAGEREF _Toc244254019 \h </w:instrText>
         </w:r>
         <w:r>
           <w:rPr>
@@ -1417,7 +1417,7 @@
           <w14:ligatures w14:val="standardContextual"/>
         </w:rPr>
       </w:pPr>
-      <w:hyperlink w:anchor="_Toc244210911" w:history="1">
+      <w:hyperlink w:anchor="_Toc244254020" w:history="1">
         <w:r>
           <w:rPr>
             <w:rStyle w:val="Hipervnculo"/>
@@ -1444,7 +1444,7 @@
             <w:noProof/>
             <w:webHidden/>
           </w:rPr>
-          <w:instrText xml:space="preserve"> PAGEREF _Toc244210911 \h </w:instrText>
+          <w:instrText xml:space="preserve"> PAGEREF _Toc244254020 \h </w:instrText>
         </w:r>
         <w:r>
           <w:rPr>
@@ -1491,7 +1491,7 @@
           <w14:ligatures w14:val="standardContextual"/>
         </w:rPr>
       </w:pPr>
-      <w:hyperlink w:anchor="_Toc244210912" w:history="1">
+      <w:hyperlink w:anchor="_Toc244254021" w:history="1">
         <w:r>
           <w:rPr>
             <w:rStyle w:val="Hipervnculo"/>
@@ -1518,7 +1518,7 @@
             <w:noProof/>
             <w:webHidden/>
           </w:rPr>
-          <w:instrText xml:space="preserve"> PAGEREF _Toc244210912 \h </w:instrText>
+          <w:instrText xml:space="preserve"> PAGEREF _Toc244254021 \h </w:instrText>
         </w:r>
         <w:r>
           <w:rPr>
@@ -1565,7 +1565,7 @@
           <w14:ligatures w14:val="standardContextual"/>
         </w:rPr>
       </w:pPr>
-      <w:hyperlink w:anchor="_Toc244210913" w:history="1">
+      <w:hyperlink w:anchor="_Toc244254022" w:history="1">
         <w:r>
           <w:rPr>
             <w:rStyle w:val="Hipervnculo"/>
@@ -1592,7 +1592,7 @@
             <w:noProof/>
             <w:webHidden/>
           </w:rPr>
-          <w:instrText xml:space="preserve"> PAGEREF _Toc244210913 \h </w:instrText>
+          <w:instrText xml:space="preserve"> PAGEREF _Toc244254022 \h </w:instrText>
         </w:r>
         <w:r>
           <w:rPr>
@@ -1639,7 +1639,7 @@
           <w14:ligatures w14:val="standardContextual"/>
         </w:rPr>
       </w:pPr>
-      <w:hyperlink w:anchor="_Toc244210914" w:history="1">
+      <w:hyperlink w:anchor="_Toc244254023" w:history="1">
         <w:r>
           <w:rPr>
             <w:rStyle w:val="Hipervnculo"/>
@@ -1666,7 +1666,7 @@
             <w:noProof/>
             <w:webHidden/>
           </w:rPr>
-          <w:instrText xml:space="preserve"> PAGEREF _Toc244210914 \h </w:instrText>
+          <w:instrText xml:space="preserve"> PAGEREF _Toc244254023 \h </w:instrText>
         </w:r>
         <w:r>
           <w:rPr>
@@ -1713,7 +1713,7 @@
           <w14:ligatures w14:val="standardContextual"/>
         </w:rPr>
       </w:pPr>
-      <w:hyperlink w:anchor="_Toc244210915" w:history="1">
+      <w:hyperlink w:anchor="_Toc244254024" w:history="1">
         <w:r>
           <w:rPr>
             <w:rStyle w:val="Hipervnculo"/>
@@ -1740,7 +1740,7 @@
             <w:noProof/>
             <w:webHidden/>
           </w:rPr>
-          <w:instrText xml:space="preserve"> PAGEREF _Toc244210915 \h </w:instrText>
+          <w:instrText xml:space="preserve"> PAGEREF _Toc244254024 \h </w:instrText>
         </w:r>
         <w:r>
           <w:rPr>
@@ -1787,7 +1787,7 @@
           <w14:ligatures w14:val="standardContextual"/>
         </w:rPr>
       </w:pPr>
-      <w:hyperlink w:anchor="_Toc244210916" w:history="1">
+      <w:hyperlink w:anchor="_Toc244254025" w:history="1">
         <w:r>
           <w:rPr>
             <w:rStyle w:val="Hipervnculo"/>
@@ -1814,7 +1814,7 @@
             <w:noProof/>
             <w:webHidden/>
           </w:rPr>
-          <w:instrText xml:space="preserve"> PAGEREF _Toc244210916 \h </w:instrText>
+          <w:instrText xml:space="preserve"> PAGEREF _Toc244254025 \h </w:instrText>
         </w:r>
         <w:r>
           <w:rPr>
@@ -1861,7 +1861,7 @@
           <w14:ligatures w14:val="standardContextual"/>
         </w:rPr>
       </w:pPr>
-      <w:hyperlink w:anchor="_Toc244210917" w:history="1">
+      <w:hyperlink w:anchor="_Toc244254026" w:history="1">
         <w:r>
           <w:rPr>
             <w:rStyle w:val="Hipervnculo"/>
@@ -1888,7 +1888,7 @@
             <w:noProof/>
             <w:webHidden/>
           </w:rPr>
-          <w:instrText xml:space="preserve"> PAGEREF _Toc244210917 \h </w:instrText>
+          <w:instrText xml:space="preserve"> PAGEREF _Toc244254026 \h </w:instrText>
         </w:r>
         <w:r>
           <w:rPr>
@@ -1935,7 +1935,7 @@
           <w14:ligatures w14:val="standardContextual"/>
         </w:rPr>
       </w:pPr>
-      <w:hyperlink w:anchor="_Toc244210918" w:history="1">
+      <w:hyperlink w:anchor="_Toc244254027" w:history="1">
         <w:r>
           <w:rPr>
             <w:rStyle w:val="Hipervnculo"/>
@@ -1962,7 +1962,7 @@
             <w:noProof/>
             <w:webHidden/>
           </w:rPr>
-          <w:instrText xml:space="preserve"> PAGEREF _Toc244210918 \h </w:instrText>
+          <w:instrText xml:space="preserve"> PAGEREF _Toc244254027 \h </w:instrText>
         </w:r>
         <w:r>
           <w:rPr>
@@ -2009,7 +2009,7 @@
           <w14:ligatures w14:val="standardContextual"/>
         </w:rPr>
       </w:pPr>
-      <w:hyperlink w:anchor="_Toc244210919" w:history="1">
+      <w:hyperlink w:anchor="_Toc244254028" w:history="1">
         <w:r>
           <w:rPr>
             <w:rStyle w:val="Hipervnculo"/>
@@ -2036,7 +2036,7 @@
             <w:noProof/>
             <w:webHidden/>
           </w:rPr>
-          <w:instrText xml:space="preserve"> PAGEREF _Toc244210919 \h </w:instrText>
+          <w:instrText xml:space="preserve"> PAGEREF _Toc244254028 \h </w:instrText>
         </w:r>
         <w:r>
           <w:rPr>
@@ -2083,7 +2083,7 @@
           <w14:ligatures w14:val="standardContextual"/>
         </w:rPr>
       </w:pPr>
-      <w:hyperlink w:anchor="_Toc244210920" w:history="1">
+      <w:hyperlink w:anchor="_Toc244254029" w:history="1">
         <w:r>
           <w:rPr>
             <w:rStyle w:val="Hipervnculo"/>
@@ -2110,7 +2110,7 @@
             <w:noProof/>
             <w:webHidden/>
           </w:rPr>
-          <w:instrText xml:space="preserve"> PAGEREF _Toc244210920 \h </w:instrText>
+          <w:instrText xml:space="preserve"> PAGEREF _Toc244254029 \h </w:instrText>
         </w:r>
         <w:r>
           <w:rPr>
@@ -2157,7 +2157,7 @@
           <w14:ligatures w14:val="standardContextual"/>
         </w:rPr>
       </w:pPr>
-      <w:hyperlink w:anchor="_Toc244210921" w:history="1">
+      <w:hyperlink w:anchor="_Toc244254030" w:history="1">
         <w:r>
           <w:rPr>
             <w:rStyle w:val="Hipervnculo"/>
@@ -2184,7 +2184,7 @@
             <w:noProof/>
             <w:webHidden/>
           </w:rPr>
-          <w:instrText xml:space="preserve"> PAGEREF _Toc244210921 \h </w:instrText>
+          <w:instrText xml:space="preserve"> PAGEREF _Toc244254030 \h </w:instrText>
         </w:r>
         <w:r>
           <w:rPr>
@@ -2231,7 +2231,7 @@
           <w14:ligatures w14:val="standardContextual"/>
         </w:rPr>
       </w:pPr>
-      <w:hyperlink w:anchor="_Toc244210922" w:history="1">
+      <w:hyperlink w:anchor="_Toc244254031" w:history="1">
         <w:r>
           <w:rPr>
             <w:rStyle w:val="Hipervnculo"/>
@@ -2258,7 +2258,7 @@
             <w:noProof/>
             <w:webHidden/>
           </w:rPr>
-          <w:instrText xml:space="preserve"> PAGEREF _Toc244210922 \h </w:instrText>
+          <w:instrText xml:space="preserve"> PAGEREF _Toc244254031 \h </w:instrText>
         </w:r>
         <w:r>
           <w:rPr>
@@ -2305,7 +2305,7 @@
           <w14:ligatures w14:val="standardContextual"/>
         </w:rPr>
       </w:pPr>
-      <w:hyperlink w:anchor="_Toc244210923" w:history="1">
+      <w:hyperlink w:anchor="_Toc244254032" w:history="1">
         <w:r>
           <w:rPr>
             <w:rStyle w:val="Hipervnculo"/>
@@ -2332,7 +2332,7 @@
             <w:noProof/>
             <w:webHidden/>
           </w:rPr>
-          <w:instrText xml:space="preserve"> PAGEREF _Toc244210923 \h </w:instrText>
+          <w:instrText xml:space="preserve"> PAGEREF _Toc244254032 \h </w:instrText>
         </w:r>
         <w:r>
           <w:rPr>
@@ -2379,7 +2379,7 @@
           <w14:ligatures w14:val="standardContextual"/>
         </w:rPr>
       </w:pPr>
-      <w:hyperlink w:anchor="_Toc244210924" w:history="1">
+      <w:hyperlink w:anchor="_Toc244254033" w:history="1">
         <w:r>
           <w:rPr>
             <w:rStyle w:val="Hipervnculo"/>
@@ -2406,7 +2406,7 @@
             <w:noProof/>
             <w:webHidden/>
           </w:rPr>
-          <w:instrText xml:space="preserve"> PAGEREF _Toc244210924 \h </w:instrText>
+          <w:instrText xml:space="preserve"> PAGEREF _Toc244254033 \h </w:instrText>
         </w:r>
         <w:r>
           <w:rPr>
@@ -2453,7 +2453,7 @@
           <w14:ligatures w14:val="standardContextual"/>
         </w:rPr>
       </w:pPr>
-      <w:hyperlink w:anchor="_Toc244210925" w:history="1">
+      <w:hyperlink w:anchor="_Toc244254034" w:history="1">
         <w:r>
           <w:rPr>
             <w:rStyle w:val="Hipervnculo"/>
@@ -2480,7 +2480,7 @@
             <w:noProof/>
             <w:webHidden/>
           </w:rPr>
-          <w:instrText xml:space="preserve"> PAGEREF _Toc244210925 \h </w:instrText>
+          <w:instrText xml:space="preserve"> PAGEREF _Toc244254034 \h </w:instrText>
         </w:r>
         <w:r>
           <w:rPr>
@@ -2527,7 +2527,7 @@
           <w14:ligatures w14:val="standardContextual"/>
         </w:rPr>
       </w:pPr>
-      <w:hyperlink w:anchor="_Toc244210926" w:history="1">
+      <w:hyperlink w:anchor="_Toc244254035" w:history="1">
         <w:r>
           <w:rPr>
             <w:rStyle w:val="Hipervnculo"/>
@@ -2554,7 +2554,7 @@
             <w:noProof/>
             <w:webHidden/>
           </w:rPr>
-          <w:instrText xml:space="preserve"> PAGEREF _Toc244210926 \h </w:instrText>
+          <w:instrText xml:space="preserve"> PAGEREF _Toc244254035 \h </w:instrText>
         </w:r>
         <w:r>
           <w:rPr>
@@ -2601,7 +2601,7 @@
           <w14:ligatures w14:val="standardContextual"/>
         </w:rPr>
       </w:pPr>
-      <w:hyperlink w:anchor="_Toc244210927" w:history="1">
+      <w:hyperlink w:anchor="_Toc244254036" w:history="1">
         <w:r>
           <w:rPr>
             <w:rStyle w:val="Hipervnculo"/>
@@ -2628,7 +2628,7 @@
             <w:noProof/>
             <w:webHidden/>
           </w:rPr>
-          <w:instrText xml:space="preserve"> PAGEREF _Toc244210927 \h </w:instrText>
+          <w:instrText xml:space="preserve"> PAGEREF _Toc244254036 \h </w:instrText>
         </w:r>
         <w:r>
           <w:rPr>
@@ -2675,7 +2675,7 @@
           <w14:ligatures w14:val="standardContextual"/>
         </w:rPr>
       </w:pPr>
-      <w:hyperlink w:anchor="_Toc244210928" w:history="1">
+      <w:hyperlink w:anchor="_Toc244254037" w:history="1">
         <w:r>
           <w:rPr>
             <w:rStyle w:val="Hipervnculo"/>
@@ -2702,7 +2702,7 @@
             <w:noProof/>
             <w:webHidden/>
           </w:rPr>
-          <w:instrText xml:space="preserve"> PAGEREF _Toc244210928 \h </w:instrText>
+          <w:instrText xml:space="preserve"> PAGEREF _Toc244254037 \h </w:instrText>
         </w:r>
         <w:r>
           <w:rPr>
@@ -2749,7 +2749,7 @@
           <w14:ligatures w14:val="standardContextual"/>
         </w:rPr>
       </w:pPr>
-      <w:hyperlink w:anchor="_Toc244210929" w:history="1">
+      <w:hyperlink w:anchor="_Toc244254038" w:history="1">
         <w:r>
           <w:rPr>
             <w:rStyle w:val="Hipervnculo"/>
@@ -2776,7 +2776,7 @@
             <w:noProof/>
             <w:webHidden/>
           </w:rPr>
-          <w:instrText xml:space="preserve"> PAGEREF _Toc244210929 \h </w:instrText>
+          <w:instrText xml:space="preserve"> PAGEREF _Toc244254038 \h </w:instrText>
         </w:r>
         <w:r>
           <w:rPr>
@@ -2823,7 +2823,7 @@
           <w14:ligatures w14:val="standardContextual"/>
         </w:rPr>
       </w:pPr>
-      <w:hyperlink w:anchor="_Toc244210930" w:history="1">
+      <w:hyperlink w:anchor="_Toc244254039" w:history="1">
         <w:r>
           <w:rPr>
             <w:rStyle w:val="Hipervnculo"/>
@@ -2850,7 +2850,7 @@
             <w:noProof/>
             <w:webHidden/>
           </w:rPr>
-          <w:instrText xml:space="preserve"> PAGEREF _Toc244210930 \h </w:instrText>
+          <w:instrText xml:space="preserve"> PAGEREF _Toc244254039 \h </w:instrText>
         </w:r>
         <w:r>
           <w:rPr>
@@ -2897,7 +2897,7 @@
           <w14:ligatures w14:val="standardContextual"/>
         </w:rPr>
       </w:pPr>
-      <w:hyperlink w:anchor="_Toc244210931" w:history="1">
+      <w:hyperlink w:anchor="_Toc244254040" w:history="1">
         <w:r>
           <w:rPr>
             <w:rStyle w:val="Hipervnculo"/>
@@ -2924,7 +2924,7 @@
             <w:noProof/>
             <w:webHidden/>
           </w:rPr>
-          <w:instrText xml:space="preserve"> PAGEREF _Toc244210931 \h </w:instrText>
+          <w:instrText xml:space="preserve"> PAGEREF _Toc244254040 \h </w:instrText>
         </w:r>
         <w:r>
           <w:rPr>
@@ -2971,7 +2971,7 @@
           <w14:ligatures w14:val="standardContextual"/>
         </w:rPr>
       </w:pPr>
-      <w:hyperlink w:anchor="_Toc244210932" w:history="1">
+      <w:hyperlink w:anchor="_Toc244254041" w:history="1">
         <w:r>
           <w:rPr>
             <w:rStyle w:val="Hipervnculo"/>
@@ -2998,7 +2998,7 @@
             <w:noProof/>
             <w:webHidden/>
           </w:rPr>
-          <w:instrText xml:space="preserve"> PAGEREF _Toc244210932 \h </w:instrText>
+          <w:instrText xml:space="preserve"> PAGEREF _Toc244254041 \h </w:instrText>
         </w:r>
         <w:r>
           <w:rPr>
@@ -3045,7 +3045,7 @@
           <w14:ligatures w14:val="standardContextual"/>
         </w:rPr>
       </w:pPr>
-      <w:hyperlink w:anchor="_Toc244210933" w:history="1">
+      <w:hyperlink w:anchor="_Toc244254042" w:history="1">
         <w:r>
           <w:rPr>
             <w:rStyle w:val="Hipervnculo"/>
@@ -3072,7 +3072,7 @@
             <w:noProof/>
             <w:webHidden/>
           </w:rPr>
-          <w:instrText xml:space="preserve"> PAGEREF _Toc244210933 \h </w:instrText>
+          <w:instrText xml:space="preserve"> PAGEREF _Toc244254042 \h </w:instrText>
         </w:r>
         <w:r>
           <w:rPr>
@@ -3119,7 +3119,7 @@
           <w14:ligatures w14:val="standardContextual"/>
         </w:rPr>
       </w:pPr>
-      <w:hyperlink w:anchor="_Toc244210934" w:history="1">
+      <w:hyperlink w:anchor="_Toc244254043" w:history="1">
         <w:r>
           <w:rPr>
             <w:rStyle w:val="Hipervnculo"/>
@@ -3146,7 +3146,7 @@
             <w:noProof/>
             <w:webHidden/>
           </w:rPr>
-          <w:instrText xml:space="preserve"> PAGEREF _Toc244210934 \h </w:instrText>
+          <w:instrText xml:space="preserve"> PAGEREF _Toc244254043 \h </w:instrText>
         </w:r>
         <w:r>
           <w:rPr>
@@ -3193,7 +3193,7 @@
           <w14:ligatures w14:val="standardContextual"/>
         </w:rPr>
       </w:pPr>
-      <w:hyperlink w:anchor="_Toc244210935" w:history="1">
+      <w:hyperlink w:anchor="_Toc244254044" w:history="1">
         <w:r>
           <w:rPr>
             <w:rStyle w:val="Hipervnculo"/>
@@ -3220,7 +3220,7 @@
             <w:noProof/>
             <w:webHidden/>
           </w:rPr>
-          <w:instrText xml:space="preserve"> PAGEREF _Toc244210935 \h </w:instrText>
+          <w:instrText xml:space="preserve"> PAGEREF _Toc244254044 \h </w:instrText>
         </w:r>
         <w:r>
           <w:rPr>
@@ -3267,7 +3267,7 @@
           <w14:ligatures w14:val="standardContextual"/>
         </w:rPr>
       </w:pPr>
-      <w:hyperlink w:anchor="_Toc244210936" w:history="1">
+      <w:hyperlink w:anchor="_Toc244254045" w:history="1">
         <w:r>
           <w:rPr>
             <w:rStyle w:val="Hipervnculo"/>
@@ -3294,7 +3294,7 @@
             <w:noProof/>
             <w:webHidden/>
           </w:rPr>
-          <w:instrText xml:space="preserve"> PAGEREF _Toc244210936 \h </w:instrText>
+          <w:instrText xml:space="preserve"> PAGEREF _Toc244254045 \h </w:instrText>
         </w:r>
         <w:r>
           <w:rPr>
@@ -3341,7 +3341,7 @@
           <w14:ligatures w14:val="standardContextual"/>
         </w:rPr>
       </w:pPr>
-      <w:hyperlink w:anchor="_Toc244210937" w:history="1">
+      <w:hyperlink w:anchor="_Toc244254046" w:history="1">
         <w:r>
           <w:rPr>
             <w:rStyle w:val="Hipervnculo"/>
@@ -3368,7 +3368,7 @@
             <w:noProof/>
             <w:webHidden/>
           </w:rPr>
-          <w:instrText xml:space="preserve"> PAGEREF _Toc244210937 \h </w:instrText>
+          <w:instrText xml:space="preserve"> PAGEREF _Toc244254046 \h </w:instrText>
         </w:r>
         <w:r>
           <w:rPr>
@@ -3415,7 +3415,7 @@
           <w14:ligatures w14:val="standardContextual"/>
         </w:rPr>
       </w:pPr>
-      <w:hyperlink w:anchor="_Toc244210938" w:history="1">
+      <w:hyperlink w:anchor="_Toc244254047" w:history="1">
         <w:r>
           <w:rPr>
             <w:rStyle w:val="Hipervnculo"/>
@@ -3442,7 +3442,7 @@
             <w:noProof/>
             <w:webHidden/>
           </w:rPr>
-          <w:instrText xml:space="preserve"> PAGEREF _Toc244210938 \h </w:instrText>
+          <w:instrText xml:space="preserve"> PAGEREF _Toc244254047 \h </w:instrText>
         </w:r>
         <w:r>
           <w:rPr>
@@ -3489,7 +3489,7 @@
           <w14:ligatures w14:val="standardContextual"/>
         </w:rPr>
       </w:pPr>
-      <w:hyperlink w:anchor="_Toc244210939" w:history="1">
+      <w:hyperlink w:anchor="_Toc244254048" w:history="1">
         <w:r>
           <w:rPr>
             <w:rStyle w:val="Hipervnculo"/>
@@ -3516,7 +3516,7 @@
             <w:noProof/>
             <w:webHidden/>
           </w:rPr>
-          <w:instrText xml:space="preserve"> PAGEREF _Toc244210939 \h </w:instrText>
+          <w:instrText xml:space="preserve"> PAGEREF _Toc244254048 \h </w:instrText>
         </w:r>
         <w:r>
           <w:rPr>
@@ -3563,7 +3563,7 @@
           <w14:ligatures w14:val="standardContextual"/>
         </w:rPr>
       </w:pPr>
-      <w:hyperlink w:anchor="_Toc244210940" w:history="1">
+      <w:hyperlink w:anchor="_Toc244254049" w:history="1">
         <w:r>
           <w:rPr>
             <w:rStyle w:val="Hipervnculo"/>
@@ -3590,7 +3590,7 @@
             <w:noProof/>
             <w:webHidden/>
           </w:rPr>
-          <w:instrText xml:space="preserve"> PAGEREF _Toc244210940 \h </w:instrText>
+          <w:instrText xml:space="preserve"> PAGEREF _Toc244254049 \h </w:instrText>
         </w:r>
         <w:r>
           <w:rPr>
@@ -3637,7 +3637,7 @@
           <w14:ligatures w14:val="standardContextual"/>
         </w:rPr>
       </w:pPr>
-      <w:hyperlink w:anchor="_Toc244210941" w:history="1">
+      <w:hyperlink w:anchor="_Toc244254050" w:history="1">
         <w:r>
           <w:rPr>
             <w:rStyle w:val="Hipervnculo"/>
@@ -3664,7 +3664,7 @@
             <w:noProof/>
             <w:webHidden/>
           </w:rPr>
-          <w:instrText xml:space="preserve"> PAGEREF _Toc244210941 \h </w:instrText>
+          <w:instrText xml:space="preserve"> PAGEREF _Toc244254050 \h </w:instrText>
         </w:r>
         <w:r>
           <w:rPr>
@@ -3711,7 +3711,7 @@
           <w14:ligatures w14:val="standardContextual"/>
         </w:rPr>
       </w:pPr>
-      <w:hyperlink w:anchor="_Toc244210942" w:history="1">
+      <w:hyperlink w:anchor="_Toc244254051" w:history="1">
         <w:r>
           <w:rPr>
             <w:rStyle w:val="Hipervnculo"/>
@@ -3738,7 +3738,7 @@
             <w:noProof/>
             <w:webHidden/>
           </w:rPr>
-          <w:instrText xml:space="preserve"> PAGEREF _Toc244210942 \h </w:instrText>
+          <w:instrText xml:space="preserve"> PAGEREF _Toc244254051 \h </w:instrText>
         </w:r>
         <w:r>
           <w:rPr>
@@ -3785,7 +3785,7 @@
           <w14:ligatures w14:val="standardContextual"/>
         </w:rPr>
       </w:pPr>
-      <w:hyperlink w:anchor="_Toc244210943" w:history="1">
+      <w:hyperlink w:anchor="_Toc244254052" w:history="1">
         <w:r>
           <w:rPr>
             <w:rStyle w:val="Hipervnculo"/>
@@ -3812,7 +3812,7 @@
             <w:noProof/>
             <w:webHidden/>
           </w:rPr>
-          <w:instrText xml:space="preserve"> PAGEREF _Toc244210943 \h </w:instrText>
+          <w:instrText xml:space="preserve"> PAGEREF _Toc244254052 \h </w:instrText>
         </w:r>
         <w:r>
           <w:rPr>
@@ -3859,7 +3859,7 @@
           <w14:ligatures w14:val="standardContextual"/>
         </w:rPr>
       </w:pPr>
-      <w:hyperlink w:anchor="_Toc244210944" w:history="1">
+      <w:hyperlink w:anchor="_Toc244254053" w:history="1">
         <w:r>
           <w:rPr>
             <w:rStyle w:val="Hipervnculo"/>
@@ -3886,7 +3886,7 @@
             <w:noProof/>
             <w:webHidden/>
           </w:rPr>
-          <w:instrText xml:space="preserve"> PAGEREF _Toc244210944 \h </w:instrText>
+          <w:instrText xml:space="preserve"> PAGEREF _Toc244254053 \h </w:instrText>
         </w:r>
         <w:r>
           <w:rPr>
@@ -3933,7 +3933,7 @@
           <w14:ligatures w14:val="standardContextual"/>
         </w:rPr>
       </w:pPr>
-      <w:hyperlink w:anchor="_Toc244210945" w:history="1">
+      <w:hyperlink w:anchor="_Toc244254054" w:history="1">
         <w:r>
           <w:rPr>
             <w:rStyle w:val="Hipervnculo"/>
@@ -3960,7 +3960,7 @@
             <w:noProof/>
             <w:webHidden/>
           </w:rPr>
-          <w:instrText xml:space="preserve"> PAGEREF _Toc244210945 \h </w:instrText>
+          <w:instrText xml:space="preserve"> PAGEREF _Toc244254054 \h </w:instrText>
         </w:r>
         <w:r>
           <w:rPr>
@@ -4007,7 +4007,7 @@
           <w14:ligatures w14:val="standardContextual"/>
         </w:rPr>
       </w:pPr>
-      <w:hyperlink w:anchor="_Toc244210946" w:history="1">
+      <w:hyperlink w:anchor="_Toc244254055" w:history="1">
         <w:r>
           <w:rPr>
             <w:rStyle w:val="Hipervnculo"/>
@@ -4034,7 +4034,7 @@
             <w:noProof/>
             <w:webHidden/>
           </w:rPr>
-          <w:instrText xml:space="preserve"> PAGEREF _Toc244210946 \h </w:instrText>
+          <w:instrText xml:space="preserve"> PAGEREF _Toc244254055 \h </w:instrText>
         </w:r>
         <w:r>
           <w:rPr>
@@ -4081,7 +4081,7 @@
           <w14:ligatures w14:val="standardContextual"/>
         </w:rPr>
       </w:pPr>
-      <w:hyperlink w:anchor="_Toc244210947" w:history="1">
+      <w:hyperlink w:anchor="_Toc244254056" w:history="1">
         <w:r>
           <w:rPr>
             <w:rStyle w:val="Hipervnculo"/>
@@ -4108,7 +4108,7 @@
             <w:noProof/>
             <w:webHidden/>
           </w:rPr>
-          <w:instrText xml:space="preserve"> PAGEREF _Toc244210947 \h </w:instrText>
+          <w:instrText xml:space="preserve"> PAGEREF _Toc244254056 \h </w:instrText>
         </w:r>
         <w:r>
           <w:rPr>
@@ -4155,7 +4155,7 @@
           <w14:ligatures w14:val="standardContextual"/>
         </w:rPr>
       </w:pPr>
-      <w:hyperlink w:anchor="_Toc244210948" w:history="1">
+      <w:hyperlink w:anchor="_Toc244254057" w:history="1">
         <w:r>
           <w:rPr>
             <w:rStyle w:val="Hipervnculo"/>
@@ -4182,7 +4182,7 @@
             <w:noProof/>
             <w:webHidden/>
           </w:rPr>
-          <w:instrText xml:space="preserve"> PAGEREF _Toc244210948 \h </w:instrText>
+          <w:instrText xml:space="preserve"> PAGEREF _Toc244254057 \h </w:instrText>
         </w:r>
         <w:r>
           <w:rPr>
@@ -4229,7 +4229,7 @@
           <w14:ligatures w14:val="standardContextual"/>
         </w:rPr>
       </w:pPr>
-      <w:hyperlink w:anchor="_Toc244210949" w:history="1">
+      <w:hyperlink w:anchor="_Toc244254058" w:history="1">
         <w:r>
           <w:rPr>
             <w:rStyle w:val="Hipervnculo"/>
@@ -4256,7 +4256,7 @@
             <w:noProof/>
             <w:webHidden/>
           </w:rPr>
-          <w:instrText xml:space="preserve"> PAGEREF _Toc244210949 \h </w:instrText>
+          <w:instrText xml:space="preserve"> PAGEREF _Toc244254058 \h </w:instrText>
         </w:r>
         <w:r>
           <w:rPr>
@@ -4303,7 +4303,7 @@
           <w14:ligatures w14:val="standardContextual"/>
         </w:rPr>
       </w:pPr>
-      <w:hyperlink w:anchor="_Toc244210950" w:history="1">
+      <w:hyperlink w:anchor="_Toc244254059" w:history="1">
         <w:r>
           <w:rPr>
             <w:rStyle w:val="Hipervnculo"/>
@@ -4330,7 +4330,7 @@
             <w:noProof/>
             <w:webHidden/>
           </w:rPr>
-          <w:instrText xml:space="preserve"> PAGEREF _Toc244210950 \h </w:instrText>
+          <w:instrText xml:space="preserve"> PAGEREF _Toc244254059 \h </w:instrText>
         </w:r>
         <w:r>
           <w:rPr>
@@ -4377,7 +4377,7 @@
           <w14:ligatures w14:val="standardContextual"/>
         </w:rPr>
       </w:pPr>
-      <w:hyperlink w:anchor="_Toc244210951" w:history="1">
+      <w:hyperlink w:anchor="_Toc244254060" w:history="1">
         <w:r>
           <w:rPr>
             <w:rStyle w:val="Hipervnculo"/>
@@ -4404,7 +4404,7 @@
             <w:noProof/>
             <w:webHidden/>
           </w:rPr>
-          <w:instrText xml:space="preserve"> PAGEREF _Toc244210951 \h </w:instrText>
+          <w:instrText xml:space="preserve"> PAGEREF _Toc244254060 \h </w:instrText>
         </w:r>
         <w:r>
           <w:rPr>
@@ -4451,7 +4451,7 @@
           <w14:ligatures w14:val="standardContextual"/>
         </w:rPr>
       </w:pPr>
-      <w:hyperlink w:anchor="_Toc244210952" w:history="1">
+      <w:hyperlink w:anchor="_Toc244254061" w:history="1">
         <w:r>
           <w:rPr>
             <w:rStyle w:val="Hipervnculo"/>
@@ -4478,7 +4478,7 @@
             <w:noProof/>
             <w:webHidden/>
           </w:rPr>
-          <w:instrText xml:space="preserve"> PAGEREF _Toc244210952 \h </w:instrText>
+          <w:instrText xml:space="preserve"> PAGEREF _Toc244254061 \h </w:instrText>
         </w:r>
         <w:r>
           <w:rPr>
@@ -4525,7 +4525,7 @@
           <w14:ligatures w14:val="standardContextual"/>
         </w:rPr>
       </w:pPr>
-      <w:hyperlink w:anchor="_Toc244210953" w:history="1">
+      <w:hyperlink w:anchor="_Toc244254062" w:history="1">
         <w:r>
           <w:rPr>
             <w:rStyle w:val="Hipervnculo"/>
@@ -4552,7 +4552,7 @@
             <w:noProof/>
             <w:webHidden/>
           </w:rPr>
-          <w:instrText xml:space="preserve"> PAGEREF _Toc244210953 \h </w:instrText>
+          <w:instrText xml:space="preserve"> PAGEREF _Toc244254062 \h </w:instrText>
         </w:r>
         <w:r>
           <w:rPr>
@@ -4599,7 +4599,7 @@
           <w14:ligatures w14:val="standardContextual"/>
         </w:rPr>
       </w:pPr>
-      <w:hyperlink w:anchor="_Toc244210954" w:history="1">
+      <w:hyperlink w:anchor="_Toc244254063" w:history="1">
         <w:r>
           <w:rPr>
             <w:rStyle w:val="Hipervnculo"/>
@@ -4626,7 +4626,7 @@
             <w:noProof/>
             <w:webHidden/>
           </w:rPr>
-          <w:instrText xml:space="preserve"> PAGEREF _Toc244210954 \h </w:instrText>
+          <w:instrText xml:space="preserve"> PAGEREF _Toc244254063 \h </w:instrText>
         </w:r>
         <w:r>
           <w:rPr>
@@ -4673,7 +4673,7 @@
           <w14:ligatures w14:val="standardContextual"/>
         </w:rPr>
       </w:pPr>
-      <w:hyperlink w:anchor="_Toc244210955" w:history="1">
+      <w:hyperlink w:anchor="_Toc244254064" w:history="1">
         <w:r>
           <w:rPr>
             <w:rStyle w:val="Hipervnculo"/>
@@ -4700,7 +4700,7 @@
             <w:noProof/>
             <w:webHidden/>
           </w:rPr>
-          <w:instrText xml:space="preserve"> PAGEREF _Toc244210955 \h </w:instrText>
+          <w:instrText xml:space="preserve"> PAGEREF _Toc244254064 \h </w:instrText>
         </w:r>
         <w:r>
           <w:rPr>
@@ -4747,7 +4747,7 @@
           <w14:ligatures w14:val="standardContextual"/>
         </w:rPr>
       </w:pPr>
-      <w:hyperlink w:anchor="_Toc244210956" w:history="1">
+      <w:hyperlink w:anchor="_Toc244254065" w:history="1">
         <w:r>
           <w:rPr>
             <w:rStyle w:val="Hipervnculo"/>
@@ -4774,7 +4774,7 @@
             <w:noProof/>
             <w:webHidden/>
           </w:rPr>
-          <w:instrText xml:space="preserve"> PAGEREF _Toc244210956 \h </w:instrText>
+          <w:instrText xml:space="preserve"> PAGEREF _Toc244254065 \h </w:instrText>
         </w:r>
         <w:r>
           <w:rPr>
@@ -4821,7 +4821,7 @@
           <w14:ligatures w14:val="standardContextual"/>
         </w:rPr>
       </w:pPr>
-      <w:hyperlink w:anchor="_Toc244210957" w:history="1">
+      <w:hyperlink w:anchor="_Toc244254066" w:history="1">
         <w:r>
           <w:rPr>
             <w:rStyle w:val="Hipervnculo"/>
@@ -4848,7 +4848,7 @@
             <w:noProof/>
             <w:webHidden/>
           </w:rPr>
-          <w:instrText xml:space="preserve"> PAGEREF _Toc244210957 \h </w:instrText>
+          <w:instrText xml:space="preserve"> PAGEREF _Toc244254066 \h </w:instrText>
         </w:r>
         <w:r>
           <w:rPr>
@@ -4895,7 +4895,7 @@
           <w14:ligatures w14:val="standardContextual"/>
         </w:rPr>
       </w:pPr>
-      <w:hyperlink w:anchor="_Toc244210958" w:history="1">
+      <w:hyperlink w:anchor="_Toc244254067" w:history="1">
         <w:r>
           <w:rPr>
             <w:rStyle w:val="Hipervnculo"/>
@@ -4922,7 +4922,7 @@
             <w:noProof/>
             <w:webHidden/>
           </w:rPr>
-          <w:instrText xml:space="preserve"> PAGEREF _Toc244210958 \h </w:instrText>
+          <w:instrText xml:space="preserve"> PAGEREF _Toc244254067 \h </w:instrText>
         </w:r>
         <w:r>
           <w:rPr>
@@ -4969,7 +4969,7 @@
           <w14:ligatures w14:val="standardContextual"/>
         </w:rPr>
       </w:pPr>
-      <w:hyperlink w:anchor="_Toc244210959" w:history="1">
+      <w:hyperlink w:anchor="_Toc244254068" w:history="1">
         <w:r>
           <w:rPr>
             <w:rStyle w:val="Hipervnculo"/>
@@ -4996,7 +4996,7 @@
             <w:noProof/>
             <w:webHidden/>
           </w:rPr>
-          <w:instrText xml:space="preserve"> PAGEREF _Toc244210959 \h </w:instrText>
+          <w:instrText xml:space="preserve"> PAGEREF _Toc244254068 \h </w:instrText>
         </w:r>
         <w:r>
           <w:rPr>
@@ -5043,7 +5043,7 @@
           <w14:ligatures w14:val="standardContextual"/>
         </w:rPr>
       </w:pPr>
-      <w:hyperlink w:anchor="_Toc244210960" w:history="1">
+      <w:hyperlink w:anchor="_Toc244254069" w:history="1">
         <w:r>
           <w:rPr>
             <w:rStyle w:val="Hipervnculo"/>
@@ -5070,7 +5070,7 @@
             <w:noProof/>
             <w:webHidden/>
           </w:rPr>
-          <w:instrText xml:space="preserve"> PAGEREF _Toc244210960 \h </w:instrText>
+          <w:instrText xml:space="preserve"> PAGEREF _Toc244254069 \h </w:instrText>
         </w:r>
         <w:r>
           <w:rPr>
@@ -5117,7 +5117,7 @@
           <w14:ligatures w14:val="standardContextual"/>
         </w:rPr>
       </w:pPr>
-      <w:hyperlink w:anchor="_Toc244210961" w:history="1">
+      <w:hyperlink w:anchor="_Toc244254070" w:history="1">
         <w:r>
           <w:rPr>
             <w:rStyle w:val="Hipervnculo"/>
@@ -5144,7 +5144,7 @@
             <w:noProof/>
             <w:webHidden/>
           </w:rPr>
-          <w:instrText xml:space="preserve"> PAGEREF _Toc244210961 \h </w:instrText>
+          <w:instrText xml:space="preserve"> PAGEREF _Toc244254070 \h </w:instrText>
         </w:r>
         <w:r>
           <w:rPr>
@@ -5191,7 +5191,7 @@
           <w14:ligatures w14:val="standardContextual"/>
         </w:rPr>
       </w:pPr>
-      <w:hyperlink w:anchor="_Toc244210962" w:history="1">
+      <w:hyperlink w:anchor="_Toc244254071" w:history="1">
         <w:r>
           <w:rPr>
             <w:rStyle w:val="Hipervnculo"/>
@@ -5218,7 +5218,7 @@
             <w:noProof/>
             <w:webHidden/>
           </w:rPr>
-          <w:instrText xml:space="preserve"> PAGEREF _Toc244210962 \h </w:instrText>
+          <w:instrText xml:space="preserve"> PAGEREF _Toc244254071 \h </w:instrText>
         </w:r>
         <w:r>
           <w:rPr>
@@ -5265,7 +5265,7 @@
           <w14:ligatures w14:val="standardContextual"/>
         </w:rPr>
       </w:pPr>
-      <w:hyperlink w:anchor="_Toc244210963" w:history="1">
+      <w:hyperlink w:anchor="_Toc244254072" w:history="1">
         <w:r>
           <w:rPr>
             <w:rStyle w:val="Hipervnculo"/>
@@ -5292,7 +5292,7 @@
             <w:noProof/>
             <w:webHidden/>
           </w:rPr>
-          <w:instrText xml:space="preserve"> PAGEREF _Toc244210963 \h </w:instrText>
+          <w:instrText xml:space="preserve"> PAGEREF _Toc244254072 \h </w:instrText>
         </w:r>
         <w:r>
           <w:rPr>
@@ -5339,7 +5339,7 @@
           <w14:ligatures w14:val="standardContextual"/>
         </w:rPr>
       </w:pPr>
-      <w:hyperlink w:anchor="_Toc244210964" w:history="1">
+      <w:hyperlink w:anchor="_Toc244254073" w:history="1">
         <w:r>
           <w:rPr>
             <w:rStyle w:val="Hipervnculo"/>
@@ -5366,7 +5366,7 @@
             <w:noProof/>
             <w:webHidden/>
           </w:rPr>
-          <w:instrText xml:space="preserve"> PAGEREF _Toc244210964 \h </w:instrText>
+          <w:instrText xml:space="preserve"> PAGEREF _Toc244254073 \h </w:instrText>
         </w:r>
         <w:r>
           <w:rPr>
@@ -5413,7 +5413,7 @@
           <w14:ligatures w14:val="standardContextual"/>
         </w:rPr>
       </w:pPr>
-      <w:hyperlink w:anchor="_Toc244210965" w:history="1">
+      <w:hyperlink w:anchor="_Toc244254074" w:history="1">
         <w:r>
           <w:rPr>
             <w:rStyle w:val="Hipervnculo"/>
@@ -5440,7 +5440,7 @@
             <w:noProof/>
             <w:webHidden/>
           </w:rPr>
-          <w:instrText xml:space="preserve"> PAGEREF _Toc244210965 \h </w:instrText>
+          <w:instrText xml:space="preserve"> PAGEREF _Toc244254074 \h </w:instrText>
         </w:r>
         <w:r>
           <w:rPr>
@@ -5487,7 +5487,7 @@
           <w14:ligatures w14:val="standardContextual"/>
         </w:rPr>
       </w:pPr>
-      <w:hyperlink w:anchor="_Toc244210966" w:history="1">
+      <w:hyperlink w:anchor="_Toc244254075" w:history="1">
         <w:r>
           <w:rPr>
             <w:rStyle w:val="Hipervnculo"/>
@@ -5514,7 +5514,7 @@
             <w:noProof/>
             <w:webHidden/>
           </w:rPr>
-          <w:instrText xml:space="preserve"> PAGEREF _Toc244210966 \h </w:instrText>
+          <w:instrText xml:space="preserve"> PAGEREF _Toc244254075 \h </w:instrText>
         </w:r>
         <w:r>
           <w:rPr>
@@ -5561,7 +5561,7 @@
           <w14:ligatures w14:val="standardContextual"/>
         </w:rPr>
       </w:pPr>
-      <w:hyperlink w:anchor="_Toc244210967" w:history="1">
+      <w:hyperlink w:anchor="_Toc244254076" w:history="1">
         <w:r>
           <w:rPr>
             <w:rStyle w:val="Hipervnculo"/>
@@ -5588,7 +5588,7 @@
             <w:noProof/>
             <w:webHidden/>
           </w:rPr>
-          <w:instrText xml:space="preserve"> PAGEREF _Toc244210967 \h </w:instrText>
+          <w:instrText xml:space="preserve"> PAGEREF _Toc244254076 \h </w:instrText>
         </w:r>
         <w:r>
           <w:rPr>
@@ -5635,7 +5635,7 @@
           <w14:ligatures w14:val="standardContextual"/>
         </w:rPr>
       </w:pPr>
-      <w:hyperlink w:anchor="_Toc244210968" w:history="1">
+      <w:hyperlink w:anchor="_Toc244254077" w:history="1">
         <w:r>
           <w:rPr>
             <w:rStyle w:val="Hipervnculo"/>
@@ -5662,7 +5662,7 @@
             <w:noProof/>
             <w:webHidden/>
           </w:rPr>
-          <w:instrText xml:space="preserve"> PAGEREF _Toc244210968 \h </w:instrText>
+          <w:instrText xml:space="preserve"> PAGEREF _Toc244254077 \h </w:instrText>
         </w:r>
         <w:r>
           <w:rPr>
@@ -5709,7 +5709,7 @@
           <w14:ligatures w14:val="standardContextual"/>
         </w:rPr>
       </w:pPr>
-      <w:hyperlink w:anchor="_Toc244210969" w:history="1">
+      <w:hyperlink w:anchor="_Toc244254078" w:history="1">
         <w:r>
           <w:rPr>
             <w:rStyle w:val="Hipervnculo"/>
@@ -5736,7 +5736,7 @@
             <w:noProof/>
             <w:webHidden/>
           </w:rPr>
-          <w:instrText xml:space="preserve"> PAGEREF _Toc244210969 \h </w:instrText>
+          <w:instrText xml:space="preserve"> PAGEREF _Toc244254078 \h </w:instrText>
         </w:r>
         <w:r>
           <w:rPr>
@@ -5783,7 +5783,7 @@
           <w14:ligatures w14:val="standardContextual"/>
         </w:rPr>
       </w:pPr>
-      <w:hyperlink w:anchor="_Toc244210970" w:history="1">
+      <w:hyperlink w:anchor="_Toc244254079" w:history="1">
         <w:r>
           <w:rPr>
             <w:rStyle w:val="Hipervnculo"/>
@@ -5810,7 +5810,7 @@
             <w:noProof/>
             <w:webHidden/>
           </w:rPr>
-          <w:instrText xml:space="preserve"> PAGEREF _Toc244210970 \h </w:instrText>
+          <w:instrText xml:space="preserve"> PAGEREF _Toc244254079 \h </w:instrText>
         </w:r>
         <w:r>
           <w:rPr>
@@ -5857,7 +5857,7 @@
           <w14:ligatures w14:val="standardContextual"/>
         </w:rPr>
       </w:pPr>
-      <w:hyperlink w:anchor="_Toc244210971" w:history="1">
+      <w:hyperlink w:anchor="_Toc244254080" w:history="1">
         <w:r>
           <w:rPr>
             <w:rStyle w:val="Hipervnculo"/>
@@ -5884,7 +5884,7 @@
             <w:noProof/>
             <w:webHidden/>
           </w:rPr>
-          <w:instrText xml:space="preserve"> PAGEREF _Toc244210971 \h </w:instrText>
+          <w:instrText xml:space="preserve"> PAGEREF _Toc244254080 \h </w:instrText>
         </w:r>
         <w:r>
           <w:rPr>
@@ -5931,7 +5931,7 @@
           <w14:ligatures w14:val="standardContextual"/>
         </w:rPr>
       </w:pPr>
-      <w:hyperlink w:anchor="_Toc244210972" w:history="1">
+      <w:hyperlink w:anchor="_Toc244254081" w:history="1">
         <w:r>
           <w:rPr>
             <w:rStyle w:val="Hipervnculo"/>
@@ -5958,7 +5958,7 @@
             <w:noProof/>
             <w:webHidden/>
           </w:rPr>
-          <w:instrText xml:space="preserve"> PAGEREF _Toc244210972 \h </w:instrText>
+          <w:instrText xml:space="preserve"> PAGEREF _Toc244254081 \h </w:instrText>
         </w:r>
         <w:r>
           <w:rPr>
@@ -6005,7 +6005,7 @@
           <w14:ligatures w14:val="standardContextual"/>
         </w:rPr>
       </w:pPr>
-      <w:hyperlink w:anchor="_Toc244210973" w:history="1">
+      <w:hyperlink w:anchor="_Toc244254082" w:history="1">
         <w:r>
           <w:rPr>
             <w:rStyle w:val="Hipervnculo"/>
@@ -6032,7 +6032,7 @@
             <w:noProof/>
             <w:webHidden/>
           </w:rPr>
-          <w:instrText xml:space="preserve"> PAGEREF _Toc244210973 \h </w:instrText>
+          <w:instrText xml:space="preserve"> PAGEREF _Toc244254082 \h </w:instrText>
         </w:r>
         <w:r>
           <w:rPr>
@@ -6079,7 +6079,7 @@
           <w14:ligatures w14:val="standardContextual"/>
         </w:rPr>
       </w:pPr>
-      <w:hyperlink w:anchor="_Toc244210974" w:history="1">
+      <w:hyperlink w:anchor="_Toc244254083" w:history="1">
         <w:r>
           <w:rPr>
             <w:rStyle w:val="Hipervnculo"/>
@@ -6106,7 +6106,7 @@
             <w:noProof/>
             <w:webHidden/>
           </w:rPr>
-          <w:instrText xml:space="preserve"> PAGEREF _Toc244210974 \h </w:instrText>
+          <w:instrText xml:space="preserve"> PAGEREF _Toc244254083 \h </w:instrText>
         </w:r>
         <w:r>
           <w:rPr>
@@ -6153,7 +6153,7 @@
           <w14:ligatures w14:val="standardContextual"/>
         </w:rPr>
       </w:pPr>
-      <w:hyperlink w:anchor="_Toc244210975" w:history="1">
+      <w:hyperlink w:anchor="_Toc244254084" w:history="1">
         <w:r>
           <w:rPr>
             <w:rStyle w:val="Hipervnculo"/>
@@ -6180,7 +6180,7 @@
             <w:noProof/>
             <w:webHidden/>
           </w:rPr>
-          <w:instrText xml:space="preserve"> PAGEREF _Toc244210975 \h </w:instrText>
+          <w:instrText xml:space="preserve"> PAGEREF _Toc244254084 \h </w:instrText>
         </w:r>
         <w:r>
           <w:rPr>
@@ -6227,7 +6227,7 @@
           <w14:ligatures w14:val="standardContextual"/>
         </w:rPr>
       </w:pPr>
-      <w:hyperlink w:anchor="_Toc244210976" w:history="1">
+      <w:hyperlink w:anchor="_Toc244254085" w:history="1">
         <w:r>
           <w:rPr>
             <w:rStyle w:val="Hipervnculo"/>
@@ -6254,7 +6254,7 @@
             <w:noProof/>
             <w:webHidden/>
           </w:rPr>
-          <w:instrText xml:space="preserve"> PAGEREF _Toc244210976 \h </w:instrText>
+          <w:instrText xml:space="preserve"> PAGEREF _Toc244254085 \h </w:instrText>
         </w:r>
         <w:r>
           <w:rPr>
@@ -6301,7 +6301,7 @@
           <w14:ligatures w14:val="standardContextual"/>
         </w:rPr>
       </w:pPr>
-      <w:hyperlink w:anchor="_Toc244210977" w:history="1">
+      <w:hyperlink w:anchor="_Toc244254086" w:history="1">
         <w:r>
           <w:rPr>
             <w:rStyle w:val="Hipervnculo"/>
@@ -6328,7 +6328,7 @@
             <w:noProof/>
             <w:webHidden/>
           </w:rPr>
-          <w:instrText xml:space="preserve"> PAGEREF _Toc244210977 \h </w:instrText>
+          <w:instrText xml:space="preserve"> PAGEREF _Toc244254086 \h </w:instrText>
         </w:r>
         <w:r>
           <w:rPr>
@@ -6375,7 +6375,7 @@
           <w14:ligatures w14:val="standardContextual"/>
         </w:rPr>
       </w:pPr>
-      <w:hyperlink w:anchor="_Toc244210978" w:history="1">
+      <w:hyperlink w:anchor="_Toc244254087" w:history="1">
         <w:r>
           <w:rPr>
             <w:rStyle w:val="Hipervnculo"/>
@@ -6402,7 +6402,7 @@
             <w:noProof/>
             <w:webHidden/>
           </w:rPr>
-          <w:instrText xml:space="preserve"> PAGEREF _Toc244210978 \h </w:instrText>
+          <w:instrText xml:space="preserve"> PAGEREF _Toc244254087 \h </w:instrText>
         </w:r>
         <w:r>
           <w:rPr>
@@ -6449,7 +6449,7 @@
           <w14:ligatures w14:val="standardContextual"/>
         </w:rPr>
       </w:pPr>
-      <w:hyperlink w:anchor="_Toc244210979" w:history="1">
+      <w:hyperlink w:anchor="_Toc244254088" w:history="1">
         <w:r>
           <w:rPr>
             <w:rStyle w:val="Hipervnculo"/>
@@ -6476,7 +6476,7 @@
             <w:noProof/>
             <w:webHidden/>
           </w:rPr>
-          <w:instrText xml:space="preserve"> PAGEREF _Toc244210979 \h </w:instrText>
+          <w:instrText xml:space="preserve"> PAGEREF _Toc244254088 \h </w:instrText>
         </w:r>
         <w:r>
           <w:rPr>
@@ -6523,7 +6523,7 @@
           <w14:ligatures w14:val="standardContextual"/>
         </w:rPr>
       </w:pPr>
-      <w:hyperlink w:anchor="_Toc244210980" w:history="1">
+      <w:hyperlink w:anchor="_Toc244254089" w:history="1">
         <w:r>
           <w:rPr>
             <w:rStyle w:val="Hipervnculo"/>
@@ -6550,7 +6550,7 @@
             <w:noProof/>
             <w:webHidden/>
           </w:rPr>
-          <w:instrText xml:space="preserve"> PAGEREF _Toc244210980 \h </w:instrText>
+          <w:instrText xml:space="preserve"> PAGEREF _Toc244254089 \h </w:instrText>
         </w:r>
         <w:r>
           <w:rPr>
@@ -6597,7 +6597,7 @@
           <w14:ligatures w14:val="standardContextual"/>
         </w:rPr>
       </w:pPr>
-      <w:hyperlink w:anchor="_Toc244210981" w:history="1">
+      <w:hyperlink w:anchor="_Toc244254090" w:history="1">
         <w:r>
           <w:rPr>
             <w:rStyle w:val="Hipervnculo"/>
@@ -6624,7 +6624,7 @@
             <w:noProof/>
             <w:webHidden/>
           </w:rPr>
-          <w:instrText xml:space="preserve"> PAGEREF _Toc244210981 \h </w:instrText>
+          <w:instrText xml:space="preserve"> PAGEREF _Toc244254090 \h </w:instrText>
         </w:r>
         <w:r>
           <w:rPr>
@@ -6671,7 +6671,7 @@
           <w14:ligatures w14:val="standardContextual"/>
         </w:rPr>
       </w:pPr>
-      <w:hyperlink w:anchor="_Toc244210982" w:history="1">
+      <w:hyperlink w:anchor="_Toc244254091" w:history="1">
         <w:r>
           <w:rPr>
             <w:rStyle w:val="Hipervnculo"/>
@@ -6698,7 +6698,7 @@
             <w:noProof/>
             <w:webHidden/>
           </w:rPr>
-          <w:instrText xml:space="preserve"> PAGEREF _Toc244210982 \h </w:instrText>
+          <w:instrText xml:space="preserve"> PAGEREF _Toc244254091 \h </w:instrText>
         </w:r>
         <w:r>
           <w:rPr>
@@ -6745,7 +6745,7 @@
           <w14:ligatures w14:val="standardContextual"/>
         </w:rPr>
       </w:pPr>
-      <w:hyperlink w:anchor="_Toc244210983" w:history="1">
+      <w:hyperlink w:anchor="_Toc244254092" w:history="1">
         <w:r>
           <w:rPr>
             <w:rStyle w:val="Hipervnculo"/>
@@ -6772,7 +6772,7 @@
             <w:noProof/>
             <w:webHidden/>
           </w:rPr>
-          <w:instrText xml:space="preserve"> PAGEREF _Toc244210983 \h </w:instrText>
+          <w:instrText xml:space="preserve"> PAGEREF _Toc244254092 \h </w:instrText>
         </w:r>
         <w:r>
           <w:rPr>
@@ -6819,7 +6819,7 @@
           <w14:ligatures w14:val="standardContextual"/>
         </w:rPr>
       </w:pPr>
-      <w:hyperlink w:anchor="_Toc244210984" w:history="1">
+      <w:hyperlink w:anchor="_Toc244254093" w:history="1">
         <w:r>
           <w:rPr>
             <w:rStyle w:val="Hipervnculo"/>
@@ -6846,7 +6846,7 @@
             <w:noProof/>
             <w:webHidden/>
           </w:rPr>
-          <w:instrText xml:space="preserve"> PAGEREF _Toc244210984 \h </w:instrText>
+          <w:instrText xml:space="preserve"> PAGEREF _Toc244254093 \h </w:instrText>
         </w:r>
         <w:r>
           <w:rPr>
@@ -6893,7 +6893,7 @@
           <w14:ligatures w14:val="standardContextual"/>
         </w:rPr>
       </w:pPr>
-      <w:hyperlink w:anchor="_Toc244210985" w:history="1">
+      <w:hyperlink w:anchor="_Toc244254094" w:history="1">
         <w:r>
           <w:rPr>
             <w:rStyle w:val="Hipervnculo"/>
@@ -6920,7 +6920,7 @@
             <w:noProof/>
             <w:webHidden/>
           </w:rPr>
-          <w:instrText xml:space="preserve"> PAGEREF _Toc244210985 \h </w:instrText>
+          <w:instrText xml:space="preserve"> PAGEREF _Toc244254094 \h </w:instrText>
         </w:r>
         <w:r>
           <w:rPr>
@@ -6967,7 +6967,7 @@
           <w14:ligatures w14:val="standardContextual"/>
         </w:rPr>
       </w:pPr>
-      <w:hyperlink w:anchor="_Toc244210986" w:history="1">
+      <w:hyperlink w:anchor="_Toc244254095" w:history="1">
         <w:r>
           <w:rPr>
             <w:rStyle w:val="Hipervnculo"/>
@@ -6994,7 +6994,7 @@
             <w:noProof/>
             <w:webHidden/>
           </w:rPr>
-          <w:instrText xml:space="preserve"> PAGEREF _Toc244210986 \h </w:instrText>
+          <w:instrText xml:space="preserve"> PAGEREF _Toc244254095 \h </w:instrText>
         </w:r>
         <w:r>
           <w:rPr>
@@ -7041,7 +7041,7 @@
           <w14:ligatures w14:val="standardContextual"/>
         </w:rPr>
       </w:pPr>
-      <w:hyperlink w:anchor="_Toc244210987" w:history="1">
+      <w:hyperlink w:anchor="_Toc244254096" w:history="1">
         <w:r>
           <w:rPr>
             <w:rStyle w:val="Hipervnculo"/>
@@ -7068,7 +7068,7 @@
             <w:noProof/>
             <w:webHidden/>
           </w:rPr>
-          <w:instrText xml:space="preserve"> PAGEREF _Toc244210987 \h </w:instrText>
+          <w:instrText xml:space="preserve"> PAGEREF _Toc244254096 \h </w:instrText>
         </w:r>
         <w:r>
           <w:rPr>
@@ -7115,7 +7115,7 @@
           <w14:ligatures w14:val="standardContextual"/>
         </w:rPr>
       </w:pPr>
-      <w:hyperlink w:anchor="_Toc244210988" w:history="1">
+      <w:hyperlink w:anchor="_Toc244254097" w:history="1">
         <w:r>
           <w:rPr>
             <w:rStyle w:val="Hipervnculo"/>
@@ -7142,7 +7142,7 @@
             <w:noProof/>
             <w:webHidden/>
           </w:rPr>
-          <w:instrText xml:space="preserve"> PAGEREF _Toc244210988 \h </w:instrText>
+          <w:instrText xml:space="preserve"> PAGEREF _Toc244254097 \h </w:instrText>
         </w:r>
         <w:r>
           <w:rPr>
@@ -7162,7 +7162,7 @@
             <w:noProof/>
             <w:webHidden/>
           </w:rPr>
-          <w:t>85</w:t>
+          <w:t>86</w:t>
         </w:r>
         <w:r>
           <w:rPr>
@@ -7189,7 +7189,7 @@
           <w14:ligatures w14:val="standardContextual"/>
         </w:rPr>
       </w:pPr>
-      <w:hyperlink w:anchor="_Toc244210989" w:history="1">
+      <w:hyperlink w:anchor="_Toc244254098" w:history="1">
         <w:r>
           <w:rPr>
             <w:rStyle w:val="Hipervnculo"/>
@@ -7216,7 +7216,7 @@
             <w:noProof/>
             <w:webHidden/>
           </w:rPr>
-          <w:instrText xml:space="preserve"> PAGEREF _Toc244210989 \h </w:instrText>
+          <w:instrText xml:space="preserve"> PAGEREF _Toc244254098 \h </w:instrText>
         </w:r>
         <w:r>
           <w:rPr>
@@ -7263,7 +7263,7 @@
           <w14:ligatures w14:val="standardContextual"/>
         </w:rPr>
       </w:pPr>
-      <w:hyperlink w:anchor="_Toc244210990" w:history="1">
+      <w:hyperlink w:anchor="_Toc244254099" w:history="1">
         <w:r>
           <w:rPr>
             <w:rStyle w:val="Hipervnculo"/>
@@ -7290,7 +7290,7 @@
             <w:noProof/>
             <w:webHidden/>
           </w:rPr>
-          <w:instrText xml:space="preserve"> PAGEREF _Toc244210990 \h </w:instrText>
+          <w:instrText xml:space="preserve"> PAGEREF _Toc244254099 \h </w:instrText>
         </w:r>
         <w:r>
           <w:rPr>
@@ -7337,7 +7337,7 @@
           <w14:ligatures w14:val="standardContextual"/>
         </w:rPr>
       </w:pPr>
-      <w:hyperlink w:anchor="_Toc244210991" w:history="1">
+      <w:hyperlink w:anchor="_Toc244254100" w:history="1">
         <w:r>
           <w:rPr>
             <w:rStyle w:val="Hipervnculo"/>
@@ -7364,7 +7364,7 @@
             <w:noProof/>
             <w:webHidden/>
           </w:rPr>
-          <w:instrText xml:space="preserve"> PAGEREF _Toc244210991 \h </w:instrText>
+          <w:instrText xml:space="preserve"> PAGEREF _Toc244254100 \h </w:instrText>
         </w:r>
         <w:r>
           <w:rPr>
@@ -7411,7 +7411,7 @@
           <w14:ligatures w14:val="standardContextual"/>
         </w:rPr>
       </w:pPr>
-      <w:hyperlink w:anchor="_Toc244210992" w:history="1">
+      <w:hyperlink w:anchor="_Toc244254101" w:history="1">
         <w:r>
           <w:rPr>
             <w:rStyle w:val="Hipervnculo"/>
@@ -7438,7 +7438,7 @@
             <w:noProof/>
             <w:webHidden/>
           </w:rPr>
-          <w:instrText xml:space="preserve"> PAGEREF _Toc244210992 \h </w:instrText>
+          <w:instrText xml:space="preserve"> PAGEREF _Toc244254101 \h </w:instrText>
         </w:r>
         <w:r>
           <w:rPr>
@@ -7485,7 +7485,7 @@
           <w14:ligatures w14:val="standardContextual"/>
         </w:rPr>
       </w:pPr>
-      <w:hyperlink w:anchor="_Toc244210993" w:history="1">
+      <w:hyperlink w:anchor="_Toc244254102" w:history="1">
         <w:r>
           <w:rPr>
             <w:rStyle w:val="Hipervnculo"/>
@@ -7512,7 +7512,7 @@
             <w:noProof/>
             <w:webHidden/>
           </w:rPr>
-          <w:instrText xml:space="preserve"> PAGEREF _Toc244210993 \h </w:instrText>
+          <w:instrText xml:space="preserve"> PAGEREF _Toc244254102 \h </w:instrText>
         </w:r>
         <w:r>
           <w:rPr>
@@ -7559,7 +7559,7 @@
           <w14:ligatures w14:val="standardContextual"/>
         </w:rPr>
       </w:pPr>
-      <w:hyperlink w:anchor="_Toc244210994" w:history="1">
+      <w:hyperlink w:anchor="_Toc244254103" w:history="1">
         <w:r>
           <w:rPr>
             <w:rStyle w:val="Hipervnculo"/>
@@ -7586,7 +7586,7 @@
             <w:noProof/>
             <w:webHidden/>
           </w:rPr>
-          <w:instrText xml:space="preserve"> PAGEREF _Toc244210994 \h </w:instrText>
+          <w:instrText xml:space="preserve"> PAGEREF _Toc244254103 \h </w:instrText>
         </w:r>
         <w:r>
           <w:rPr>
@@ -7633,7 +7633,7 @@
           <w14:ligatures w14:val="standardContextual"/>
         </w:rPr>
       </w:pPr>
-      <w:hyperlink w:anchor="_Toc244210995" w:history="1">
+      <w:hyperlink w:anchor="_Toc244254104" w:history="1">
         <w:r>
           <w:rPr>
             <w:rStyle w:val="Hipervnculo"/>
@@ -7660,7 +7660,7 @@
             <w:noProof/>
             <w:webHidden/>
           </w:rPr>
-          <w:instrText xml:space="preserve"> PAGEREF _Toc244210995 \h </w:instrText>
+          <w:instrText xml:space="preserve"> PAGEREF _Toc244254104 \h </w:instrText>
         </w:r>
         <w:r>
           <w:rPr>
@@ -7707,7 +7707,7 @@
           <w14:ligatures w14:val="standardContextual"/>
         </w:rPr>
       </w:pPr>
-      <w:hyperlink w:anchor="_Toc244210996" w:history="1">
+      <w:hyperlink w:anchor="_Toc244254105" w:history="1">
         <w:r>
           <w:rPr>
             <w:rStyle w:val="Hipervnculo"/>
@@ -7734,7 +7734,7 @@
             <w:noProof/>
             <w:webHidden/>
           </w:rPr>
-          <w:instrText xml:space="preserve"> PAGEREF _Toc244210996 \h </w:instrText>
+          <w:instrText xml:space="preserve"> PAGEREF _Toc244254105 \h </w:instrText>
         </w:r>
         <w:r>
           <w:rPr>
@@ -7781,7 +7781,7 @@
           <w14:ligatures w14:val="standardContextual"/>
         </w:rPr>
       </w:pPr>
-      <w:hyperlink w:anchor="_Toc244210997" w:history="1">
+      <w:hyperlink w:anchor="_Toc244254106" w:history="1">
         <w:r>
           <w:rPr>
             <w:rStyle w:val="Hipervnculo"/>
@@ -7808,7 +7808,7 @@
             <w:noProof/>
             <w:webHidden/>
           </w:rPr>
-          <w:instrText xml:space="preserve"> PAGEREF _Toc244210997 \h </w:instrText>
+          <w:instrText xml:space="preserve"> PAGEREF _Toc244254106 \h </w:instrText>
         </w:r>
         <w:r>
           <w:rPr>
@@ -7855,7 +7855,7 @@
           <w14:ligatures w14:val="standardContextual"/>
         </w:rPr>
       </w:pPr>
-      <w:hyperlink w:anchor="_Toc244210998" w:history="1">
+      <w:hyperlink w:anchor="_Toc244254107" w:history="1">
         <w:r>
           <w:rPr>
             <w:rStyle w:val="Hipervnculo"/>
@@ -7882,7 +7882,7 @@
             <w:noProof/>
             <w:webHidden/>
           </w:rPr>
-          <w:instrText xml:space="preserve"> PAGEREF _Toc244210998 \h </w:instrText>
+          <w:instrText xml:space="preserve"> PAGEREF _Toc244254107 \h </w:instrText>
         </w:r>
         <w:r>
           <w:rPr>
@@ -7935,303 +7935,417 @@
     <w:p>
       <w:pPr>
         <w:pStyle w:val="EntradadendiceTFM"/>
-      </w:pPr>
-      <w:hyperlink w:anchor="idx_tbl_3_1" w:history="1">
-        <w:r>
-          <w:t>Tabla 3.1. Fuentes de datos incorporadas y estado de integración.</w:t>
-        </w:r>
-        <w:r>
-          <w:tab/>
-          <w:t>21</w:t>
-        </w:r>
-      </w:hyperlink>
+        <w:spacing w:after="60" w:line="240" w:lineRule="auto"/>
+      </w:pPr>
+      <w:r>
+        <w:rPr>
+          <w:sz w:val="21"/>
+        </w:rPr>
+        <w:t>Tabla 3.1. Fuentes de datos incorporadas y estado de integración.</w:t>
+      </w:r>
+      <w:r>
+        <w:rPr>
+          <w:sz w:val="21"/>
+        </w:rPr>
+        <w:tab/>
+        <w:t>22</w:t>
+      </w:r>
     </w:p>
     <w:p>
       <w:pPr>
         <w:pStyle w:val="EntradadendiceTFM"/>
-      </w:pPr>
-      <w:hyperlink w:anchor="idx_tbl_3_2" w:history="1">
-        <w:r>
-          <w:t>Tabla 3.2. Familias de variables según su disponibilidad y uso.</w:t>
-        </w:r>
-        <w:r>
-          <w:tab/>
-          <w:t>22</w:t>
-        </w:r>
-      </w:hyperlink>
+        <w:spacing w:after="60" w:line="240" w:lineRule="auto"/>
+      </w:pPr>
+      <w:r>
+        <w:rPr>
+          <w:sz w:val="21"/>
+        </w:rPr>
+        <w:t>Tabla 3.2. Familias de variables según su disponibilidad y uso.</w:t>
+      </w:r>
+      <w:r>
+        <w:rPr>
+          <w:sz w:val="21"/>
+        </w:rPr>
+        <w:tab/>
+        <w:t>23</w:t>
+      </w:r>
     </w:p>
     <w:p>
       <w:pPr>
         <w:pStyle w:val="EntradadendiceTFM"/>
-      </w:pPr>
-      <w:hyperlink w:anchor="idx_tbl_3_3" w:history="1">
-        <w:r>
-          <w:t>Tabla 3.3. Tecnologías del proyecto y grado de implementación.</w:t>
-        </w:r>
-        <w:r>
-          <w:tab/>
-          <w:t>25</w:t>
-        </w:r>
-      </w:hyperlink>
+        <w:spacing w:after="60" w:line="240" w:lineRule="auto"/>
+      </w:pPr>
+      <w:r>
+        <w:rPr>
+          <w:sz w:val="21"/>
+        </w:rPr>
+        <w:t>Tabla 3.3. Tecnologías del proyecto y grado de implementación.</w:t>
+      </w:r>
+      <w:r>
+        <w:rPr>
+          <w:sz w:val="21"/>
+        </w:rPr>
+        <w:tab/>
+        <w:t>26</w:t>
+      </w:r>
     </w:p>
     <w:p>
       <w:pPr>
         <w:pStyle w:val="EntradadendiceTFM"/>
-      </w:pPr>
-      <w:hyperlink w:anchor="idx_tbl_3_4" w:history="1">
-        <w:r>
-          <w:t>Tabla 3.4. Fases de trabajo y evidencias de salida.</w:t>
-        </w:r>
-        <w:r>
-          <w:tab/>
-          <w:t>27</w:t>
-        </w:r>
-      </w:hyperlink>
+        <w:spacing w:after="60" w:line="240" w:lineRule="auto"/>
+      </w:pPr>
+      <w:r>
+        <w:rPr>
+          <w:sz w:val="21"/>
+        </w:rPr>
+        <w:t>Tabla 3.4. Fases de trabajo y evidencias de salida.</w:t>
+      </w:r>
+      <w:r>
+        <w:rPr>
+          <w:sz w:val="21"/>
+        </w:rPr>
+        <w:tab/>
+        <w:t>28</w:t>
+      </w:r>
     </w:p>
     <w:p>
       <w:pPr>
         <w:pStyle w:val="EntradadendiceTFM"/>
-      </w:pPr>
-      <w:hyperlink w:anchor="idx_tbl_4_1" w:history="1">
-        <w:r>
-          <w:t>Tabla 4.1. Fuentes oficiales utilizadas y función en el DSS.</w:t>
-        </w:r>
-        <w:r>
-          <w:tab/>
-          <w:t>30</w:t>
-        </w:r>
-      </w:hyperlink>
+        <w:spacing w:after="60" w:line="240" w:lineRule="auto"/>
+      </w:pPr>
+      <w:r>
+        <w:rPr>
+          <w:sz w:val="21"/>
+        </w:rPr>
+        <w:t>Tabla 4.1. Fuentes oficiales utilizadas y función en el DSS.</w:t>
+      </w:r>
+      <w:r>
+        <w:rPr>
+          <w:sz w:val="21"/>
+        </w:rPr>
+        <w:tab/>
+        <w:t>32</w:t>
+      </w:r>
     </w:p>
     <w:p>
       <w:pPr>
         <w:pStyle w:val="EntradadendiceTFM"/>
-      </w:pPr>
-      <w:hyperlink w:anchor="idx_tbl_4_2" w:history="1">
-        <w:r>
-          <w:t>Tabla 4.2. Parámetros de configuración del caso y datos que dependen de ellos.</w:t>
-        </w:r>
-        <w:r>
-          <w:tab/>
-          <w:t>31</w:t>
-        </w:r>
-      </w:hyperlink>
+        <w:spacing w:after="60" w:line="240" w:lineRule="auto"/>
+      </w:pPr>
+      <w:r>
+        <w:rPr>
+          <w:sz w:val="21"/>
+        </w:rPr>
+        <w:t>Tabla 4.2. Parámetros de configuración del caso y datos que dependen de ellos.</w:t>
+      </w:r>
+      <w:r>
+        <w:rPr>
+          <w:sz w:val="21"/>
+        </w:rPr>
+        <w:tab/>
+        <w:t>33</w:t>
+      </w:r>
     </w:p>
     <w:p>
       <w:pPr>
         <w:pStyle w:val="EntradadendiceTFM"/>
-      </w:pPr>
-      <w:hyperlink w:anchor="idx_tbl_4_3" w:history="1">
-        <w:r>
-          <w:t>Tabla 4.3. Registros obtenidos en la primera extracción.</w:t>
-        </w:r>
-        <w:r>
-          <w:tab/>
-          <w:t>33</w:t>
-        </w:r>
-      </w:hyperlink>
+        <w:spacing w:after="60" w:line="240" w:lineRule="auto"/>
+      </w:pPr>
+      <w:r>
+        <w:rPr>
+          <w:sz w:val="21"/>
+        </w:rPr>
+        <w:t>Tabla 4.3. Registros obtenidos en la primera extracción.</w:t>
+      </w:r>
+      <w:r>
+        <w:rPr>
+          <w:sz w:val="21"/>
+        </w:rPr>
+        <w:tab/>
+        <w:t>35</w:t>
+      </w:r>
     </w:p>
     <w:p>
       <w:pPr>
         <w:pStyle w:val="EntradadendiceTFM"/>
-      </w:pPr>
-      <w:hyperlink w:anchor="idx_tbl_4_4" w:history="1">
-        <w:r>
-          <w:t>Tabla 4.4. Tablas generadas en la capa interim.</w:t>
-        </w:r>
-        <w:r>
-          <w:tab/>
-          <w:t>35</w:t>
-        </w:r>
-      </w:hyperlink>
+        <w:spacing w:after="60" w:line="240" w:lineRule="auto"/>
+      </w:pPr>
+      <w:r>
+        <w:rPr>
+          <w:sz w:val="21"/>
+        </w:rPr>
+        <w:t>Tabla 4.4. Tablas generadas en la capa interim.</w:t>
+      </w:r>
+      <w:r>
+        <w:rPr>
+          <w:sz w:val="21"/>
+        </w:rPr>
+        <w:tab/>
+        <w:t>37</w:t>
+      </w:r>
     </w:p>
     <w:p>
       <w:pPr>
         <w:pStyle w:val="EntradadendiceTFM"/>
-      </w:pPr>
-      <w:hyperlink w:anchor="idx_tbl_4_5" w:history="1">
-        <w:r>
-          <w:t>Tabla 4.5. Ejemplo de la tabla diaria normalizada de SiAR.</w:t>
-        </w:r>
-        <w:r>
-          <w:tab/>
-          <w:t>35</w:t>
-        </w:r>
-      </w:hyperlink>
+        <w:spacing w:after="60" w:line="240" w:lineRule="auto"/>
+      </w:pPr>
+      <w:r>
+        <w:rPr>
+          <w:sz w:val="21"/>
+        </w:rPr>
+        <w:t>Tabla 4.5. Ejemplo de la tabla diaria normalizada de SiAR.</w:t>
+      </w:r>
+      <w:r>
+        <w:rPr>
+          <w:sz w:val="21"/>
+        </w:rPr>
+        <w:tab/>
+        <w:t>37</w:t>
+      </w:r>
     </w:p>
     <w:p>
       <w:pPr>
         <w:pStyle w:val="EntradadendiceTFM"/>
-      </w:pPr>
-      <w:hyperlink w:anchor="idx_tbl_4_6" w:history="1">
-        <w:r>
-          <w:t>Tabla 4.6. Ejemplo de la tabla normalizada de necesidades hídricas del pimiento.</w:t>
-        </w:r>
-        <w:r>
-          <w:tab/>
-          <w:t>35</w:t>
-        </w:r>
-      </w:hyperlink>
+        <w:spacing w:after="60" w:line="240" w:lineRule="auto"/>
+      </w:pPr>
+      <w:r>
+        <w:rPr>
+          <w:sz w:val="21"/>
+        </w:rPr>
+        <w:t>Tabla 4.6. Ejemplo de la tabla normalizada de necesidades hídricas del pimiento.</w:t>
+      </w:r>
+      <w:r>
+        <w:rPr>
+          <w:sz w:val="21"/>
+        </w:rPr>
+        <w:tab/>
+        <w:t>37</w:t>
+      </w:r>
     </w:p>
     <w:p>
       <w:pPr>
         <w:pStyle w:val="EntradadendiceTFM"/>
-      </w:pPr>
-      <w:hyperlink w:anchor="idx_tbl_4_7" w:history="1">
-        <w:r>
-          <w:t>Tabla 4.7. Ejemplo de la tabla normalizada de predicción diaria de AEMET.</w:t>
-        </w:r>
-        <w:r>
-          <w:tab/>
-          <w:t>36</w:t>
-        </w:r>
-      </w:hyperlink>
+        <w:spacing w:after="60" w:line="240" w:lineRule="auto"/>
+      </w:pPr>
+      <w:r>
+        <w:rPr>
+          <w:sz w:val="21"/>
+        </w:rPr>
+        <w:t>Tabla 4.7. Ejemplo de la tabla normalizada de predicción diaria de AEMET.</w:t>
+      </w:r>
+      <w:r>
+        <w:rPr>
+          <w:sz w:val="21"/>
+        </w:rPr>
+        <w:tab/>
+        <w:t>38</w:t>
+      </w:r>
     </w:p>
     <w:p>
       <w:pPr>
         <w:pStyle w:val="EntradadendiceTFM"/>
-      </w:pPr>
-      <w:hyperlink w:anchor="idx_tbl_4_8" w:history="1">
-        <w:r>
-          <w:t>Tabla 4.8. Volumen de registros por capa antes y después de la limpieza.</w:t>
-        </w:r>
-        <w:r>
-          <w:tab/>
-          <w:t>36</w:t>
-        </w:r>
-      </w:hyperlink>
+        <w:spacing w:after="60" w:line="240" w:lineRule="auto"/>
+      </w:pPr>
+      <w:r>
+        <w:rPr>
+          <w:sz w:val="21"/>
+        </w:rPr>
+        <w:t>Tabla 4.8. Volumen de registros por capa antes y después de la limpieza.</w:t>
+      </w:r>
+      <w:r>
+        <w:rPr>
+          <w:sz w:val="21"/>
+        </w:rPr>
+        <w:tab/>
+        <w:t>38</w:t>
+      </w:r>
     </w:p>
     <w:p>
       <w:pPr>
         <w:pStyle w:val="EntradadendiceTFM"/>
-      </w:pPr>
-      <w:hyperlink w:anchor="idx_tbl_4_9" w:history="1">
-        <w:r>
-          <w:t>Tabla 4.9. Resumen de los controles de calidad por tabla.</w:t>
-        </w:r>
-        <w:r>
-          <w:tab/>
-          <w:t>38</w:t>
-        </w:r>
-      </w:hyperlink>
+        <w:spacing w:after="60" w:line="240" w:lineRule="auto"/>
+      </w:pPr>
+      <w:r>
+        <w:rPr>
+          <w:sz w:val="21"/>
+        </w:rPr>
+        <w:t>Tabla 4.9. Resumen de los controles de calidad por tabla.</w:t>
+      </w:r>
+      <w:r>
+        <w:rPr>
+          <w:sz w:val="21"/>
+        </w:rPr>
+        <w:tab/>
+        <w:t>40</w:t>
+      </w:r>
     </w:p>
     <w:p>
       <w:pPr>
         <w:pStyle w:val="EntradadendiceTFM"/>
-      </w:pPr>
-      <w:hyperlink w:anchor="idx_tbl_4_10" w:history="1">
-        <w:r>
-          <w:t>Tabla 4.10. Cobertura y calidad del conjunto de datos del piloto.</w:t>
-        </w:r>
-        <w:r>
-          <w:tab/>
-          <w:t>40</w:t>
-        </w:r>
-      </w:hyperlink>
+        <w:spacing w:after="60" w:line="240" w:lineRule="auto"/>
+      </w:pPr>
+      <w:r>
+        <w:rPr>
+          <w:sz w:val="21"/>
+        </w:rPr>
+        <w:t>Tabla 4.10. Cobertura y calidad del conjunto de datos del piloto.</w:t>
+      </w:r>
+      <w:r>
+        <w:rPr>
+          <w:sz w:val="21"/>
+        </w:rPr>
+        <w:tab/>
+        <w:t>42</w:t>
+      </w:r>
     </w:p>
     <w:p>
       <w:pPr>
         <w:pStyle w:val="EntradadendiceTFM"/>
-      </w:pPr>
-      <w:hyperlink w:anchor="idx_tbl_4_11" w:history="1">
-        <w:r>
-          <w:t>Tabla 4.11. Estadísticos descriptivos de las variables principales.</w:t>
-        </w:r>
-        <w:r>
-          <w:tab/>
-          <w:t>41</w:t>
-        </w:r>
-      </w:hyperlink>
+        <w:spacing w:after="60" w:line="240" w:lineRule="auto"/>
+      </w:pPr>
+      <w:r>
+        <w:rPr>
+          <w:sz w:val="21"/>
+        </w:rPr>
+        <w:t>Tabla 4.11. Estadísticos descriptivos de las variables principales.</w:t>
+      </w:r>
+      <w:r>
+        <w:rPr>
+          <w:sz w:val="21"/>
+        </w:rPr>
+        <w:tab/>
+        <w:t>43</w:t>
+      </w:r>
     </w:p>
     <w:p>
       <w:pPr>
         <w:pStyle w:val="EntradadendiceTFM"/>
-      </w:pPr>
-      <w:hyperlink w:anchor="idx_tbl_4_12" w:history="1">
-        <w:r>
-          <w:t>Tabla 4.12. Clasificación de variables según su disponibilidad y función en el modelo.</w:t>
-        </w:r>
-        <w:r>
-          <w:tab/>
-          <w:t>45</w:t>
-        </w:r>
-      </w:hyperlink>
+        <w:spacing w:after="60" w:line="240" w:lineRule="auto"/>
+      </w:pPr>
+      <w:r>
+        <w:rPr>
+          <w:sz w:val="21"/>
+        </w:rPr>
+        <w:t>Tabla 4.12. Clasificación de variables según su disponibilidad y función en el modelo.</w:t>
+      </w:r>
+      <w:r>
+        <w:rPr>
+          <w:sz w:val="21"/>
+        </w:rPr>
+        <w:tab/>
+        <w:t>46</w:t>
+      </w:r>
     </w:p>
     <w:p>
       <w:pPr>
         <w:pStyle w:val="EntradadendiceTFM"/>
-      </w:pPr>
-      <w:hyperlink w:anchor="idx_tbl_4_13" w:history="1">
-        <w:r>
-          <w:t>Tabla 4.13. Rendimiento medio en los tres cortes de validación temporal.</w:t>
-        </w:r>
-        <w:r>
-          <w:tab/>
-          <w:t>49</w:t>
-        </w:r>
-      </w:hyperlink>
+        <w:spacing w:after="60" w:line="240" w:lineRule="auto"/>
+      </w:pPr>
+      <w:r>
+        <w:rPr>
+          <w:sz w:val="21"/>
+        </w:rPr>
+        <w:t>Tabla 4.13. Rendimiento medio en los tres cortes de validación temporal.</w:t>
+      </w:r>
+      <w:r>
+        <w:rPr>
+          <w:sz w:val="21"/>
+        </w:rPr>
+        <w:tab/>
+        <w:t>50</w:t>
+      </w:r>
     </w:p>
     <w:p>
       <w:pPr>
         <w:pStyle w:val="EntradadendiceTFM"/>
-      </w:pPr>
-      <w:hyperlink w:anchor="idx_tbl_4_14" w:history="1">
-        <w:r>
-          <w:t>Tabla 4.14. Resultados sobre el periodo de prueba reservado.</w:t>
-        </w:r>
-        <w:r>
-          <w:tab/>
-          <w:t>50</w:t>
-        </w:r>
-      </w:hyperlink>
+        <w:spacing w:after="60" w:line="240" w:lineRule="auto"/>
+      </w:pPr>
+      <w:r>
+        <w:rPr>
+          <w:sz w:val="21"/>
+        </w:rPr>
+        <w:t>Tabla 4.14. Resultados sobre el periodo de prueba reservado.</w:t>
+      </w:r>
+      <w:r>
+        <w:rPr>
+          <w:sz w:val="21"/>
+        </w:rPr>
+        <w:tab/>
+        <w:t>51</w:t>
+      </w:r>
     </w:p>
     <w:p>
       <w:pPr>
         <w:pStyle w:val="EntradadendiceTFM"/>
-      </w:pPr>
-      <w:hyperlink w:anchor="idx_tbl_4_15" w:history="1">
-        <w:r>
-          <w:t>Tabla 4.15. Reentrenamiento por cultivo y estación con datos hasta el 22 de octubre de 2026.</w:t>
-        </w:r>
-        <w:r>
-          <w:tab/>
-          <w:t>53</w:t>
-        </w:r>
-      </w:hyperlink>
+        <w:spacing w:after="60" w:line="240" w:lineRule="auto"/>
+      </w:pPr>
+      <w:r>
+        <w:rPr>
+          <w:sz w:val="21"/>
+        </w:rPr>
+        <w:t>Tabla 4.15. Reentrenamiento por cultivo y estación con datos hasta el 22 de octubre de 2026.</w:t>
+      </w:r>
+      <w:r>
+        <w:rPr>
+          <w:sz w:val="21"/>
+        </w:rPr>
+        <w:tab/>
+        <w:t>54</w:t>
+      </w:r>
     </w:p>
     <w:p>
       <w:pPr>
         <w:pStyle w:val="EntradadendiceTFM"/>
-      </w:pPr>
-      <w:hyperlink w:anchor="idx_tbl_4_16" w:history="1">
-        <w:r>
-          <w:t>Tabla 4.16. Modelo de ETc y cálculo físico por cultivo y estación.</w:t>
-        </w:r>
-        <w:r>
-          <w:tab/>
-          <w:t>54</w:t>
-        </w:r>
-      </w:hyperlink>
+        <w:spacing w:after="60" w:line="240" w:lineRule="auto"/>
+      </w:pPr>
+      <w:r>
+        <w:rPr>
+          <w:sz w:val="21"/>
+        </w:rPr>
+        <w:t>Tabla 4.16. Modelo de ETc y cálculo físico por cultivo y estación.</w:t>
+      </w:r>
+      <w:r>
+        <w:rPr>
+          <w:sz w:val="21"/>
+        </w:rPr>
+        <w:tab/>
+        <w:t>55</w:t>
+      </w:r>
     </w:p>
     <w:p>
       <w:pPr>
         <w:pStyle w:val="EntradadendiceTFM"/>
-      </w:pPr>
-      <w:hyperlink w:anchor="idx_tbl_4_17" w:history="1">
-        <w:r>
-          <w:t>Tabla 4.17. Variables con mayor contribución media absoluta en la prueba temporal.</w:t>
-        </w:r>
-        <w:r>
-          <w:tab/>
-          <w:t>55</w:t>
-        </w:r>
-      </w:hyperlink>
+        <w:spacing w:after="60" w:line="240" w:lineRule="auto"/>
+      </w:pPr>
+      <w:r>
+        <w:rPr>
+          <w:sz w:val="21"/>
+        </w:rPr>
+        <w:t>Tabla 4.17. Variables con mayor contribución media absoluta en la prueba temporal.</w:t>
+      </w:r>
+      <w:r>
+        <w:rPr>
+          <w:sz w:val="21"/>
+        </w:rPr>
+        <w:tab/>
+        <w:t>56</w:t>
+      </w:r>
     </w:p>
     <w:p>
       <w:pPr>
         <w:pStyle w:val="EntradadendiceTFM"/>
-      </w:pPr>
-      <w:r>
+        <w:spacing w:after="60" w:line="240" w:lineRule="auto"/>
+      </w:pPr>
+      <w:r>
+        <w:rPr>
+          <w:sz w:val="21"/>
+        </w:rPr>
         <w:t>Tabla 4.18. MAE de Ridge ET0 y media móvil por horizonte.</w:t>
+      </w:r>
+      <w:r>
+        <w:rPr>
+          <w:sz w:val="21"/>
+        </w:rPr>
         <w:tab/>
         <w:t>59</w:t>
       </w:r>
@@ -8239,142 +8353,211 @@
     <w:p>
       <w:pPr>
         <w:pStyle w:val="EntradadendiceTFM"/>
-      </w:pPr>
-      <w:hyperlink w:anchor="idx_tbl_5_1" w:history="1">
-        <w:r>
-          <w:t>Tabla 5.1. Reglas aplicadas por el motor de recomendación.</w:t>
-        </w:r>
-        <w:r>
-          <w:tab/>
-          <w:t>60</w:t>
-        </w:r>
-      </w:hyperlink>
+        <w:spacing w:after="60" w:line="240" w:lineRule="auto"/>
+      </w:pPr>
+      <w:r>
+        <w:rPr>
+          <w:sz w:val="21"/>
+        </w:rPr>
+        <w:t>Tabla 5.1. Reglas aplicadas por el motor de recomendación.</w:t>
+      </w:r>
+      <w:r>
+        <w:rPr>
+          <w:sz w:val="21"/>
+        </w:rPr>
+        <w:tab/>
+        <w:t>63</w:t>
+      </w:r>
     </w:p>
     <w:p>
       <w:pPr>
         <w:pStyle w:val="EntradadendiceTFM"/>
-      </w:pPr>
-      <w:hyperlink w:anchor="idx_tbl_5_2" w:history="1">
-        <w:r>
-          <w:t>Tabla 5.2. Planificación emitida el 28 de junio de 2025 frente a la referencia SiAR.</w:t>
-        </w:r>
-        <w:r>
-          <w:tab/>
-          <w:t>65</w:t>
-        </w:r>
-      </w:hyperlink>
+        <w:spacing w:after="60" w:line="240" w:lineRule="auto"/>
+      </w:pPr>
+      <w:r>
+        <w:rPr>
+          <w:sz w:val="21"/>
+        </w:rPr>
+        <w:t>Tabla 5.2. Planificación emitida el 28 de junio de 2025 frente a la referencia SiAR.</w:t>
+      </w:r>
+      <w:r>
+        <w:rPr>
+          <w:sz w:val="21"/>
+        </w:rPr>
+        <w:tab/>
+        <w:t>68</w:t>
+      </w:r>
     </w:p>
     <w:p>
       <w:pPr>
         <w:pStyle w:val="EntradadendiceTFM"/>
-      </w:pPr>
-      <w:hyperlink w:anchor="idx_tbl_5_3" w:history="1">
-        <w:r>
-          <w:t>Tabla 5.3. MAE medio de los horizontes 1 a 7 según la ventana de ET0 (mm/día).</w:t>
-        </w:r>
-        <w:r>
-          <w:tab/>
-          <w:t>67</w:t>
-        </w:r>
-      </w:hyperlink>
+        <w:spacing w:after="60" w:line="240" w:lineRule="auto"/>
+      </w:pPr>
+      <w:r>
+        <w:rPr>
+          <w:sz w:val="21"/>
+        </w:rPr>
+        <w:t>Tabla 5.3. MAE medio de los horizontes 1 a 7 según la ventana de ET0 (mm/día).</w:t>
+      </w:r>
+      <w:r>
+        <w:rPr>
+          <w:sz w:val="21"/>
+        </w:rPr>
+        <w:tab/>
+        <w:t>70</w:t>
+      </w:r>
     </w:p>
     <w:p>
       <w:pPr>
         <w:pStyle w:val="EntradadendiceTFM"/>
-      </w:pPr>
-      <w:hyperlink w:anchor="idx_tbl_5_4" w:history="1">
-        <w:r>
-          <w:t>Tabla 5.4. Error de la recomendación a un día frente a la referencia SiAR.</w:t>
-        </w:r>
-        <w:r>
-          <w:tab/>
-          <w:t>68</w:t>
-        </w:r>
-      </w:hyperlink>
+        <w:spacing w:after="60" w:line="240" w:lineRule="auto"/>
+      </w:pPr>
+      <w:r>
+        <w:rPr>
+          <w:sz w:val="21"/>
+        </w:rPr>
+        <w:t>Tabla 5.4. Error de la recomendación a un día frente a la referencia SiAR.</w:t>
+      </w:r>
+      <w:r>
+        <w:rPr>
+          <w:sz w:val="21"/>
+        </w:rPr>
+        <w:tab/>
+        <w:t>71</w:t>
+      </w:r>
     </w:p>
     <w:p>
       <w:pPr>
         <w:pStyle w:val="EntradadendiceTFM"/>
-      </w:pPr>
-      <w:hyperlink w:anchor="idx_tbl_5_5" w:history="1">
-        <w:r>
-          <w:t>Tabla 5.5. MAE diario según el día del horizonte (mm/día).</w:t>
-        </w:r>
-        <w:r>
-          <w:tab/>
-          <w:t>70</w:t>
-        </w:r>
-      </w:hyperlink>
+        <w:spacing w:after="60" w:line="240" w:lineRule="auto"/>
+      </w:pPr>
+      <w:r>
+        <w:rPr>
+          <w:sz w:val="21"/>
+        </w:rPr>
+        <w:t>Tabla 5.5. MAE diario según el día del horizonte (mm/día).</w:t>
+      </w:r>
+      <w:r>
+        <w:rPr>
+          <w:sz w:val="21"/>
+        </w:rPr>
+        <w:tab/>
+        <w:t>73</w:t>
+      </w:r>
     </w:p>
     <w:p>
       <w:pPr>
         <w:pStyle w:val="EntradadendiceTFM"/>
-      </w:pPr>
-      <w:hyperlink w:anchor="idx_tbl_5_6" w:history="1">
-        <w:r>
-          <w:t>Tabla 5.6. Dosis bruta de los 148 días con referencia válida según el sistema de riego.</w:t>
-        </w:r>
-        <w:r>
-          <w:tab/>
-          <w:t>72</w:t>
-        </w:r>
-      </w:hyperlink>
+        <w:spacing w:after="60" w:line="240" w:lineRule="auto"/>
+      </w:pPr>
+      <w:r>
+        <w:rPr>
+          <w:sz w:val="21"/>
+        </w:rPr>
+        <w:t>Tabla 5.6. Dosis bruta de los 148 días con referencia válida según el sistema de riego.</w:t>
+      </w:r>
+      <w:r>
+        <w:rPr>
+          <w:sz w:val="21"/>
+        </w:rPr>
+        <w:tab/>
+        <w:t>75</w:t>
+      </w:r>
     </w:p>
     <w:p>
       <w:pPr>
         <w:pStyle w:val="EntradadendiceTFM"/>
-      </w:pPr>
-      <w:hyperlink w:anchor="idx_tbl_5_7" w:history="1">
-        <w:r>
-          <w:t>Tabla 5.7. Escenarios de validación del comportamiento del sistema.</w:t>
-        </w:r>
-        <w:r>
-          <w:tab/>
-          <w:t>73</w:t>
-        </w:r>
-      </w:hyperlink>
+        <w:spacing w:after="60" w:line="240" w:lineRule="auto"/>
+      </w:pPr>
+      <w:r>
+        <w:rPr>
+          <w:sz w:val="21"/>
+        </w:rPr>
+        <w:t>Tabla 5.7. Escenarios de validación del comportamiento del sistema.</w:t>
+      </w:r>
+      <w:r>
+        <w:rPr>
+          <w:sz w:val="21"/>
+        </w:rPr>
+        <w:tab/>
+        <w:t>76</w:t>
+      </w:r>
     </w:p>
     <w:p>
       <w:pPr>
         <w:pStyle w:val="EntradadendiceTFM"/>
-      </w:pPr>
-      <w:hyperlink w:anchor="idx_tbl_6_1" w:history="1">
-        <w:r>
-          <w:t>Tabla 6.1. Grado de cumplimiento de los objetivos específicos.</w:t>
-        </w:r>
-        <w:r>
-          <w:tab/>
-          <w:t>76</w:t>
-        </w:r>
-      </w:hyperlink>
+        <w:spacing w:after="60" w:line="240" w:lineRule="auto"/>
+      </w:pPr>
+      <w:r>
+        <w:rPr>
+          <w:sz w:val="21"/>
+        </w:rPr>
+        <w:t>Tabla 5.8. Validación temporal multicaso a un día frente a la referencia SiAR.</w:t>
+      </w:r>
+      <w:r>
+        <w:rPr>
+          <w:sz w:val="21"/>
+        </w:rPr>
+        <w:tab/>
+        <w:t>78</w:t>
+      </w:r>
     </w:p>
     <w:p>
       <w:pPr>
         <w:pStyle w:val="EntradadendiceTFM"/>
-      </w:pPr>
-      <w:hyperlink w:anchor="idx_tbl_6_2" w:history="1">
-        <w:r>
-          <w:t>Tabla 6.2. Limitaciones del piloto, alcance de las conclusiones y línea de mejora asociada.</w:t>
-        </w:r>
-        <w:r>
-          <w:tab/>
-          <w:t>79</w:t>
-        </w:r>
-      </w:hyperlink>
+        <w:spacing w:after="60" w:line="240" w:lineRule="auto"/>
+      </w:pPr>
+      <w:r>
+        <w:rPr>
+          <w:sz w:val="21"/>
+        </w:rPr>
+        <w:t>Tabla 6.1. Grado de cumplimiento de los objetivos específicos.</w:t>
+      </w:r>
+      <w:r>
+        <w:rPr>
+          <w:sz w:val="21"/>
+        </w:rPr>
+        <w:tab/>
+        <w:t>80</w:t>
+      </w:r>
     </w:p>
     <w:p>
       <w:pPr>
         <w:pStyle w:val="EntradadendiceTFM"/>
-      </w:pPr>
-      <w:hyperlink w:anchor="idx_tbl_A_1" w:history="1">
-        <w:r>
-          <w:t>Tabla A.1. Rutas del repositorio para reproducir y contrastar los resultados.</w:t>
-        </w:r>
-        <w:r>
-          <w:tab/>
-          <w:t>89</w:t>
-        </w:r>
-      </w:hyperlink>
+        <w:spacing w:after="60" w:line="240" w:lineRule="auto"/>
+      </w:pPr>
+      <w:r>
+        <w:rPr>
+          <w:sz w:val="21"/>
+        </w:rPr>
+        <w:t>Tabla 6.2. Limitaciones del piloto, alcance de las conclusiones y línea de mejora asociada.</w:t>
+      </w:r>
+      <w:r>
+        <w:rPr>
+          <w:sz w:val="21"/>
+        </w:rPr>
+        <w:tab/>
+        <w:t>83</w:t>
+      </w:r>
+    </w:p>
+    <w:p>
+      <w:pPr>
+        <w:pStyle w:val="EntradadendiceTFM"/>
+        <w:spacing w:after="60" w:line="240" w:lineRule="auto"/>
+      </w:pPr>
+      <w:r>
+        <w:rPr>
+          <w:sz w:val="21"/>
+        </w:rPr>
+        <w:t>Tabla A.1. Rutas del repositorio para reproducir y contrastar los resultados.</w:t>
+      </w:r>
+      <w:r>
+        <w:rPr>
+          <w:sz w:val="21"/>
+        </w:rPr>
+        <w:tab/>
+        <w:t>94</w:t>
+      </w:r>
     </w:p>
     <w:p>
       <w:r>
@@ -8393,212 +8576,325 @@
     <w:p>
       <w:pPr>
         <w:pStyle w:val="EntradadendiceTFM"/>
-      </w:pPr>
-      <w:hyperlink w:anchor="idx_fig_3_1" w:history="1">
-        <w:r>
-          <w:t>Figura 3.1. Arquitectura del prototipo. Las cajas azules representan componentes implementados y las cajas discontinuas identifican extensiones previstas.</w:t>
-        </w:r>
-        <w:r>
-          <w:tab/>
-          <w:t>24</w:t>
-        </w:r>
-      </w:hyperlink>
+        <w:spacing w:after="60" w:line="240" w:lineRule="auto"/>
+      </w:pPr>
+      <w:r>
+        <w:rPr>
+          <w:sz w:val="21"/>
+        </w:rPr>
+        <w:t>Figura 1.1. Relación entre los cuatro bloques de evaluación del proyecto y alcance de cada uno.</w:t>
+      </w:r>
+      <w:r>
+        <w:rPr>
+          <w:sz w:val="21"/>
+        </w:rPr>
+        <w:tab/>
+        <w:t>14</w:t>
+      </w:r>
     </w:p>
     <w:p>
       <w:pPr>
         <w:pStyle w:val="EntradadendiceTFM"/>
-      </w:pPr>
-      <w:hyperlink w:anchor="idx_fig_4_1" w:history="1">
-        <w:r>
-          <w:t>Figura 4.1. ETL del caso piloto desde su configuración hasta la tabla analítica. Los gráficos inferiores utilizan datos reales de la extracción del 24 de septiembre de 2026.</w:t>
-        </w:r>
-        <w:r>
-          <w:tab/>
-          <w:t>29</w:t>
-        </w:r>
-      </w:hyperlink>
+        <w:spacing w:after="60" w:line="240" w:lineRule="auto"/>
+      </w:pPr>
+      <w:r>
+        <w:rPr>
+          <w:sz w:val="21"/>
+        </w:rPr>
+        <w:t>Figura 3.1. Arquitectura del prototipo. Las cajas azules representan componentes implementados y las cajas discontinuas identifican extensiones previstas.</w:t>
+      </w:r>
+      <w:r>
+        <w:rPr>
+          <w:sz w:val="21"/>
+        </w:rPr>
+        <w:tab/>
+        <w:t>25</w:t>
+      </w:r>
     </w:p>
     <w:p>
       <w:pPr>
         <w:pStyle w:val="EntradadendiceTFM"/>
-      </w:pPr>
-      <w:hyperlink w:anchor="idx_fig_4_2" w:history="1">
-        <w:r>
-          <w:t>Figura 4.2. Valores ausentes y continuidad del calendario en la tabla analítica del piloto. Fuente: elaboración propia a partir de SiAR.</w:t>
-        </w:r>
-        <w:r>
-          <w:tab/>
-          <w:t>41</w:t>
-        </w:r>
-      </w:hyperlink>
+        <w:spacing w:after="60" w:line="240" w:lineRule="auto"/>
+      </w:pPr>
+      <w:r>
+        <w:rPr>
+          <w:sz w:val="21"/>
+        </w:rPr>
+        <w:t>Figura 4.1. ETL del caso piloto desde su configuración hasta la tabla analítica. Los gráficos inferiores utilizan datos reales de la extracción del 24 de septiembre de 2026.</w:t>
+      </w:r>
+      <w:r>
+        <w:rPr>
+          <w:sz w:val="21"/>
+        </w:rPr>
+        <w:tab/>
+        <w:t>31</w:t>
+      </w:r>
     </w:p>
     <w:p>
       <w:pPr>
         <w:pStyle w:val="EntradadendiceTFM"/>
-      </w:pPr>
-      <w:hyperlink w:anchor="idx_fig_4_3" w:history="1">
-        <w:r>
-          <w:t>Figura 4.3. Evolución de ET0, ETc, necesidad neta, Kc y precipitación efectiva. Fuente: elaboración propia a partir de SiAR.</w:t>
-        </w:r>
-        <w:r>
-          <w:tab/>
-          <w:t>42</w:t>
-        </w:r>
-      </w:hyperlink>
+        <w:spacing w:after="60" w:line="240" w:lineRule="auto"/>
+      </w:pPr>
+      <w:r>
+        <w:rPr>
+          <w:sz w:val="21"/>
+        </w:rPr>
+        <w:t>Figura 4.2. Valores ausentes y continuidad del calendario en la tabla analítica del piloto. Fuente: elaboración propia a partir de SiAR.</w:t>
+      </w:r>
+      <w:r>
+        <w:rPr>
+          <w:sz w:val="21"/>
+        </w:rPr>
+        <w:tab/>
+        <w:t>43</w:t>
+      </w:r>
     </w:p>
     <w:p>
       <w:pPr>
         <w:pStyle w:val="EntradadendiceTFM"/>
-      </w:pPr>
-      <w:hyperlink w:anchor="idx_fig_4_4" w:history="1">
-        <w:r>
-          <w:t>Figura 4.4. Distribución de temperatura, humedad, ET0 y necesidad neta. Fuente: elaboración propia a partir de SiAR.</w:t>
-        </w:r>
-        <w:r>
-          <w:tab/>
-          <w:t>43</w:t>
-        </w:r>
-      </w:hyperlink>
+        <w:spacing w:after="60" w:line="240" w:lineRule="auto"/>
+      </w:pPr>
+      <w:r>
+        <w:rPr>
+          <w:sz w:val="21"/>
+        </w:rPr>
+        <w:t>Figura 4.3. Evolución de ET0, ETc, necesidad neta, Kc y precipitación efectiva. Fuente: elaboración propia a partir de SiAR.</w:t>
+      </w:r>
+      <w:r>
+        <w:rPr>
+          <w:sz w:val="21"/>
+        </w:rPr>
+        <w:tab/>
+        <w:t>44</w:t>
+      </w:r>
     </w:p>
     <w:p>
       <w:pPr>
         <w:pStyle w:val="EntradadendiceTFM"/>
-      </w:pPr>
-      <w:hyperlink w:anchor="idx_fig_4_5" w:history="1">
-        <w:r>
-          <w:t>Figura 4.5. Matriz de correlaciones de Pearson para variables seleccionadas. Fuente: elaboración propia a partir de SiAR.</w:t>
-        </w:r>
-        <w:r>
-          <w:tab/>
-          <w:t>44</w:t>
-        </w:r>
-      </w:hyperlink>
+        <w:spacing w:after="60" w:line="240" w:lineRule="auto"/>
+      </w:pPr>
+      <w:r>
+        <w:rPr>
+          <w:sz w:val="21"/>
+        </w:rPr>
+        <w:t>Figura 4.4. Distribución de temperatura, humedad, ET0 y necesidad neta. Fuente: elaboración propia a partir de SiAR.</w:t>
+      </w:r>
+      <w:r>
+        <w:rPr>
+          <w:sz w:val="21"/>
+        </w:rPr>
+        <w:tab/>
+        <w:t>44</w:t>
+      </w:r>
     </w:p>
     <w:p>
       <w:pPr>
         <w:pStyle w:val="EntradadendiceTFM"/>
-      </w:pPr>
-      <w:hyperlink w:anchor="idx_fig_4_6" w:history="1">
-        <w:r>
-          <w:t>Figura 4.6. Estabilidad temporal de los modelos durante la validación y comparación con la prueba final.</w:t>
-        </w:r>
-        <w:r>
-          <w:tab/>
-          <w:t>50</w:t>
-        </w:r>
-      </w:hyperlink>
+        <w:spacing w:after="60" w:line="240" w:lineRule="auto"/>
+      </w:pPr>
+      <w:r>
+        <w:rPr>
+          <w:sz w:val="21"/>
+        </w:rPr>
+        <w:t>Figura 4.5. Matriz de correlaciones de Pearson para variables seleccionadas. Fuente: elaboración propia a partir de SiAR.</w:t>
+      </w:r>
+      <w:r>
+        <w:rPr>
+          <w:sz w:val="21"/>
+        </w:rPr>
+        <w:tab/>
+        <w:t>45</w:t>
+      </w:r>
     </w:p>
     <w:p>
       <w:pPr>
         <w:pStyle w:val="EntradadendiceTFM"/>
-      </w:pPr>
-      <w:hyperlink w:anchor="idx_fig_4_7" w:history="1">
-        <w:r>
-          <w:t>Figura 4.7. Predicciones y errores diarios de los seis enfoques en el tramo de prueba.</w:t>
-        </w:r>
-        <w:r>
-          <w:tab/>
-          <w:t>51</w:t>
-        </w:r>
-      </w:hyperlink>
+        <w:spacing w:after="60" w:line="240" w:lineRule="auto"/>
+      </w:pPr>
+      <w:r>
+        <w:rPr>
+          <w:sz w:val="21"/>
+        </w:rPr>
+        <w:t>Figura 4.6. Estabilidad temporal de los modelos durante la validación y comparación con la prueba final.</w:t>
+      </w:r>
+      <w:r>
+        <w:rPr>
+          <w:sz w:val="21"/>
+        </w:rPr>
+        <w:tab/>
+        <w:t>51</w:t>
+      </w:r>
     </w:p>
     <w:p>
       <w:pPr>
         <w:pStyle w:val="EntradadendiceTFM"/>
-      </w:pPr>
-      <w:hyperlink w:anchor="idx_fig_4_8" w:history="1">
-        <w:r>
-          <w:t>Figura 4.8. Error del modelo elegido en validación temporal y prueba final para seis casos.</w:t>
-        </w:r>
-        <w:r>
-          <w:tab/>
-          <w:t>53</w:t>
-        </w:r>
-      </w:hyperlink>
+        <w:spacing w:after="60" w:line="240" w:lineRule="auto"/>
+      </w:pPr>
+      <w:r>
+        <w:rPr>
+          <w:sz w:val="21"/>
+        </w:rPr>
+        <w:t>Figura 4.7. Predicciones y errores diarios de los seis enfoques en el tramo de prueba.</w:t>
+      </w:r>
+      <w:r>
+        <w:rPr>
+          <w:sz w:val="21"/>
+        </w:rPr>
+        <w:tab/>
+        <w:t>52</w:t>
+      </w:r>
     </w:p>
     <w:p>
       <w:pPr>
         <w:pStyle w:val="EntradadendiceTFM"/>
-      </w:pPr>
-      <w:hyperlink w:anchor="idx_fig_4_9" w:history="1">
-        <w:r>
-          <w:t>Figura 4.9. Importancia global y explicaciones locales de Random Forest y XGBoost mediante TreeSHAP.</w:t>
-        </w:r>
-        <w:r>
-          <w:tab/>
-          <w:t>55</w:t>
-        </w:r>
-      </w:hyperlink>
+        <w:spacing w:after="60" w:line="240" w:lineRule="auto"/>
+      </w:pPr>
+      <w:r>
+        <w:rPr>
+          <w:sz w:val="21"/>
+        </w:rPr>
+        <w:t>Figura 4.8. Error del modelo elegido en validación temporal y prueba final para seis casos.</w:t>
+      </w:r>
+      <w:r>
+        <w:rPr>
+          <w:sz w:val="21"/>
+        </w:rPr>
+        <w:tab/>
+        <w:t>55</w:t>
+      </w:r>
     </w:p>
     <w:p>
       <w:pPr>
         <w:pStyle w:val="EntradadendiceTFM"/>
-      </w:pPr>
-      <w:hyperlink w:anchor="idx_fig_5_1" w:history="1">
-        <w:r>
-          <w:t>Figura 5.1. Flujo simplificado del motor retrospectivo de 2025.</w:t>
-        </w:r>
-        <w:r>
-          <w:tab/>
-          <w:t>58</w:t>
-        </w:r>
-      </w:hyperlink>
+        <w:spacing w:after="60" w:line="240" w:lineRule="auto"/>
+      </w:pPr>
+      <w:r>
+        <w:rPr>
+          <w:sz w:val="21"/>
+        </w:rPr>
+        <w:t>Figura 4.9. Importancia global y explicaciones locales de Random Forest y XGBoost mediante TreeSHAP.</w:t>
+      </w:r>
+      <w:r>
+        <w:rPr>
+          <w:sz w:val="21"/>
+        </w:rPr>
+        <w:tab/>
+        <w:t>57</w:t>
+      </w:r>
     </w:p>
     <w:p>
       <w:pPr>
         <w:pStyle w:val="EntradadendiceTFM"/>
-      </w:pPr>
-      <w:hyperlink w:anchor="idx_fig_5_2" w:history="1">
-        <w:r>
-          <w:t>Figura 5.2. Captura de la interfaz anterior para la planificación histórica emitida el 28 de junio de 2025, con referencia SiAR superpuesta.</w:t>
-        </w:r>
-        <w:r>
-          <w:tab/>
-          <w:t>64</w:t>
-        </w:r>
-      </w:hyperlink>
+        <w:spacing w:after="60" w:line="240" w:lineRule="auto"/>
+      </w:pPr>
+      <w:r>
+        <w:rPr>
+          <w:sz w:val="21"/>
+        </w:rPr>
+        <w:t>Figura 5.1. Flujo simplificado del motor retrospectivo de 2025.</w:t>
+      </w:r>
+      <w:r>
+        <w:rPr>
+          <w:sz w:val="21"/>
+        </w:rPr>
+        <w:tab/>
+        <w:t>61</w:t>
+      </w:r>
     </w:p>
     <w:p>
       <w:pPr>
         <w:pStyle w:val="EntradadendiceTFM"/>
-      </w:pPr>
-      <w:hyperlink w:anchor="idx_fig_5_3" w:history="1">
-        <w:r>
-          <w:t>Figura 5.3. Recomendaciones emitidas cada día con la información del día anterior y error frente a la referencia SiAR.</w:t>
-        </w:r>
-        <w:r>
-          <w:tab/>
-          <w:t>69</w:t>
-        </w:r>
-      </w:hyperlink>
+        <w:spacing w:after="60" w:line="240" w:lineRule="auto"/>
+      </w:pPr>
+      <w:r>
+        <w:rPr>
+          <w:sz w:val="21"/>
+        </w:rPr>
+        <w:t>Figura 5.2. Captura de la interfaz anterior para la planificación histórica emitida el 28 de junio de 2025, con referencia SiAR superpuesta.</w:t>
+      </w:r>
+      <w:r>
+        <w:rPr>
+          <w:sz w:val="21"/>
+        </w:rPr>
+        <w:tab/>
+        <w:t>67</w:t>
+      </w:r>
     </w:p>
     <w:p>
       <w:pPr>
         <w:pStyle w:val="EntradadendiceTFM"/>
-      </w:pPr>
-      <w:hyperlink w:anchor="idx_fig_5_4" w:history="1">
-        <w:r>
-          <w:t>Figura 5.4. MAE diario según el día del horizonte en los periodos de desarrollo y prueba.</w:t>
-        </w:r>
-        <w:r>
-          <w:tab/>
-          <w:t>70</w:t>
-        </w:r>
-      </w:hyperlink>
+        <w:spacing w:after="60" w:line="240" w:lineRule="auto"/>
+      </w:pPr>
+      <w:r>
+        <w:rPr>
+          <w:sz w:val="21"/>
+        </w:rPr>
+        <w:t>Figura 5.3. Recomendaciones emitidas cada día con la información del día anterior y error frente a la referencia SiAR.</w:t>
+      </w:r>
+      <w:r>
+        <w:rPr>
+          <w:sz w:val="21"/>
+        </w:rPr>
+        <w:tab/>
+        <w:t>72</w:t>
+      </w:r>
     </w:p>
     <w:p>
       <w:pPr>
         <w:pStyle w:val="EntradadendiceTFM"/>
-      </w:pPr>
-      <w:hyperlink w:anchor="idx_fig_5_5" w:history="1">
-        <w:r>
-          <w:t>Figura 5.5. Necesidad neta semanal planificada por el DSS frente a la referencia SiAR y dosis bruta para riego por goteo.</w:t>
-        </w:r>
-        <w:r>
-          <w:tab/>
-          <w:t>71</w:t>
-        </w:r>
-      </w:hyperlink>
+        <w:spacing w:after="60" w:line="240" w:lineRule="auto"/>
+      </w:pPr>
+      <w:r>
+        <w:rPr>
+          <w:sz w:val="21"/>
+        </w:rPr>
+        <w:t>Figura 5.4. MAE diario según el día del horizonte en los periodos de desarrollo y prueba.</w:t>
+      </w:r>
+      <w:r>
+        <w:rPr>
+          <w:sz w:val="21"/>
+        </w:rPr>
+        <w:tab/>
+        <w:t>73</w:t>
+      </w:r>
+    </w:p>
+    <w:p>
+      <w:pPr>
+        <w:pStyle w:val="EntradadendiceTFM"/>
+        <w:spacing w:after="60" w:line="240" w:lineRule="auto"/>
+      </w:pPr>
+      <w:r>
+        <w:rPr>
+          <w:sz w:val="21"/>
+        </w:rPr>
+        <w:t>Figura 5.5. Necesidad neta semanal planificada por el DSS frente a la referencia SiAR y dosis bruta para riego por goteo.</w:t>
+      </w:r>
+      <w:r>
+        <w:rPr>
+          <w:sz w:val="21"/>
+        </w:rPr>
+        <w:tab/>
+        <w:t>75</w:t>
+      </w:r>
+    </w:p>
+    <w:p>
+      <w:pPr>
+        <w:pStyle w:val="EntradadendiceTFM"/>
+        <w:spacing w:after="60" w:line="240" w:lineRule="auto"/>
+      </w:pPr>
+      <w:r>
+        <w:rPr>
+          <w:sz w:val="21"/>
+        </w:rPr>
+        <w:t>Figura 5.6. MAE de prueba del DSS y la persistencia en tres cultivos y regiones de 2026.</w:t>
+      </w:r>
+      <w:r>
+        <w:rPr>
+          <w:sz w:val="21"/>
+        </w:rPr>
+        <w:tab/>
+        <w:t>79</w:t>
+      </w:r>
     </w:p>
     <w:p>
       <w:pPr>
@@ -8607,7 +8903,7 @@
       <w:r>
         <w:br w:type="page"/>
       </w:r>
-      <w:bookmarkStart w:id="1" w:name="_Toc244210897"/>
+      <w:bookmarkStart w:id="1" w:name="_Toc244254006"/>
       <w:r>
         <w:lastRenderedPageBreak/>
         <w:t>1. Introducción y objetivos</w:t>
@@ -8618,7 +8914,7 @@
       <w:pPr>
         <w:pStyle w:val="Ttulo2"/>
       </w:pPr>
-      <w:bookmarkStart w:id="2" w:name="_Toc244210898"/>
+      <w:bookmarkStart w:id="2" w:name="_Toc244254007"/>
       <w:r>
         <w:t>1.1. Contexto, motivación y justificación</w:t>
       </w:r>
@@ -8681,7 +8977,7 @@
       <w:pPr>
         <w:pStyle w:val="Ttulo2"/>
       </w:pPr>
-      <w:bookmarkStart w:id="3" w:name="_Toc244210899"/>
+      <w:bookmarkStart w:id="3" w:name="_Toc244254008"/>
       <w:r>
         <w:t>1.2. Objetivos generales y específicos</w:t>
       </w:r>
@@ -8740,7 +9036,7 @@
       <w:pPr>
         <w:pStyle w:val="Ttulo2"/>
       </w:pPr>
-      <w:bookmarkStart w:id="4" w:name="_Toc244210900"/>
+      <w:bookmarkStart w:id="4" w:name="_Toc244254009"/>
       <w:r>
         <w:t>1.3. Alcance, usuarios y limitaciones</w:t>
       </w:r>
@@ -8850,7 +9146,7 @@
         <w:pStyle w:val="Ttulo1"/>
         <w:pageBreakBefore/>
       </w:pPr>
-      <w:bookmarkStart w:id="5" w:name="_Toc244210901"/>
+      <w:bookmarkStart w:id="5" w:name="_Toc244254010"/>
       <w:r>
         <w:lastRenderedPageBreak/>
         <w:t>2. Marco teórico y estado del arte</w:t>
@@ -8861,7 +9157,7 @@
       <w:pPr>
         <w:pStyle w:val="Ttulo2"/>
       </w:pPr>
-      <w:bookmarkStart w:id="6" w:name="_Toc244210902"/>
+      <w:bookmarkStart w:id="6" w:name="_Toc244254011"/>
       <w:r>
         <w:t>2.1. Necesidades hídricas y gestión eficiente del riego</w:t>
       </w:r>
@@ -8929,7 +9225,7 @@
       <w:pPr>
         <w:pStyle w:val="Ttulo2"/>
       </w:pPr>
-      <w:bookmarkStart w:id="7" w:name="_Toc244210903"/>
+      <w:bookmarkStart w:id="7" w:name="_Toc244254012"/>
       <w:r>
         <w:t>2.2. Agricultura de precisión y aprendizaje automático</w:t>
       </w:r>
@@ -9002,7 +9298,7 @@
       <w:pPr>
         <w:pStyle w:val="Ttulo2"/>
       </w:pPr>
-      <w:bookmarkStart w:id="8" w:name="_Toc244210904"/>
+      <w:bookmarkStart w:id="8" w:name="_Toc244254013"/>
       <w:r>
         <w:t>2.3. Sistemas inteligentes de apoyo a la decisión</w:t>
       </w:r>
@@ -9068,7 +9364,7 @@
         <w:pStyle w:val="Ttulo1"/>
         <w:pageBreakBefore/>
       </w:pPr>
-      <w:bookmarkStart w:id="9" w:name="_Toc244210905"/>
+      <w:bookmarkStart w:id="9" w:name="_Toc244254014"/>
       <w:r>
         <w:lastRenderedPageBreak/>
         <w:t>3. Metodología y arquitectura del sistema</w:t>
@@ -9079,7 +9375,7 @@
       <w:pPr>
         <w:pStyle w:val="Ttulo2"/>
       </w:pPr>
-      <w:bookmarkStart w:id="10" w:name="_Toc244210906"/>
+      <w:bookmarkStart w:id="10" w:name="_Toc244254015"/>
       <w:r>
         <w:t>3.1. Fuentes, variables y calidad de los datos</w:t>
       </w:r>
@@ -9099,7 +9395,7 @@
       <w:pPr>
         <w:pStyle w:val="Ttulo3"/>
       </w:pPr>
-      <w:bookmarkStart w:id="11" w:name="_Toc244210907"/>
+      <w:bookmarkStart w:id="11" w:name="_Toc244254016"/>
       <w:r>
         <w:rPr>
           <w:sz w:val="24"/>
@@ -9771,7 +10067,7 @@
       <w:pPr>
         <w:pStyle w:val="Ttulo3"/>
       </w:pPr>
-      <w:bookmarkStart w:id="13" w:name="_Toc244210908"/>
+      <w:bookmarkStart w:id="13" w:name="_Toc244254017"/>
       <w:r>
         <w:rPr>
           <w:sz w:val="24"/>
@@ -10514,7 +10810,7 @@
       <w:pPr>
         <w:pStyle w:val="Ttulo3"/>
       </w:pPr>
-      <w:bookmarkStart w:id="15" w:name="_Toc244210909"/>
+      <w:bookmarkStart w:id="15" w:name="_Toc244254018"/>
       <w:r>
         <w:rPr>
           <w:sz w:val="24"/>
@@ -10623,7 +10919,7 @@
       <w:pPr>
         <w:pStyle w:val="Ttulo3"/>
       </w:pPr>
-      <w:bookmarkStart w:id="16" w:name="_Toc244210910"/>
+      <w:bookmarkStart w:id="16" w:name="_Toc244254019"/>
       <w:r>
         <w:rPr>
           <w:sz w:val="24"/>
@@ -10647,7 +10943,7 @@
       <w:pPr>
         <w:pStyle w:val="Ttulo2"/>
       </w:pPr>
-      <w:bookmarkStart w:id="17" w:name="_Toc244210911"/>
+      <w:bookmarkStart w:id="17" w:name="_Toc244254020"/>
       <w:r>
         <w:t>3.2. Arquitectura, tecnologías y flujo de información</w:t>
       </w:r>
@@ -10722,7 +11018,7 @@
       <w:pPr>
         <w:pStyle w:val="Ttulo3"/>
       </w:pPr>
-      <w:bookmarkStart w:id="19" w:name="_Toc244210912"/>
+      <w:bookmarkStart w:id="19" w:name="_Toc244254021"/>
       <w:r>
         <w:rPr>
           <w:sz w:val="24"/>
@@ -10859,7 +11155,7 @@
       <w:pPr>
         <w:pStyle w:val="Ttulo3"/>
       </w:pPr>
-      <w:bookmarkStart w:id="20" w:name="_Toc244210913"/>
+      <w:bookmarkStart w:id="20" w:name="_Toc244254022"/>
       <w:r>
         <w:rPr>
           <w:sz w:val="24"/>
@@ -11869,7 +12165,7 @@
       <w:pPr>
         <w:pStyle w:val="Ttulo3"/>
       </w:pPr>
-      <w:bookmarkStart w:id="22" w:name="_Toc244210914"/>
+      <w:bookmarkStart w:id="22" w:name="_Toc244254023"/>
       <w:r>
         <w:rPr>
           <w:sz w:val="24"/>
@@ -11896,7 +12192,7 @@
       <w:pPr>
         <w:pStyle w:val="Ttulo3"/>
       </w:pPr>
-      <w:bookmarkStart w:id="23" w:name="_Toc244210915"/>
+      <w:bookmarkStart w:id="23" w:name="_Toc244254024"/>
       <w:r>
         <w:rPr>
           <w:sz w:val="24"/>
@@ -11907,7 +12203,7 @@
     </w:p>
     <w:p>
       <w:r>
-        <w:t>Los módulos generan salidas reproducibles a partir de datos y parámetros conocidos. La suite reúne 150 pruebas definidas para extracción, protección de credenciales, escritura raw, normalización, calidad, variables, selección temporal, modelos de ETc, explicabilidad XAI y reglas del motor. Incluye controles para impedir el uso de información posterior a la consulta. Las figuras y resúmenes se regeneran desde los archivos del proyecto.</w:t>
+        <w:t>Los módulos generan salidas reproducibles a partir de datos y parámetros conocidos. La suite reúne 159 pruebas definidas para extracción, protección de credenciales, escritura raw, normalización, calidad, variables, selección temporal, modelos de ETc, explicabilidad XAI y reglas del motor. Incluye controles para impedir el uso de información posterior a la consulta. Las figuras y resúmenes se regeneran desde los archivos del proyecto.</w:t>
       </w:r>
     </w:p>
     <w:p>
@@ -11919,7 +12215,7 @@
       <w:pPr>
         <w:pStyle w:val="Ttulo2"/>
       </w:pPr>
-      <w:bookmarkStart w:id="24" w:name="_Toc244210916"/>
+      <w:bookmarkStart w:id="24" w:name="_Toc244254025"/>
       <w:r>
         <w:t>3.3. Planificación y organización del proyecto</w:t>
       </w:r>
@@ -12565,7 +12861,7 @@
         <w:pStyle w:val="Ttulo1"/>
         <w:pageBreakBefore/>
       </w:pPr>
-      <w:bookmarkStart w:id="26" w:name="_Toc244210917"/>
+      <w:bookmarkStart w:id="26" w:name="_Toc244254026"/>
       <w:r>
         <w:lastRenderedPageBreak/>
         <w:t>4. Procesamiento de datos y aprendizaje automático</w:t>
@@ -12576,7 +12872,7 @@
       <w:pPr>
         <w:pStyle w:val="Ttulo2"/>
       </w:pPr>
-      <w:bookmarkStart w:id="27" w:name="_Toc244210918"/>
+      <w:bookmarkStart w:id="27" w:name="_Toc244254027"/>
       <w:r>
         <w:t>4.1. Extracción, transformación y almacenamiento de datos</w:t>
       </w:r>
@@ -12659,7 +12955,7 @@
       <w:pPr>
         <w:pStyle w:val="Ttulo3"/>
       </w:pPr>
-      <w:bookmarkStart w:id="29" w:name="_Toc244210919"/>
+      <w:bookmarkStart w:id="29" w:name="_Toc244254028"/>
       <w:r>
         <w:rPr>
           <w:sz w:val="24"/>
@@ -13248,7 +13544,7 @@
       <w:pPr>
         <w:pStyle w:val="Ttulo3"/>
       </w:pPr>
-      <w:bookmarkStart w:id="31" w:name="_Toc244210920"/>
+      <w:bookmarkStart w:id="31" w:name="_Toc244254029"/>
       <w:r>
         <w:rPr>
           <w:sz w:val="24"/>
@@ -13718,7 +14014,7 @@
       <w:pPr>
         <w:pStyle w:val="Ttulo3"/>
       </w:pPr>
-      <w:bookmarkStart w:id="33" w:name="_Toc244210921"/>
+      <w:bookmarkStart w:id="33" w:name="_Toc244254030"/>
       <w:r>
         <w:rPr>
           <w:sz w:val="24"/>
@@ -14504,7 +14800,7 @@
       <w:pPr>
         <w:pStyle w:val="Ttulo3"/>
       </w:pPr>
-      <w:bookmarkStart w:id="35" w:name="_Toc244210922"/>
+      <w:bookmarkStart w:id="35" w:name="_Toc244254031"/>
       <w:r>
         <w:rPr>
           <w:sz w:val="24"/>
@@ -14580,7 +14876,7 @@
       <w:pPr>
         <w:pStyle w:val="Ttulo3"/>
       </w:pPr>
-      <w:bookmarkStart w:id="36" w:name="_Toc244210923"/>
+      <w:bookmarkStart w:id="36" w:name="_Toc244254032"/>
       <w:r>
         <w:rPr>
           <w:sz w:val="24"/>
@@ -14729,7 +15025,7 @@
       <w:pPr>
         <w:pStyle w:val="Ttulo3"/>
       </w:pPr>
-      <w:bookmarkStart w:id="37" w:name="_Toc244210924"/>
+      <w:bookmarkStart w:id="37" w:name="_Toc244254033"/>
       <w:r>
         <w:rPr>
           <w:sz w:val="24"/>
@@ -17348,7 +17644,7 @@
       <w:pPr>
         <w:pStyle w:val="Ttulo3"/>
       </w:pPr>
-      <w:bookmarkStart w:id="42" w:name="_Toc244210925"/>
+      <w:bookmarkStart w:id="42" w:name="_Toc244254034"/>
       <w:r>
         <w:rPr>
           <w:sz w:val="24"/>
@@ -19339,7 +19635,7 @@
       <w:pPr>
         <w:pStyle w:val="Ttulo3"/>
       </w:pPr>
-      <w:bookmarkStart w:id="44" w:name="_Toc244210926"/>
+      <w:bookmarkStart w:id="44" w:name="_Toc244254035"/>
       <w:r>
         <w:rPr>
           <w:sz w:val="24"/>
@@ -20093,7 +20389,7 @@
       <w:pPr>
         <w:pStyle w:val="Ttulo3"/>
       </w:pPr>
-      <w:bookmarkStart w:id="46" w:name="_Toc244210927"/>
+      <w:bookmarkStart w:id="46" w:name="_Toc244254036"/>
       <w:r>
         <w:rPr>
           <w:sz w:val="24"/>
@@ -20120,7 +20416,7 @@
       <w:pPr>
         <w:pStyle w:val="Ttulo3"/>
       </w:pPr>
-      <w:bookmarkStart w:id="47" w:name="_Toc244210928"/>
+      <w:bookmarkStart w:id="47" w:name="_Toc244254037"/>
       <w:r>
         <w:rPr>
           <w:sz w:val="24"/>
@@ -20148,7 +20444,7 @@
       <w:pPr>
         <w:pStyle w:val="Ttulo3"/>
       </w:pPr>
-      <w:bookmarkStart w:id="48" w:name="_Toc244210929"/>
+      <w:bookmarkStart w:id="48" w:name="_Toc244254038"/>
       <w:r>
         <w:rPr>
           <w:sz w:val="24"/>
@@ -20166,7 +20462,7 @@
       <w:pPr>
         <w:pStyle w:val="Ttulo2"/>
       </w:pPr>
-      <w:bookmarkStart w:id="49" w:name="_Toc244210930"/>
+      <w:bookmarkStart w:id="49" w:name="_Toc244254039"/>
       <w:r>
         <w:t>4.2. Análisis exploratorio y preparación de variables</w:t>
       </w:r>
@@ -20181,7 +20477,7 @@
       <w:pPr>
         <w:pStyle w:val="Ttulo3"/>
       </w:pPr>
-      <w:bookmarkStart w:id="50" w:name="_Toc244210931"/>
+      <w:bookmarkStart w:id="50" w:name="_Toc244254040"/>
       <w:r>
         <w:rPr>
           <w:sz w:val="24"/>
@@ -20715,7 +21011,7 @@
       <w:pPr>
         <w:pStyle w:val="Ttulo3"/>
       </w:pPr>
-      <w:bookmarkStart w:id="53" w:name="_Toc244210932"/>
+      <w:bookmarkStart w:id="53" w:name="_Toc244254041"/>
       <w:r>
         <w:rPr>
           <w:sz w:val="24"/>
@@ -21786,7 +22082,7 @@
       <w:pPr>
         <w:pStyle w:val="Ttulo3"/>
       </w:pPr>
-      <w:bookmarkStart w:id="57" w:name="_Toc244210933"/>
+      <w:bookmarkStart w:id="57" w:name="_Toc244254042"/>
       <w:r>
         <w:rPr>
           <w:sz w:val="24"/>
@@ -21812,10 +22108,10 @@
           <w:noProof/>
         </w:rPr>
         <w:drawing>
-          <wp:inline distT="0" distB="0" distL="0" distR="0" wp14:anchorId="13BAA69C" wp14:editId="7A967673">
+          <wp:inline distT="0" distB="0" distL="0" distR="0" wp14:anchorId="0C57F006" wp14:editId="249FD486">
             <wp:extent cx="5532120" cy="4766930"/>
             <wp:effectExtent l="0" t="0" r="0" b="0"/>
-            <wp:docPr id="5" name="Picture 5" descr="Figura 4.5. Matriz de correlaciones de Pearson para variables seleccionadas. Fuente: elaboración propia a partir de SiAR."/>
+            <wp:docPr id="37" name="Picture 37"/>
             <wp:cNvGraphicFramePr>
               <a:graphicFrameLocks xmlns:a="http://schemas.openxmlformats.org/drawingml/2006/main" noChangeAspect="1"/>
             </wp:cNvGraphicFramePr>
@@ -21823,7 +22119,7 @@
               <a:graphicData uri="http://schemas.openxmlformats.org/drawingml/2006/picture">
                 <pic:pic xmlns:pic="http://schemas.openxmlformats.org/drawingml/2006/picture">
                   <pic:nvPicPr>
-                    <pic:cNvPr id="0" name="image.png"/>
+                    <pic:cNvPr id="0" name="eda_correlations_4_2.png"/>
                     <pic:cNvPicPr/>
                   </pic:nvPicPr>
                   <pic:blipFill>
@@ -21875,7 +22171,7 @@
       <w:pPr>
         <w:pStyle w:val="Ttulo3"/>
       </w:pPr>
-      <w:bookmarkStart w:id="59" w:name="_Toc244210934"/>
+      <w:bookmarkStart w:id="59" w:name="_Toc244254043"/>
       <w:r>
         <w:rPr>
           <w:sz w:val="24"/>
@@ -21958,7 +22254,7 @@
       <w:pPr>
         <w:pStyle w:val="Ttulo3"/>
       </w:pPr>
-      <w:bookmarkStart w:id="60" w:name="_Toc244210935"/>
+      <w:bookmarkStart w:id="60" w:name="_Toc244254044"/>
       <w:r>
         <w:rPr>
           <w:sz w:val="24"/>
@@ -22498,7 +22794,7 @@
       <w:pPr>
         <w:pStyle w:val="Ttulo3"/>
       </w:pPr>
-      <w:bookmarkStart w:id="62" w:name="_Toc244210936"/>
+      <w:bookmarkStart w:id="62" w:name="_Toc244254045"/>
       <w:r>
         <w:rPr>
           <w:sz w:val="24"/>
@@ -22526,7 +22822,7 @@
       <w:pPr>
         <w:pStyle w:val="Ttulo3"/>
       </w:pPr>
-      <w:bookmarkStart w:id="63" w:name="_Toc244210937"/>
+      <w:bookmarkStart w:id="63" w:name="_Toc244254046"/>
       <w:r>
         <w:rPr>
           <w:sz w:val="24"/>
@@ -22642,7 +22938,7 @@
       <w:pPr>
         <w:pStyle w:val="Ttulo2"/>
       </w:pPr>
-      <w:bookmarkStart w:id="64" w:name="_Toc244210938"/>
+      <w:bookmarkStart w:id="64" w:name="_Toc244254047"/>
       <w:r>
         <w:lastRenderedPageBreak/>
         <w:t>4.3. Desarrollo y evaluación del modelo predictivo</w:t>
@@ -22658,7 +22954,7 @@
       <w:pPr>
         <w:pStyle w:val="Ttulo3"/>
       </w:pPr>
-      <w:bookmarkStart w:id="65" w:name="_Toc244210939"/>
+      <w:bookmarkStart w:id="65" w:name="_Toc244254048"/>
       <w:r>
         <w:rPr>
           <w:sz w:val="24"/>
@@ -22686,7 +22982,7 @@
       <w:pPr>
         <w:pStyle w:val="Ttulo3"/>
       </w:pPr>
-      <w:bookmarkStart w:id="66" w:name="_Toc244210940"/>
+      <w:bookmarkStart w:id="66" w:name="_Toc244254049"/>
       <w:r>
         <w:rPr>
           <w:sz w:val="24"/>
@@ -22712,7 +23008,7 @@
       <w:pPr>
         <w:pStyle w:val="Ttulo3"/>
       </w:pPr>
-      <w:bookmarkStart w:id="67" w:name="_Toc244210941"/>
+      <w:bookmarkStart w:id="67" w:name="_Toc244254050"/>
       <w:r>
         <w:rPr>
           <w:sz w:val="24"/>
@@ -22853,7 +23149,7 @@
       <w:pPr>
         <w:pStyle w:val="Ttulo3"/>
       </w:pPr>
-      <w:bookmarkStart w:id="68" w:name="_Toc244210942"/>
+      <w:bookmarkStart w:id="68" w:name="_Toc244254051"/>
       <w:r>
         <w:rPr>
           <w:sz w:val="24"/>
@@ -22871,7 +23167,7 @@
       <w:pPr>
         <w:pStyle w:val="Ttulo3"/>
       </w:pPr>
-      <w:bookmarkStart w:id="69" w:name="_Toc244210943"/>
+      <w:bookmarkStart w:id="69" w:name="_Toc244254052"/>
       <w:r>
         <w:rPr>
           <w:sz w:val="24"/>
@@ -23590,10 +23886,10 @@
         </w:rPr>
         <w:lastRenderedPageBreak/>
         <w:drawing>
-          <wp:inline distT="0" distB="0" distL="0" distR="0" wp14:anchorId="794B1A6D" wp14:editId="5141C327">
+          <wp:inline distT="0" distB="0" distL="0" distR="0" wp14:anchorId="22A8D0F4" wp14:editId="4164E3ED">
             <wp:extent cx="5577840" cy="2710339"/>
             <wp:effectExtent l="0" t="0" r="0" b="0"/>
-            <wp:docPr id="23" name="Picture 23" descr="Figura 4.6. Estabilidad temporal de los modelos durante la validación y comparación con la prueba final."/>
+            <wp:docPr id="38" name="Picture 38"/>
             <wp:cNvGraphicFramePr>
               <a:graphicFrameLocks xmlns:a="http://schemas.openxmlformats.org/drawingml/2006/main" noChangeAspect="1"/>
             </wp:cNvGraphicFramePr>
@@ -23646,7 +23942,7 @@
       <w:pPr>
         <w:pStyle w:val="Ttulo3"/>
       </w:pPr>
-      <w:bookmarkStart w:id="72" w:name="_Toc244210944"/>
+      <w:bookmarkStart w:id="72" w:name="_Toc244254053"/>
       <w:r>
         <w:rPr>
           <w:sz w:val="24"/>
@@ -24488,10 +24784,10 @@
         </w:rPr>
         <w:lastRenderedPageBreak/>
         <w:drawing>
-          <wp:inline distT="0" distB="0" distL="0" distR="0" wp14:anchorId="1AD25451" wp14:editId="11F960F9">
+          <wp:inline distT="0" distB="0" distL="0" distR="0" wp14:anchorId="5688D948" wp14:editId="5B04855B">
             <wp:extent cx="5212080" cy="3571970"/>
             <wp:effectExtent l="0" t="0" r="0" b="0"/>
-            <wp:docPr id="32" name="Picture 32" descr="Figura 4.7. Predicciones y errores diarios de los seis enfoques en el tramo de prueba."/>
+            <wp:docPr id="39" name="Picture 39"/>
             <wp:cNvGraphicFramePr>
               <a:graphicFrameLocks xmlns:a="http://schemas.openxmlformats.org/drawingml/2006/main" noChangeAspect="1"/>
             </wp:cNvGraphicFramePr>
@@ -24499,7 +24795,7 @@
               <a:graphicData uri="http://schemas.openxmlformats.org/drawingml/2006/picture">
                 <pic:pic xmlns:pic="http://schemas.openxmlformats.org/drawingml/2006/picture">
                   <pic:nvPicPr>
-                    <pic:cNvPr id="0" name="model_predictions_4_3.png"/>
+                    <pic:cNvPr id="0" name="image.png"/>
                     <pic:cNvPicPr/>
                   </pic:nvPicPr>
                   <pic:blipFill>
@@ -24549,7 +24845,7 @@
       <w:pPr>
         <w:pStyle w:val="Ttulo3"/>
       </w:pPr>
-      <w:bookmarkStart w:id="75" w:name="_Toc244210945"/>
+      <w:bookmarkStart w:id="75" w:name="_Toc244254054"/>
       <w:r>
         <w:rPr>
           <w:sz w:val="24"/>
@@ -24583,7 +24879,7 @@
       <w:pPr>
         <w:pStyle w:val="Ttulo3"/>
       </w:pPr>
-      <w:bookmarkStart w:id="76" w:name="_Toc244210946"/>
+      <w:bookmarkStart w:id="76" w:name="_Toc244254055"/>
       <w:r>
         <w:rPr>
           <w:sz w:val="24"/>
@@ -24606,7 +24902,7 @@
       <w:pPr>
         <w:pStyle w:val="Ttulo3"/>
       </w:pPr>
-      <w:bookmarkStart w:id="77" w:name="_Toc244210947"/>
+      <w:bookmarkStart w:id="77" w:name="_Toc244254056"/>
       <w:r>
         <w:rPr>
           <w:sz w:val="24"/>
@@ -24629,7 +24925,7 @@
       <w:pPr>
         <w:pStyle w:val="Ttulo3"/>
       </w:pPr>
-      <w:bookmarkStart w:id="78" w:name="_Toc244210948"/>
+      <w:bookmarkStart w:id="78" w:name="_Toc244254057"/>
       <w:r>
         <w:lastRenderedPageBreak/>
         <w:t>4.3.10. Reentrenamiento con datos de 2026</w:t>
@@ -25304,10 +25600,10 @@
         </w:rPr>
         <w:lastRenderedPageBreak/>
         <w:drawing>
-          <wp:inline distT="0" distB="0" distL="0" distR="0" wp14:anchorId="5DB75AF7" wp14:editId="5E29939D">
+          <wp:inline distT="0" distB="0" distL="0" distR="0" wp14:anchorId="577CEAF8" wp14:editId="6E4F100C">
             <wp:extent cx="4709160" cy="2563347"/>
             <wp:effectExtent l="0" t="0" r="0" b="0"/>
-            <wp:docPr id="33" name="Picture 33" descr="Figura 4.8. Error del modelo elegido en validación temporal y prueba final para seis casos. Fuente: elaboración propia a partir de los CSV SiAR."/>
+            <wp:docPr id="40" name="Picture 40"/>
             <wp:cNvGraphicFramePr>
               <a:graphicFrameLocks xmlns:a="http://schemas.openxmlformats.org/drawingml/2006/main" noChangeAspect="1"/>
             </wp:cNvGraphicFramePr>
@@ -25315,7 +25611,7 @@
               <a:graphicData uri="http://schemas.openxmlformats.org/drawingml/2006/picture">
                 <pic:pic xmlns:pic="http://schemas.openxmlformats.org/drawingml/2006/picture">
                   <pic:nvPicPr>
-                    <pic:cNvPr id="0" name="model_retraining_2026.png"/>
+                    <pic:cNvPr id="0" name="image.png"/>
                     <pic:cNvPicPr/>
                   </pic:nvPicPr>
                   <pic:blipFill>
@@ -25359,7 +25655,7 @@
       <w:pPr>
         <w:pStyle w:val="Ttulo3"/>
       </w:pPr>
-      <w:bookmarkStart w:id="81" w:name="_Toc244210949"/>
+      <w:bookmarkStart w:id="81" w:name="_Toc244254058"/>
       <w:r>
         <w:t>4.3.11. Modelo de ETc para la aplicación</w:t>
       </w:r>
@@ -25972,7 +26268,7 @@
       <w:pPr>
         <w:pStyle w:val="Ttulo3"/>
       </w:pPr>
-      <w:bookmarkStart w:id="83" w:name="_Toc244210950"/>
+      <w:bookmarkStart w:id="83" w:name="_Toc244254059"/>
       <w:r>
         <w:t>4.3.12. Explicabilidad de los modelos de árboles</w:t>
       </w:r>
@@ -26611,10 +26907,10 @@
           <w:noProof/>
         </w:rPr>
         <w:drawing>
-          <wp:inline distT="0" distB="0" distL="0" distR="0" wp14:anchorId="397D5CBD" wp14:editId="195B83AC">
+          <wp:inline distT="0" distB="0" distL="0" distR="0" wp14:anchorId="6A278209" wp14:editId="08B47FD8">
             <wp:extent cx="5832000" cy="4587977"/>
             <wp:effectExtent l="0" t="0" r="0" b="0"/>
-            <wp:docPr id="34" name="Picture 34" descr="Figura 4.9. Importancia global y explicaciones locales de Random Forest y XGBoost mediante TreeSHAP. Fuente: elaboración propia."/>
+            <wp:docPr id="41" name="Picture 41"/>
             <wp:cNvGraphicFramePr>
               <a:graphicFrameLocks xmlns:a="http://schemas.openxmlformats.org/drawingml/2006/main" noChangeAspect="1"/>
             </wp:cNvGraphicFramePr>
@@ -26677,7 +26973,7 @@
       <w:pPr>
         <w:pStyle w:val="Ttulo3"/>
       </w:pPr>
-      <w:bookmarkStart w:id="86" w:name="_Toc244210951"/>
+      <w:bookmarkStart w:id="86" w:name="_Toc244254060"/>
       <w:r>
         <w:t>4.3.13. Predicción multianual de ET0 para siete días operativos</w:t>
       </w:r>
@@ -26690,7 +26986,7 @@
     </w:p>
     <w:p>
       <w:r>
-        <w:t>La validación con origen rodante prueba 2023, 2024 y 2025 entrenando solo con años anteriores. Ridge completo obtuvo menor MAE puntual que la media de siete días en las 81 combinaciones estación–año–horizonte. El bootstrap por bloques produjo 63 intervalos favorables a Ridge y 18 no concluyentes; ninguno favoreció a la referencia. Frente a la persistencia estacional, los 81 intervalos favorecieron a Ridge. Esta referencia suma a la ET0 observada en el origen el cambio climatológico medio entre el día del año de origen y el día objetivo, estimado solo con los años de entrenamiento: ET0(t+h) = ET0(t) + climatología(día t+h) − climatología(día t). En la ablación entre Ridge completo y reducido, 74 intervalos cruzaron cero, dos favorecieron al completo y cinco al reducido; no se atribuye una ganancia estable a las variables meteorológicas auxiliares.</w:t>
+        <w:t>La validación con origen rodante prueba 2023, 2024 y 2025 entrenando solo con años anteriores. Ridge completo obtuvo menor MAE puntual que la media de siete días en las 81 combinaciones estación–año–horizonte. El bootstrap por bloques produjo 63 intervalos favorables a Ridge y 18 no concluyentes; ninguno favoreció a la referencia. Frente a la persistencia estacional, los 81 intervalos favorecieron a Ridge. Esta referencia suma a la ET0 observada en el origen el cambio climatológico medio entre el día del año de origen y el día objetivo, estimado solo con los años de entrenamiento: ET0(t+h) = ET0(t) + climatología(día t+h) − climatología(día t). En la ablación entre Ridge completo y reducido, 74 intervalos cruzaron cero, dos favorecieron al completo y cinco al reducido; no se atribuye una ganancia estable a las variables meteorológicas auxiliares. Los resultados de 2023–2025 intervienen en la aprobación de horizontes; 2025 no es una confirmación independiente de esa decisión. Los artefactos operativos se reajustan con 2021–2025 y su confirmación posterior corresponde al seguimiento prospectivo.</w:t>
       </w:r>
     </w:p>
     <w:p>
@@ -26700,7 +26996,8 @@
     </w:p>
     <w:p>
       <w:r>
-        <w:t>Streamlit genera una ET0 distinta para cada fecha, aplica ET0 × Kc, descuenta la lluvia AEMET utilizable y muestra el método y un intervalo residual central del 80 %. Antes de reunir 30 casos prospectivos consolidados y pareados, Ridge se utiliza de forma provisional. Alcanzado ese umbral, la puerta evalúa como máximo los 60 casos más recientes y mantiene Ridge solo si reduce al menos un 5 % el MAE de la media de siete días; de lo contrario activa automáticamente el respaldo. Una tarea diaria emite h=1–9, conserva el primer valor SiAR provisional, detecta revisiones y consolida tras siete días. El reentrenamiento es anual y está sujeto al mismo control temporal. La aplicación publicada ejecuta desde main el módulo src/dss/app_streamlit.py, que invoca los artefactos Ridge mediante src/dss/predict_et0.py.</w:t>
+        <w:lastRenderedPageBreak/>
+        <w:t>Streamlit genera una ET0 distinta para cada fecha, aplica ET0 × Kc, descuenta la lluvia AEMET utilizable y muestra el método y un rango residual histórico central del 80 %. La puerta prospectiva decide por estación y horizonte: exige al menos 30 fechas objetivo distintas, consolidadas y pareadas, y evalúa hasta las 60 más recientes. Mantiene Ridge solo si reduce al menos un 5 % el MAE de la media de siete días; si no, activa el respaldo para ese grupo. Antes del umbral, su uso es provisional. El agregado global es diagnóstico y no sustituye esta decisión ni constituye una prueba de significación estadística. Una tarea diaria emite h=1–9, conserva valores provisionales y sus revisiones y consolida tras siete días. El reentrenamiento es anual. El selector conserva el respaldo y la abstención hasta el cálculo final de la dosis; no se recomienda con una ET0 de respaldo de más de siete días. La aplicación utiliza src/dss/app_streamlit.py y src/dss/predict_et0.py.</w:t>
       </w:r>
     </w:p>
     <w:p>
@@ -26718,11 +27015,11 @@
         <w:tblLook w:val="04A0" w:firstRow="1" w:lastRow="0" w:firstColumn="1" w:lastColumn="0" w:noHBand="0" w:noVBand="1"/>
       </w:tblPr>
       <w:tblGrid>
-        <w:gridCol w:w="737"/>
+        <w:gridCol w:w="1134"/>
         <w:gridCol w:w="1304"/>
         <w:gridCol w:w="1474"/>
         <w:gridCol w:w="1134"/>
-        <w:gridCol w:w="3175"/>
+        <w:gridCol w:w="2778"/>
       </w:tblGrid>
       <w:tr>
         <w:tc>
@@ -27107,13 +27404,7 @@
               <w:rPr>
                 <w:sz w:val="16"/>
               </w:rPr>
-              <w:t xml:space="preserve">6 favorables; 3 no </w:t>
-            </w:r>
-            <w:r>
-              <w:rPr>
-                <w:sz w:val="16"/>
-              </w:rPr>
-              <w:t>concluyentes</w:t>
+              <w:t>6 favorables; 3 no concluyentes</w:t>
             </w:r>
           </w:p>
         </w:tc>
@@ -28015,7 +28306,7 @@
         <w:pageBreakBefore/>
       </w:pPr>
       <w:bookmarkStart w:id="87" w:name="_Toc243495226"/>
-      <w:bookmarkStart w:id="88" w:name="_Toc244210952"/>
+      <w:bookmarkStart w:id="88" w:name="_Toc244254061"/>
       <w:r>
         <w:lastRenderedPageBreak/>
         <w:t>5. Sistema de recomendación y resultados</w:t>
@@ -28032,7 +28323,7 @@
       <w:pPr>
         <w:pStyle w:val="Ttulo2"/>
       </w:pPr>
-      <w:bookmarkStart w:id="89" w:name="_Toc244210953"/>
+      <w:bookmarkStart w:id="89" w:name="_Toc244254062"/>
       <w:r>
         <w:t>5.1. Diseño del sistema de recomendación de riego</w:t>
       </w:r>
@@ -28052,7 +28343,7 @@
       <w:pPr>
         <w:pStyle w:val="Ttulo3"/>
       </w:pPr>
-      <w:bookmarkStart w:id="90" w:name="_Toc244210954"/>
+      <w:bookmarkStart w:id="90" w:name="_Toc244254063"/>
       <w:r>
         <w:rPr>
           <w:sz w:val="24"/>
@@ -28079,7 +28370,7 @@
       <w:pPr>
         <w:pStyle w:val="Ttulo3"/>
       </w:pPr>
-      <w:bookmarkStart w:id="91" w:name="_Toc244210955"/>
+      <w:bookmarkStart w:id="91" w:name="_Toc244254064"/>
       <w:r>
         <w:rPr>
           <w:sz w:val="24"/>
@@ -28164,7 +28455,7 @@
       <w:pPr>
         <w:pStyle w:val="Ttulo3"/>
       </w:pPr>
-      <w:bookmarkStart w:id="93" w:name="_Toc244210956"/>
+      <w:bookmarkStart w:id="93" w:name="_Toc244254065"/>
       <w:r>
         <w:rPr>
           <w:sz w:val="24"/>
@@ -28213,7 +28504,7 @@
       <w:pPr>
         <w:pStyle w:val="Ttulo3"/>
       </w:pPr>
-      <w:bookmarkStart w:id="94" w:name="_Toc244210957"/>
+      <w:bookmarkStart w:id="94" w:name="_Toc244254066"/>
       <w:r>
         <w:rPr>
           <w:sz w:val="24"/>
@@ -29097,7 +29388,7 @@
       <w:pPr>
         <w:pStyle w:val="Ttulo3"/>
       </w:pPr>
-      <w:bookmarkStart w:id="96" w:name="_Toc244210958"/>
+      <w:bookmarkStart w:id="96" w:name="_Toc244254067"/>
       <w:r>
         <w:rPr>
           <w:sz w:val="24"/>
@@ -29120,7 +29411,7 @@
       <w:pPr>
         <w:pStyle w:val="Ttulo3"/>
       </w:pPr>
-      <w:bookmarkStart w:id="97" w:name="_Toc244210959"/>
+      <w:bookmarkStart w:id="97" w:name="_Toc244254068"/>
       <w:r>
         <w:rPr>
           <w:sz w:val="24"/>
@@ -29139,7 +29430,7 @@
       <w:pPr>
         <w:pStyle w:val="Ttulo3"/>
       </w:pPr>
-      <w:bookmarkStart w:id="98" w:name="_Toc244210960"/>
+      <w:bookmarkStart w:id="98" w:name="_Toc244254069"/>
       <w:r>
         <w:t>5.1.7. Integración operativa de ETc y AEMET</w:t>
       </w:r>
@@ -29164,7 +29455,7 @@
       <w:pPr>
         <w:pStyle w:val="Ttulo2"/>
       </w:pPr>
-      <w:bookmarkStart w:id="99" w:name="_Toc244210961"/>
+      <w:bookmarkStart w:id="99" w:name="_Toc244254070"/>
       <w:r>
         <w:t>5.2. Aplicación y visualización de resultados</w:t>
       </w:r>
@@ -29179,7 +29470,7 @@
       <w:pPr>
         <w:pStyle w:val="Ttulo3"/>
       </w:pPr>
-      <w:bookmarkStart w:id="100" w:name="_Toc244210962"/>
+      <w:bookmarkStart w:id="100" w:name="_Toc244254071"/>
       <w:r>
         <w:rPr>
           <w:sz w:val="24"/>
@@ -29206,7 +29497,7 @@
       <w:pPr>
         <w:pStyle w:val="Ttulo3"/>
       </w:pPr>
-      <w:bookmarkStart w:id="101" w:name="_Toc244210963"/>
+      <w:bookmarkStart w:id="101" w:name="_Toc244254072"/>
       <w:r>
         <w:rPr>
           <w:sz w:val="24"/>
@@ -29234,7 +29525,7 @@
       <w:pPr>
         <w:pStyle w:val="Ttulo3"/>
       </w:pPr>
-      <w:bookmarkStart w:id="102" w:name="_Toc244210964"/>
+      <w:bookmarkStart w:id="102" w:name="_Toc244254073"/>
       <w:r>
         <w:rPr>
           <w:sz w:val="24"/>
@@ -31181,7 +31472,7 @@
       <w:pPr>
         <w:pStyle w:val="Ttulo3"/>
       </w:pPr>
-      <w:bookmarkStart w:id="105" w:name="_Toc244210965"/>
+      <w:bookmarkStart w:id="105" w:name="_Toc244254074"/>
       <w:r>
         <w:rPr>
           <w:sz w:val="24"/>
@@ -31208,7 +31499,7 @@
       <w:pPr>
         <w:pStyle w:val="Ttulo3"/>
       </w:pPr>
-      <w:bookmarkStart w:id="106" w:name="_Toc244210966"/>
+      <w:bookmarkStart w:id="106" w:name="_Toc244254075"/>
       <w:r>
         <w:rPr>
           <w:sz w:val="24"/>
@@ -31226,7 +31517,7 @@
       <w:pPr>
         <w:pStyle w:val="Ttulo3"/>
       </w:pPr>
-      <w:bookmarkStart w:id="107" w:name="_Toc244210967"/>
+      <w:bookmarkStart w:id="107" w:name="_Toc244254076"/>
       <w:r>
         <w:rPr>
           <w:sz w:val="24"/>
@@ -31244,7 +31535,7 @@
       <w:pPr>
         <w:pStyle w:val="Ttulo2"/>
       </w:pPr>
-      <w:bookmarkStart w:id="108" w:name="_Toc244210968"/>
+      <w:bookmarkStart w:id="108" w:name="_Toc244254077"/>
       <w:r>
         <w:t>5.3. Validación, resultados y análisis crítico</w:t>
       </w:r>
@@ -31264,7 +31555,7 @@
       <w:pPr>
         <w:pStyle w:val="Ttulo3"/>
       </w:pPr>
-      <w:bookmarkStart w:id="109" w:name="_Toc244210969"/>
+      <w:bookmarkStart w:id="109" w:name="_Toc244254078"/>
       <w:r>
         <w:rPr>
           <w:sz w:val="24"/>
@@ -31288,7 +31579,7 @@
       <w:pPr>
         <w:pStyle w:val="Ttulo3"/>
       </w:pPr>
-      <w:bookmarkStart w:id="110" w:name="_Toc244210970"/>
+      <w:bookmarkStart w:id="110" w:name="_Toc244254079"/>
       <w:r>
         <w:rPr>
           <w:sz w:val="24"/>
@@ -31299,7 +31590,7 @@
     </w:p>
     <w:p>
       <w:r>
-        <w:t>La vía por defecto del sistema promedia la ET0 de los días anteriores. Antes de fijar la longitud de esa ventana se evaluaron cinco alternativas, de uno a catorce días, simulando emisiones diarias con horizontes de uno a siete días. Se reutilizó el tramo del 8 al 30 de septiembre para la evaluación, aunque la ventana se seleccionó únicamente con el periodo de desarrollo. Estas fechas ya habían sido consultadas en el capítulo 4 y no constituyen una segunda prueba independiente. Como criterio se fijó, antes de calcular los resultados, elegir la ventana más corta cuyo error no superase al mínimo en más de un 1 %, porque una ventana corta reacciona antes ante un cambio de tiempo.</w:t>
+        <w:t>La vía histórica promedia la ET0 de los días anteriores. Se compararon cinco ventanas con horizontes de uno a siete días. La prueba abarca del 8 al 30 de septiembre; para seleccionar ventana se excluyeron todos los objetivos desde el 8 de septiembre, incluso si la emisión era anterior. Estas fechas ya se habían consultado en el capítulo 4 y no constituyen una segunda prueba independiente. Se elige la ventana más corta cuyo MAE de desarrollo no supere al mínimo en más de un 1 %.</w:t>
       </w:r>
     </w:p>
     <w:p>
@@ -31460,7 +31751,7 @@
               <w:rPr>
                 <w:sz w:val="18"/>
               </w:rPr>
-              <w:t>0,517</w:t>
+              <w:t>0,525</w:t>
             </w:r>
           </w:p>
         </w:tc>
@@ -31533,7 +31824,7 @@
               <w:rPr>
                 <w:sz w:val="18"/>
               </w:rPr>
-              <w:t>0,494</w:t>
+              <w:t>0,503</w:t>
             </w:r>
           </w:p>
         </w:tc>
@@ -31605,7 +31896,7 @@
               <w:rPr>
                 <w:sz w:val="18"/>
               </w:rPr>
-              <w:t>0,484</w:t>
+              <w:t>0,493</w:t>
             </w:r>
           </w:p>
         </w:tc>
@@ -31679,7 +31970,7 @@
                 <w:b/>
                 <w:sz w:val="18"/>
               </w:rPr>
-              <w:t>0,471</w:t>
+              <w:t>0,480</w:t>
             </w:r>
           </w:p>
         </w:tc>
@@ -31752,7 +32043,7 @@
               <w:rPr>
                 <w:sz w:val="18"/>
               </w:rPr>
-              <w:t>0,469</w:t>
+              <w:t>0,478</w:t>
             </w:r>
           </w:p>
         </w:tc>
@@ -31788,15 +32079,18 @@
     </w:p>
     <w:p>
       <w:r>
+        <w:t xml:space="preserve">Las ventanas de siete y catorce días son prácticamente equivalentes en desarrollo, con una diferencia de 0,002 mm, y el criterio selecciona la de siete. En la prueba esa elección resulta favorable, aunque no se utilizó para decidir. La tabla muestra también que las ventanas de uno y </w:t>
+      </w:r>
+      <w:r>
         <w:lastRenderedPageBreak/>
-        <w:t>Las ventanas de siete y catorce días son prácticamente equivalentes en desarrollo, con una diferencia de 0,002 mm, y el criterio selecciona la de siete. En la prueba esa elección resulta favorable, aunque no se utilizó para decidir. La tabla muestra también que las ventanas de uno y tres días son claramente peores: la ET0 de un día aislado incorpora demasiado ruido para representar la demanda de los días siguientes.</w:t>
+        <w:t>tres días son claramente peores: la ET0 de un día aislado incorpora demasiado ruido para representar la demanda de los días siguientes.</w:t>
       </w:r>
     </w:p>
     <w:p>
       <w:pPr>
         <w:pStyle w:val="Ttulo3"/>
       </w:pPr>
-      <w:bookmarkStart w:id="112" w:name="_Toc244210971"/>
+      <w:bookmarkStart w:id="112" w:name="_Toc244254080"/>
       <w:r>
         <w:rPr>
           <w:sz w:val="24"/>
@@ -32604,10 +32898,10 @@
         </w:rPr>
         <w:lastRenderedPageBreak/>
         <w:drawing>
-          <wp:inline distT="0" distB="0" distL="0" distR="0" wp14:anchorId="59C99304" wp14:editId="2519D3B3">
+          <wp:inline distT="0" distB="0" distL="0" distR="0" wp14:anchorId="0F993C84" wp14:editId="04B34C87">
             <wp:extent cx="5577840" cy="3442602"/>
             <wp:effectExtent l="0" t="0" r="0" b="0"/>
-            <wp:docPr id="27" name="Picture 27" descr="Figura 5.3. Recomendaciones emitidas cada día con la información del día anterior y error frente a la referencia SiAR."/>
+            <wp:docPr id="42" name="Picture 42"/>
             <wp:cNvGraphicFramePr>
               <a:graphicFrameLocks xmlns:a="http://schemas.openxmlformats.org/drawingml/2006/main" noChangeAspect="1"/>
             </wp:cNvGraphicFramePr>
@@ -32615,7 +32909,7 @@
               <a:graphicData uri="http://schemas.openxmlformats.org/drawingml/2006/picture">
                 <pic:pic xmlns:pic="http://schemas.openxmlformats.org/drawingml/2006/picture">
                   <pic:nvPicPr>
-                    <pic:cNvPr id="0" name="image.png"/>
+                    <pic:cNvPr id="0" name="dss_campana_5_3.png"/>
                     <pic:cNvPicPr/>
                   </pic:nvPicPr>
                   <pic:blipFill>
@@ -32663,7 +32957,7 @@
     </w:p>
     <w:p>
       <w:r>
-        <w:t>El sesgo del sistema es ligeramente positivo, de 0,04 a 0,05 mm al día. Tiende por tanto a recomendar algo más de agua que la referencia, sobre todo en septiembre, cuando la ET0 desciende de forma sostenida y la media de los siete días anteriores queda siempre por encima del valor del día. En una herramienta de apoyo al riego un sesgo pequeño y positivo es preferible a uno negativo, porque el déficit hídrico tiene consecuencias más difíciles de revertir que un ligero exceso. Aun así, a lo largo de la campaña ese sesgo se traduce en 535,2 mm recomendados frente a 528,7 mm de referencia en los mismos días, un 1,2 % más, y esta cifra debe tenerse presente si el sistema se utiliza para planificar volúmenes.</w:t>
+        <w:t>El sesgo del sistema es ligeramente positivo, de 0,04 a 0,05 mm al día. En septiembre la ET0 desciende y la media reciente tiende a superar el valor del día. En la campaña se recomiendan 535,2 mm frente a 528,7 mm de referencia en los mismos días, un 1,2 % más. La conveniencia de ese exceso depende del cultivo, la fase y las condiciones del suelo y no se ha evaluado en este trabajo; no debe interpretarse como una ventaja agronómica validada.</w:t>
       </w:r>
     </w:p>
     <w:p>
@@ -32675,7 +32969,7 @@
       <w:pPr>
         <w:pStyle w:val="Ttulo3"/>
       </w:pPr>
-      <w:bookmarkStart w:id="115" w:name="_Toc244210972"/>
+      <w:bookmarkStart w:id="115" w:name="_Toc244254081"/>
       <w:r>
         <w:rPr>
           <w:sz w:val="24"/>
@@ -32700,10 +32994,10 @@
           <w:noProof/>
         </w:rPr>
         <w:drawing>
-          <wp:inline distT="0" distB="0" distL="0" distR="0" wp14:anchorId="6ADB4C4C" wp14:editId="7A0AEA61">
+          <wp:inline distT="0" distB="0" distL="0" distR="0" wp14:anchorId="6D8B8FD6" wp14:editId="1E19F8CF">
             <wp:extent cx="5577840" cy="1981650"/>
             <wp:effectExtent l="0" t="0" r="0" b="0"/>
-            <wp:docPr id="28" name="Picture 28" descr="Figura 5.4. MAE diario según el día del horizonte en los periodos de desarrollo y prueba."/>
+            <wp:docPr id="43" name="Picture 43"/>
             <wp:cNvGraphicFramePr>
               <a:graphicFrameLocks xmlns:a="http://schemas.openxmlformats.org/drawingml/2006/main" noChangeAspect="1"/>
             </wp:cNvGraphicFramePr>
@@ -32711,7 +33005,7 @@
               <a:graphicData uri="http://schemas.openxmlformats.org/drawingml/2006/picture">
                 <pic:pic xmlns:pic="http://schemas.openxmlformats.org/drawingml/2006/picture">
                   <pic:nvPicPr>
-                    <pic:cNvPr id="0" name="image.png"/>
+                    <pic:cNvPr id="0" name="dss_horizonte_5_3.png"/>
                     <pic:cNvPicPr/>
                   </pic:nvPicPr>
                   <pic:blipFill>
@@ -33784,7 +34078,7 @@
       <w:pPr>
         <w:pStyle w:val="Ttulo3"/>
       </w:pPr>
-      <w:bookmarkStart w:id="118" w:name="_Toc244210973"/>
+      <w:bookmarkStart w:id="118" w:name="_Toc244254082"/>
       <w:r>
         <w:rPr>
           <w:sz w:val="24"/>
@@ -33809,10 +34103,10 @@
         </w:rPr>
         <w:lastRenderedPageBreak/>
         <w:drawing>
-          <wp:inline distT="0" distB="0" distL="0" distR="0" wp14:anchorId="0FCE854D" wp14:editId="00DC8A68">
+          <wp:inline distT="0" distB="0" distL="0" distR="0" wp14:anchorId="656ADE9C" wp14:editId="4FEAF677">
             <wp:extent cx="5577840" cy="1981650"/>
             <wp:effectExtent l="0" t="0" r="0" b="0"/>
-            <wp:docPr id="29" name="Picture 29" descr="Figura 5.5. Necesidad neta semanal planificada por el DSS frente a la referencia SiAR y dosis bruta para riego por goteo."/>
+            <wp:docPr id="44" name="Picture 44"/>
             <wp:cNvGraphicFramePr>
               <a:graphicFrameLocks xmlns:a="http://schemas.openxmlformats.org/drawingml/2006/main" noChangeAspect="1"/>
             </wp:cNvGraphicFramePr>
@@ -33820,7 +34114,7 @@
               <a:graphicData uri="http://schemas.openxmlformats.org/drawingml/2006/picture">
                 <pic:pic xmlns:pic="http://schemas.openxmlformats.org/drawingml/2006/picture">
                   <pic:nvPicPr>
-                    <pic:cNvPr id="0" name="image.png"/>
+                    <pic:cNvPr id="0" name="dss_semanal_5_3.png"/>
                     <pic:cNvPicPr/>
                   </pic:nvPicPr>
                   <pic:blipFill>
@@ -33875,7 +34169,7 @@
       <w:pPr>
         <w:pStyle w:val="Ttulo3"/>
       </w:pPr>
-      <w:bookmarkStart w:id="120" w:name="_Toc244210974"/>
+      <w:bookmarkStart w:id="120" w:name="_Toc244254083"/>
       <w:r>
         <w:rPr>
           <w:sz w:val="24"/>
@@ -34336,7 +34630,7 @@
       <w:pPr>
         <w:pStyle w:val="Ttulo3"/>
       </w:pPr>
-      <w:bookmarkStart w:id="122" w:name="_Toc244210975"/>
+      <w:bookmarkStart w:id="122" w:name="_Toc244254084"/>
       <w:r>
         <w:rPr>
           <w:sz w:val="24"/>
@@ -35427,7 +35721,7 @@
       <w:pPr>
         <w:pStyle w:val="Ttulo3"/>
       </w:pPr>
-      <w:bookmarkStart w:id="124" w:name="_Toc244210976"/>
+      <w:bookmarkStart w:id="124" w:name="_Toc244254085"/>
       <w:r>
         <w:rPr>
           <w:sz w:val="24"/>
@@ -35438,14 +35732,14 @@
     </w:p>
     <w:p>
       <w:r>
-        <w:t>Una recomendación de siete días se genera en el entorno de desarrollo en un tiempo de entre 10 y 25 ms, según la ejecución, y la simulación de la campaña completa, con 152 emisiones, tarda alrededor de un segundo. Los valores exactos de cada ejecución se guardan en el informe de validación. Estos tiempos son irrelevantes para el uso previsto y confirman que, con el volumen del piloto, no es necesario recurrir a procesamiento distribuido. El tiempo de respuesta percibido en la aplicación depende sobre todo del dibujo de la interfaz y no del cálculo.</w:t>
+        <w:t>Los tiempos se registran en cada ejecución del informe de validación y dependen del entorno. En la comprobación de cierre, el cálculo local de siete días se situó en decenas de milisegundos y la simulación completa en torno a uno o dos segundos. No incluyen consultas de red ni renderizado de Streamlit, por lo que no representan la latencia percibida por el usuario. Con el volumen del piloto no justifican procesamiento distribuido.</w:t>
       </w:r>
     </w:p>
     <w:p>
       <w:pPr>
         <w:pStyle w:val="Ttulo3"/>
       </w:pPr>
-      <w:bookmarkStart w:id="125" w:name="_Toc244210977"/>
+      <w:bookmarkStart w:id="125" w:name="_Toc244254086"/>
       <w:r>
         <w:rPr>
           <w:sz w:val="24"/>
@@ -35456,11 +35750,11 @@
     </w:p>
     <w:p>
       <w:r>
-        <w:t xml:space="preserve">El capítulo 5 aporta una evaluación retrospectiva del motor físico ET0 reciente × Kc frente a persistencia. Esa prueba permite medir las reglas agronómicas y los cambios de fase con datos cerrados, pero no evalúa la vía Ridge multianual que utiliza la aplicación operativa. En producción, </w:t>
+        <w:t xml:space="preserve">El capítulo 5 aporta una evaluación retrospectiva del motor físico ET0 reciente × Kc frente a persistencia. Esa prueba permite medir las reglas agronómicas y los cambios de fase con datos cerrados, pero no evalúa la vía Ridge multianual que utiliza la aplicación operativa. En producción, el orden de decisión descrito en 5.1.3 es distinto: Ridge ET0 por horizonte es la vía preferente </w:t>
       </w:r>
       <w:r>
         <w:lastRenderedPageBreak/>
-        <w:t>el orden de decisión descrito en 5.1.3 es distinto: Ridge ET0 por horizonte es la vía preferente provisional; la media de siete días actúa como respaldo cuando faltan ventanas completas o cuando la puerta prospectiva no acredita una mejora mínima del 5 %. Por tanto, el buen resultado retrospectivo del cálculo físico justifica el respaldo y no debe interpretarse como una comparación extremo a extremo de Ridge en h=2…8.</w:t>
+        <w:t>provisional; la media de siete días actúa como respaldo cuando faltan ventanas completas o cuando la puerta prospectiva no acredita una mejora mínima del 5 %. Por tanto, el buen resultado retrospectivo del cálculo físico justifica el respaldo y no debe interpretarse como una comparación extremo a extremo de Ridge en h=2…8.</w:t>
       </w:r>
     </w:p>
     <w:p>
@@ -35478,7 +35772,7 @@
         <w:pStyle w:val="Ttulo3"/>
         <w:keepNext w:val="0"/>
       </w:pPr>
-      <w:bookmarkStart w:id="126" w:name="_Toc244210978"/>
+      <w:bookmarkStart w:id="126" w:name="_Toc244254087"/>
       <w:r>
         <w:t>5.3.10. Comprobación cronológica en otros cultivos y regiones</w:t>
       </w:r>
@@ -35926,7 +36220,7 @@
       <w:pPr>
         <w:pStyle w:val="Ttulo3"/>
       </w:pPr>
-      <w:bookmarkStart w:id="127" w:name="_Toc244210979"/>
+      <w:bookmarkStart w:id="127" w:name="_Toc244254088"/>
       <w:r>
         <w:t>5.3.11. Reproducibilidad y evidencias</w:t>
       </w:r>
@@ -35942,7 +36236,7 @@
         <w:pStyle w:val="Ttulo1"/>
         <w:pageBreakBefore/>
       </w:pPr>
-      <w:bookmarkStart w:id="128" w:name="_Toc244210980"/>
+      <w:bookmarkStart w:id="128" w:name="_Toc244254089"/>
       <w:r>
         <w:lastRenderedPageBreak/>
         <w:t>6. Conclusiones</w:t>
@@ -35953,7 +36247,7 @@
       <w:pPr>
         <w:pStyle w:val="Ttulo2"/>
       </w:pPr>
-      <w:bookmarkStart w:id="129" w:name="_Toc244210981"/>
+      <w:bookmarkStart w:id="129" w:name="_Toc244254090"/>
       <w:r>
         <w:t>6.1. Cumplimiento de objetivos y aportaciones</w:t>
       </w:r>
@@ -35963,7 +36257,7 @@
       <w:pPr>
         <w:pStyle w:val="Ttulo3"/>
       </w:pPr>
-      <w:bookmarkStart w:id="130" w:name="_Toc244210982"/>
+      <w:bookmarkStart w:id="130" w:name="_Toc244254091"/>
       <w:r>
         <w:rPr>
           <w:sz w:val="24"/>
@@ -36581,7 +36875,7 @@
           </w:tcPr>
           <w:p>
             <w:r>
-              <w:t>Apartado 5.3; validación, 13 escenarios y 150 pruebas</w:t>
+              <w:t>Apartado 5.3; validación, 13 escenarios y 159 pruebas</w:t>
             </w:r>
           </w:p>
         </w:tc>
@@ -36635,7 +36929,7 @@
       <w:pPr>
         <w:pStyle w:val="Ttulo3"/>
       </w:pPr>
-      <w:bookmarkStart w:id="132" w:name="_Toc244210983"/>
+      <w:bookmarkStart w:id="132" w:name="_Toc244254092"/>
       <w:r>
         <w:rPr>
           <w:sz w:val="24"/>
@@ -36662,14 +36956,14 @@
     </w:p>
     <w:p>
       <w:r>
-        <w:t>La cuarta aportación es la reproducibilidad. El repositorio conserva los CSV acotados, los históricos multianuales, las métricas por estación, año y horizonte, los 27 artefactos Ridge, el motor y la aplicación pública. Los módulos de entrenamiento, evaluación con origen rodante, bootstrap por bloques, cobertura operativa y seguimiento prospectivo se ejecutan desde main. La suite final de 150 pruebas verifica calidad, orden temporal, ventanas completas, horizontes, integridad de artefactos y activación del respaldo.</w:t>
+        <w:t>La cuarta aportación es la reproducibilidad. El repositorio conserva los CSV acotados, los históricos multianuales, las métricas por estación, año y horizonte, los 27 artefactos Ridge, el motor y la aplicación pública. Los módulos de entrenamiento, evaluación con origen rodante, bootstrap por bloques, cobertura operativa y seguimiento prospectivo se ejecutan desde main. La suite final de 159 pruebas verifica calidad, orden temporal, ventanas completas, horizontes, integridad de artefactos y activación del respaldo.</w:t>
       </w:r>
     </w:p>
     <w:p>
       <w:pPr>
         <w:pStyle w:val="Ttulo2"/>
       </w:pPr>
-      <w:bookmarkStart w:id="133" w:name="_Toc244210984"/>
+      <w:bookmarkStart w:id="133" w:name="_Toc244254093"/>
       <w:r>
         <w:t>6.2. Limitaciones e impacto del proyecto</w:t>
       </w:r>
@@ -36679,7 +36973,7 @@
       <w:pPr>
         <w:pStyle w:val="Ttulo3"/>
       </w:pPr>
-      <w:bookmarkStart w:id="134" w:name="_Toc244210985"/>
+      <w:bookmarkStart w:id="134" w:name="_Toc244254094"/>
       <w:r>
         <w:rPr>
           <w:sz w:val="24"/>
@@ -36896,6 +37190,7 @@
           </w:tcPr>
           <w:p>
             <w:r>
+              <w:lastRenderedPageBreak/>
               <w:t>Dependencia estructural entre referencia y vía física</w:t>
             </w:r>
           </w:p>
@@ -36954,7 +37249,6 @@
           </w:tcPr>
           <w:p>
             <w:r>
-              <w:lastRenderedPageBreak/>
               <w:t>Tres casos adicionales de una sola campaña</w:t>
             </w:r>
           </w:p>
@@ -37030,7 +37324,10 @@
           </w:tcPr>
           <w:p>
             <w:r>
-              <w:t>Que la mejora retrospectiva se mantenga en todas las estaciones y horizontes</w:t>
+              <w:t xml:space="preserve">Que la mejora </w:t>
+            </w:r>
+            <w:r>
+              <w:t>retrospectiva se mantenga en todas las estaciones y horizontes</w:t>
             </w:r>
           </w:p>
         </w:tc>
@@ -37266,7 +37563,7 @@
       <w:pPr>
         <w:pStyle w:val="Ttulo3"/>
       </w:pPr>
-      <w:bookmarkStart w:id="136" w:name="_Toc244210986"/>
+      <w:bookmarkStart w:id="136" w:name="_Toc244254095"/>
       <w:r>
         <w:rPr>
           <w:sz w:val="24"/>
@@ -37282,12 +37579,15 @@
     </w:p>
     <w:p>
       <w:r>
-        <w:t>El primero es una capacidad funcional comprobada. El sistema transforma datos públicos y gratuitos en una dosis diaria y semanal expresada en milímetros y en metros cúbicos por parcela, acompañada de su explicación y sin necesidad de sensores. Su valor práctico se concentra en los cambios de fase. En la semana analizada en el apartado 5.2.3, la persistencia habría planificado 6,77 mm menos de los que necesitó el cultivo, un 18 % de la referencia, justo al entrar en una fase de mayor demanda; el sistema se desvió un 4,9 %. Es el tipo de error que un calendario fijo o la repetición de la última dosis no ponen de manifiesto y que podría producir un déficit si se aplicara sin otros controles; el ejemplo retrospectivo no demuestra que ocurriera en una parcela.</w:t>
-      </w:r>
-    </w:p>
-    <w:p>
+        <w:t xml:space="preserve">El primero es una capacidad funcional comprobada. El sistema transforma datos públicos y gratuitos en una dosis diaria y semanal expresada en milímetros y en metros cúbicos por parcela, acompañada de su explicación y sin necesidad de sensores. Su valor práctico se concentra en los </w:t>
+      </w:r>
       <w:r>
         <w:lastRenderedPageBreak/>
+        <w:t>cambios de fase. En la semana analizada en el apartado 5.2.3, la persistencia habría planificado 6,77 mm menos de los que necesitó el cultivo, un 18 % de la referencia, justo al entrar en una fase de mayor demanda; el sistema se desvió un 4,9 %. Es el tipo de error que un calendario fijo o la repetición de la última dosis no ponen de manifiesto y que podría producir un déficit si se aplicara sin otros controles; el ejemplo retrospectivo no demuestra que ocurriera en una parcela.</w:t>
+      </w:r>
+    </w:p>
+    <w:p>
+      <w:r>
         <w:t>El segundo es un hallazgo que reordena las prioridades de mejora. El análisis de sensibilidad mostró que un error de diez puntos en la eficiencia de la instalación produce una desviación de alrededor del 12 % en la dosis bruta, muy superior al error de estimación de la necesidad neta medido en este trabajo. Para una explotación, caracterizar la eficiencia y la uniformidad de su instalación aportaría más precisión que refinar el modelo de ET0 (Burt et al., 1997). La observación es pertinente también para las políticas de digitalización del regadío (Real Decreto 854/2022, 2022): una herramienta digital solo convierte su precisión en ahorro si conoce la instalación sobre la que se aplica.</w:t>
       </w:r>
     </w:p>
@@ -37302,10 +37602,15 @@
       </w:r>
     </w:p>
     <w:p>
+      <w:r>
+        <w:t>Para valorar la adopción, el primer usuario propuesto es el técnico de una cooperativa que prepara recomendaciones para varias explotaciones. Un piloto debe comparar el tiempo de preparación con el proceso habitual, el porcentaje de consultas calculables, la comprensión de dosis y avisos y el coste mensual de operación y mantenimiento. El balance económico se estimaría como horas ahorradas por coste horario menos costes del servicio. Sin mediciones de uso y riego aplicado, tanto ese balance como cualquier ahorro de agua siguen siendo hipótesis.</w:t>
+      </w:r>
+    </w:p>
+    <w:p>
       <w:pPr>
         <w:pStyle w:val="Ttulo2"/>
       </w:pPr>
-      <w:bookmarkStart w:id="137" w:name="_Toc244210987"/>
+      <w:bookmarkStart w:id="137" w:name="_Toc244254096"/>
       <w:r>
         <w:t>6.3. Mejoras y líneas futuras</w:t>
       </w:r>
@@ -37313,14 +37618,18 @@
     </w:p>
     <w:p>
       <w:r>
-        <w:t>Las líneas de mejora se presentan en el orden en que deberían abordarse, porque cada una condiciona la validez de la siguiente. No tendría sentido, por ejemplo, entrenar modelos más complejos antes de ampliar los datos, ni medir ahorros antes de disponer de registros de riego. Este orden es coherente con la conclusión del apartado 4.3: la principal limitación del proyecto es la cobertura de los datos, no la falta de algoritmos.</w:t>
+        <w:t xml:space="preserve">Las líneas de mejora se presentan en el orden en que deberían abordarse, porque cada una condiciona la validez de la siguiente. No tendría sentido, por ejemplo, entrenar modelos más complejos antes de ampliar los datos, ni medir ahorros antes de disponer de registros de riego. </w:t>
+      </w:r>
+      <w:r>
+        <w:lastRenderedPageBreak/>
+        <w:t>Este orden es coherente con la conclusión del apartado 4.3: la principal limitación del proyecto es la cobertura de los datos, no la falta de algoritmos.</w:t>
       </w:r>
     </w:p>
     <w:p>
       <w:pPr>
         <w:pStyle w:val="Ttulo3"/>
       </w:pPr>
-      <w:bookmarkStart w:id="138" w:name="_Toc244210988"/>
+      <w:bookmarkStart w:id="138" w:name="_Toc244254097"/>
       <w:r>
         <w:rPr>
           <w:sz w:val="24"/>
@@ -37338,45 +37647,44 @@
       <w:pPr>
         <w:pStyle w:val="Ttulo3"/>
       </w:pPr>
-      <w:bookmarkStart w:id="139" w:name="_Toc244210989"/>
+      <w:bookmarkStart w:id="139" w:name="_Toc244254098"/>
       <w:r>
         <w:rPr>
           <w:sz w:val="24"/>
         </w:rPr>
+        <w:t>6.3.2. Mejora del motor de recomendación</w:t>
+      </w:r>
+      <w:bookmarkEnd w:id="139"/>
+    </w:p>
+    <w:p>
+      <w:r>
+        <w:t>La prioridad principal para la siguiente iteración es incorporar un balance hídrico real de la parcela. La instrumentación podría combinar sondas capacitivas FDR o TDR para contenido volumétrico y tensiómetros para potencial matricial, instalados a varias profundidades representativas de la zona radicular. Como configuración inicial se propone un registro frecuente y una agregación horaria; Sui (2017) documenta un caso con lectura cada minuto, promedio horario y sensores a tres profundidades. La frecuencia definitiva deberá ajustarse al suelo, cultivo y sistema de riego. La tubería de datos controlaría rango físico, valores ausentes, deriva, conectividad y calibración específica del suelo antes de alimentar el DSS. Junto con capacidad de retención, profundidad radicular, precipitación efectiva y riego realmente aplicado, estas entradas permitirían estimar el agotamiento admisible de FAO-56, decidir no solo cuánto sino cuándo regar y aprovechar la lluvia almacenada (Allen et al., 1998). La telemetría no sustituye la caracterización agronómica ni prueba que una dosis recomendada se haya ejecutado. Cualquier mejora deberá validarse en campo; después podría estudiarse un riego deficitario que concentre el déficit en fases menos sensibles (Fereres &amp; Soriano, 2007).</w:t>
+      </w:r>
+    </w:p>
+    <w:p>
+      <w:r>
+        <w:t>Como complemento espacial, podría evaluarse la teledetección de Copernicus Sentinel-2 para estimar índices de vegetación como NDVI y observar diferencias de vigor dentro de la parcela (Drusch et al., 2012). Estos índices no sustituirían automáticamente el Kc de calendario. Servirían para investigar un Kc dinámico por cultivo y parcela, calibrado frente a sensores, observaciones de campo y ETc de referencia. La nubosidad, la frecuencia de adquisición y la resolución disponible deberían tratarse como fuentes de ausencia e incertidumbre, de modo que el sistema mantuviera la vía agronómica cuando la imagen no fuese representativa.</w:t>
+      </w:r>
+    </w:p>
+    <w:p>
+      <w:r>
+        <w:t xml:space="preserve">La segunda prioridad es validar prospectivamente Ridge h=1–9, ampliar la cobertura de Z06 y vigilar la deriva. La puerta prospectiva decide por estación y horizonte: exige al menos 30 fechas objetivo distintas, consolidadas y pareadas, y evalúa hasta las 60 más recientes. Mantiene Ridge solo si reduce al menos un 5 % el MAE de la media de siete días; si no, activa el respaldo para </w:t>
+      </w:r>
+      <w:r>
         <w:lastRenderedPageBreak/>
-        <w:t>6.3.2. Mejora del motor de recomendación</w:t>
-      </w:r>
-      <w:bookmarkEnd w:id="139"/>
-    </w:p>
-    <w:p>
-      <w:r>
-        <w:t>La prioridad principal para la siguiente iteración es incorporar un balance hídrico real de la parcela. La instrumentación podría combinar sondas capacitivas FDR o TDR para contenido volumétrico y tensiómetros para potencial matricial, instalados a varias profundidades representativas de la zona radicular. Como configuración inicial se propone un registro frecuente y una agregación horaria; Sui (2017) documenta un caso con lectura cada minuto, promedio horario y sensores a tres profundidades. La frecuencia definitiva deberá ajustarse al suelo, cultivo y sistema de riego. La tubería de datos controlaría rango físico, valores ausentes, deriva, conectividad y calibración específica del suelo antes de alimentar el DSS. Junto con capacidad de retención, profundidad radicular, precipitación efectiva y riego realmente aplicado, estas entradas permitirían estimar el agotamiento admisible de FAO-56, decidir no solo cuánto sino cuándo regar y aprovechar la lluvia almacenada (Allen et al., 1998). La telemetría no sustituye la caracterización agronómica ni prueba que una dosis recomendada se haya ejecutado. Cualquier mejora deberá validarse en campo; después podría estudiarse un riego deficitario que concentre el déficit en fases menos sensibles (Fereres &amp; Soriano, 2007).</w:t>
-      </w:r>
-    </w:p>
-    <w:p>
-      <w:r>
-        <w:t>Como complemento espacial, podría evaluarse la teledetección de Copernicus Sentinel-2 para estimar índices de vegetación como NDVI y observar diferencias de vigor dentro de la parcela (Drusch et al., 2012). Estos índices no sustituirían automáticamente el Kc de calendario. Servirían para investigar un Kc dinámico por cultivo y parcela, calibrado frente a sensores, observaciones de campo y ETc de referencia. La nubosidad, la frecuencia de adquisición y la resolución disponible deberían tratarse como fuentes de ausencia e incertidumbre, de modo que el sistema mantuviera la vía agronómica cuando la imagen no fuese representativa.</w:t>
-      </w:r>
-    </w:p>
-    <w:p>
-      <w:r>
-        <w:t>La segunda prioridad ya no es construir una primera ET0 prevista, sino validar prospectivamente Ridge h=1–9, ampliar la cobertura de Z06 y vigilar la deriva. Una tarea diaria archiva cada emisión y la contrasta con el primer valor SiAR disponible y sus revisiones. La puerta exige al menos 30 casos consolidados y pareados; sobre una ventana móvil máxima de 60 casos, Ridge debe reducir al menos un 5 % el MAE del respaldo de media de siete días. Si deja de cumplirse, el sistema vuelve automáticamente al respaldo. El reentrenamiento es anual y solo sustituye el artefacto vigente si supera el mismo control temporal. El archivo de emisiones AEMET permitirá evaluar y corregir el error local de la lluvia prevista.</w:t>
-      </w:r>
-    </w:p>
-    <w:p>
-      <w:r>
-        <w:t xml:space="preserve">La tercera prioridad es reevaluar el componente predictivo cuando existan más campañas, telemetría y previsiones archivadas. Los seis modelos de ETc actuales se utilizan como contraste de la vía física y solo pueden determinar la dosis cuando mejoran su MAE de prueba y existe una observación del día anterior. Con más información convendrá ensayar una corrección de la estimación física mediante el residuo entre ET0 × Kc y la referencia, usando únicamente datos disponibles al emitir. La mejora deberá evaluarse en bloques temporales nuevos, sin reutilizar </w:t>
-      </w:r>
-      <w:r>
-        <w:lastRenderedPageBreak/>
-        <w:t>para selección la misma prueba final. Los niveles de confianza actuales, definidos por reglas, podrían reemplazarse por intervalos calibrados (Hyndman &amp; Athanasopoulos, 2021).</w:t>
+        <w:t>ese grupo. Antes del umbral, su uso es provisional. El agregado global es diagnóstico y no sustituye esta decisión ni constituye una prueba de significación estadística. El reentrenamiento anual debe superar el control temporal antes de sustituir artefactos. El archivo de emisiones AEMET permitirá evaluar el error local de lluvia.</w:t>
+      </w:r>
+    </w:p>
+    <w:p>
+      <w:r>
+        <w:t>La tercera prioridad es reevaluar el componente predictivo cuando existan más campañas, telemetría y previsiones archivadas. Los seis modelos de ETc actuales se utilizan como contraste de la vía física y solo pueden determinar la dosis cuando mejoran su MAE de prueba y existe una observación del día anterior. Con más información convendrá ensayar una corrección de la estimación física mediante el residuo entre ET0 × Kc y la referencia, usando únicamente datos disponibles al emitir. La mejora deberá evaluarse en bloques temporales nuevos, sin reutilizar para selección la misma prueba final. Los niveles de confianza actuales, definidos por reglas, podrían reemplazarse por intervalos calibrados (Hyndman &amp; Athanasopoulos, 2021).</w:t>
       </w:r>
     </w:p>
     <w:p>
       <w:pPr>
         <w:pStyle w:val="Ttulo3"/>
       </w:pPr>
-      <w:bookmarkStart w:id="140" w:name="_Toc244210990"/>
+      <w:bookmarkStart w:id="140" w:name="_Toc244254099"/>
       <w:r>
         <w:rPr>
           <w:sz w:val="24"/>
@@ -37404,7 +37712,7 @@
       <w:pPr>
         <w:pStyle w:val="Ttulo3"/>
       </w:pPr>
-      <w:bookmarkStart w:id="141" w:name="_Toc244210991"/>
+      <w:bookmarkStart w:id="141" w:name="_Toc244254100"/>
       <w:r>
         <w:rPr>
           <w:sz w:val="24"/>
@@ -37415,12 +37723,15 @@
     </w:p>
     <w:p>
       <w:r>
-        <w:t>La industrialización debería ser gradual y proporcional al volumen real. Una primera etapa programaría procesos ligeros en Python o funciones gestionadas que conservaran cada respuesta JSON, su hora de emisión y su procedencia en una capa raw inmutable de almacenamiento de objetos. Una segunda capa normalizaría y particionaría los datos en Parquet por fuente, estación y fecha, con catálogo, controles de calidad y trazabilidad. Una base relacional quedaría reservada para usuarios, parcelas y recomendaciones; el histórico analítico se consultaría con DuckDB o Polars mientras el volumen sea moderado. Si una ampliación nacional y multianual exigiera consultas concurrentes, podría incorporarse un motor SQL distribuido como Trino, capaz de consultar formatos de tabla y archivos Parquet sobre almacenamiento de objetos (Trino, s. f.). Esta evolución sigue los principios de un lakehouse sin presentar Apache Hop, Impala, Hue o PySpark como requisitos. El procesamiento distribuido solo se justificaría mediante mediciones de volumen, latencia y coste que demostrasen una limitación del enfoque ligero. La aplicación seguiría necesitando un catálogo agronómico dinámico, operación, control de acceso y persistencia de consultas.</w:t>
-      </w:r>
-    </w:p>
-    <w:p>
+        <w:t xml:space="preserve">La industrialización debería ser gradual y proporcional al volumen real. Una primera etapa programaría procesos ligeros en Python o funciones gestionadas que conservaran cada respuesta JSON, su hora de emisión y su procedencia en una capa raw inmutable de almacenamiento de objetos. Una segunda capa normalizaría y particionaría los datos en Parquet por fuente, estación y </w:t>
+      </w:r>
       <w:r>
         <w:lastRenderedPageBreak/>
+        <w:t>fecha, con catálogo, controles de calidad y trazabilidad. Una base relacional quedaría reservada para usuarios, parcelas y recomendaciones; el histórico analítico se consultaría con DuckDB o Polars mientras el volumen sea moderado. Si una ampliación nacional y multianual exigiera consultas concurrentes, podría incorporarse un motor SQL distribuido como Trino, capaz de consultar formatos de tabla y archivos Parquet sobre almacenamiento de objetos (Trino, s. f.). Esta evolución sigue los principios de un lakehouse sin presentar Apache Hop, Impala, Hue o PySpark como requisitos. El procesamiento distribuido solo se justificaría mediante mediciones de volumen, latencia y coste que demostrasen una limitación del enfoque ligero. La aplicación seguiría necesitando un catálogo agronómico dinámico, operación, control de acceso y persistencia de consultas.</w:t>
+      </w:r>
+    </w:p>
+    <w:p>
+      <w:r>
         <w:t>La decisión de escalar debería incluir una práctica FinOps proporcional al producto: registrar coste por estación, cultivo y emisión, junto con consumo de API, almacenamiento, cómputo, transferencia y mantenimiento. Para el volumen actual, las ejecuciones bajo demanda y los archivos Parquet permiten mantener una infraestructura ligera; esta viabilidad debe demostrarse con mediciones, no presentarse como coste nulo. Antes de incorporar un motor distribuido se compararían coste total, latencia y carga operativa con la solución vigente y se fijarían umbrales que justificasen el cambio.</w:t>
       </w:r>
     </w:p>
@@ -37428,7 +37739,7 @@
       <w:pPr>
         <w:pStyle w:val="Ttulo3"/>
       </w:pPr>
-      <w:bookmarkStart w:id="142" w:name="_Toc244210992"/>
+      <w:bookmarkStart w:id="142" w:name="_Toc244254101"/>
       <w:r>
         <w:t>6.3.5. Operación, MLOps y control de deriva</w:t>
       </w:r>
@@ -37448,7 +37759,7 @@
       <w:pPr>
         <w:pStyle w:val="Ttulo3"/>
       </w:pPr>
-      <w:bookmarkStart w:id="143" w:name="_Toc244210993"/>
+      <w:bookmarkStart w:id="143" w:name="_Toc244254102"/>
       <w:r>
         <w:t>6.3.6. Ciencia abierta y principios FAIR</w:t>
       </w:r>
@@ -37456,7 +37767,11 @@
     </w:p>
     <w:p>
       <w:r>
-        <w:t>La reutilización académica requiere que cada versión pueda encontrarse, comprenderse y reproducirse. El repositorio incorpora un archivo de citación, licencia para los activos propios, ficha del conjunto, diccionarios de variables, procedencia y comandos de reproducción. Los formatos CSV y JSON, las fechas ISO 8601 y las claves de estación, cultivo y fecha facilitan la interoperabilidad. Estas medidas aplican los principios FAIR sin confundir accesibilidad con apertura irrestricta (Wilkinson et al., 2016).</w:t>
+        <w:t xml:space="preserve">La reutilización académica requiere que cada versión pueda encontrarse, comprenderse y reproducirse. El repositorio incorpora un archivo de citación, licencia para los activos propios, ficha </w:t>
+      </w:r>
+      <w:r>
+        <w:lastRenderedPageBreak/>
+        <w:t>del conjunto, diccionarios de variables, procedencia y comandos de reproducción. Los formatos CSV y JSON, las fechas ISO 8601 y las claves de estación, cultivo y fecha facilitan la interoperabilidad. Estas medidas aplican los principios FAIR sin confundir accesibilidad con apertura irrestricta (Wilkinson et al., 2016).</w:t>
       </w:r>
     </w:p>
     <w:p>
@@ -37468,9 +37783,8 @@
       <w:pPr>
         <w:pStyle w:val="Ttulo3"/>
       </w:pPr>
-      <w:bookmarkStart w:id="144" w:name="_Toc244210994"/>
-      <w:r>
-        <w:lastRenderedPageBreak/>
+      <w:bookmarkStart w:id="144" w:name="_Toc244254103"/>
+      <w:r>
         <w:t>6.3.7. Consideración final</w:t>
       </w:r>
       <w:bookmarkEnd w:id="144"/>
@@ -37485,7 +37799,7 @@
         <w:pStyle w:val="Ttulo1"/>
         <w:pageBreakBefore/>
       </w:pPr>
-      <w:bookmarkStart w:id="145" w:name="_Toc244210995"/>
+      <w:bookmarkStart w:id="145" w:name="_Toc244254104"/>
       <w:r>
         <w:lastRenderedPageBreak/>
         <w:t>Referencias bibliográficas</w:t>
@@ -38419,7 +38733,7 @@
       <w:pPr>
         <w:pStyle w:val="Ttulo1"/>
       </w:pPr>
-      <w:bookmarkStart w:id="146" w:name="_Toc244210996"/>
+      <w:bookmarkStart w:id="146" w:name="_Toc244254105"/>
       <w:r>
         <w:lastRenderedPageBreak/>
         <w:t>Anexo A. Reproducción y localización de las evidencias</w:t>
@@ -38428,53 +38742,14 @@
     </w:p>
     <w:p>
       <w:r>
-        <w:t xml:space="preserve">El repositorio de entrega, con código, CSV de muestra y resultados, es </w:t>
-      </w:r>
-      <w:hyperlink r:id="rId64">
-        <w:r>
-          <w:rPr>
-            <w:color w:val="0563C1"/>
-            <w:u w:val="single"/>
-          </w:rPr>
-          <w:t>https://github.com/AdrianPL15/tfm-regadio-dss.</w:t>
-        </w:r>
-      </w:hyperlink>
-      <w:r>
-        <w:t xml:space="preserve"> Procede del trabajo del equipo en </w:t>
-      </w:r>
-      <w:hyperlink r:id="rId65">
-        <w:r>
-          <w:rPr>
-            <w:color w:val="0563C1"/>
-            <w:u w:val="single"/>
-          </w:rPr>
-          <w:t>https://github.com/al1sr/tfm-regadio-dss;</w:t>
-        </w:r>
-      </w:hyperlink>
-      <w:r>
-        <w:t xml:space="preserve"> las rutas siguientes corresponden al repositorio de entrega en su rama main. Los ensayos con CSV versionados y las pruebas no requieren credenciales. La aplicación pública está en </w:t>
-      </w:r>
-      <w:hyperlink r:id="rId66">
-        <w:r>
-          <w:rPr>
-            <w:color w:val="0563C1"/>
-            <w:u w:val="single"/>
-          </w:rPr>
-          <w:t>https://tfm-regadio-dss-adrianpl15.streamlit.app/.</w:t>
-        </w:r>
-      </w:hyperlink>
-      <w:r>
-        <w:t xml:space="preserve"> Las consultas nuevas a AEMET requieren una clave privada fuera de Git.</w:t>
-      </w:r>
-      <w:r>
-        <w:t xml:space="preserve"> El estado reproducible de esta entrega queda fijado en la etiqueta v1.0.6-entrega-final de main; los comandos de este anexo deben ejecutarse desde esa referencia.</w:t>
+        <w:t>El repositorio de entrega, con código, CSV de muestra y resultados, es https://github.com/AdrianPL15/tfm-regadio-dss. Procede del trabajo del equipo en https://github.com/al1sr/tfm-regadio-dss; las rutas siguientes corresponden al repositorio de entrega en su rama main. Los ensayos con CSV versionados y las pruebas no requieren credenciales. La aplicación pública está en https://tfm-regadio-dss-adrianpl15.streamlit.app/. Las consultas nuevas a AEMET requieren una clave privada fuera de Git. El estado reproducible de esta entrega queda fijado en la etiqueta v1.0.7-entrega-final de main; los comandos de este anexo deben ejecutarse desde esa referencia.</w:t>
       </w:r>
     </w:p>
     <w:p>
       <w:pPr>
         <w:pStyle w:val="Ttulo2"/>
       </w:pPr>
-      <w:bookmarkStart w:id="147" w:name="_Toc244210997"/>
+      <w:bookmarkStart w:id="147" w:name="_Toc244254106"/>
       <w:r>
         <w:t>A.1. Archivos principales</w:t>
       </w:r>
@@ -39018,13 +39293,7 @@
               <w:rPr>
                 <w:sz w:val="16"/>
               </w:rPr>
-              <w:t xml:space="preserve">src/data/prepare_et0_history.py; src/models/train_et0_multiyear.py y export_et0_multiyear.py; src/analysis/evaluate_et0_multiyear.py y validate_et0_robustness.py; métricas en docs/data_samples/et0_multiyear_*; 27 artefactos en </w:t>
-            </w:r>
-            <w:r>
-              <w:rPr>
-                <w:sz w:val="16"/>
-              </w:rPr>
-              <w:t>models/experimental_et0_multiyear/</w:t>
+              <w:t>src/data/prepare_et0_history.py; src/models/train_et0_multiyear.py y export_et0_multiyear.py; src/analysis/evaluate_et0_multiyear.py y validate_et0_robustness.py; métricas en docs/data_samples/et0_multiyear_*; 27 artefactos en models/experimental_et0_multiyear/</w:t>
             </w:r>
           </w:p>
         </w:tc>
@@ -39086,7 +39355,7 @@
       <w:pPr>
         <w:pStyle w:val="Ttulo2"/>
       </w:pPr>
-      <w:bookmarkStart w:id="149" w:name="_Toc244210998"/>
+      <w:bookmarkStart w:id="149" w:name="_Toc244254107"/>
       <w:r>
         <w:t>A.2. Secuencia mínima de reproducción</w:t>
       </w:r>
@@ -39094,7 +39363,7 @@
     </w:p>
     <w:p>
       <w:r>
-        <w:t>Desde la raíz del repositorio de entrega en main, tras crear un entorno virtual e instalar requirements.txt, los siguientes comandos regeneran las evidencias versionadas sin consultar las APIs. La última orden prospectiva requiere SIAR_API_TOKEN y AEMET_API_KEY cuando se ejecuta contra servicios vivos; las pruebas y la evaluación retrospectiva no requieren credenciales.</w:t>
+        <w:t>Desde la raíz del repositorio de entrega en main, tras crear un entorno virtual e instalar requirements-reproducible.txt con Python 3.12, los siguientes comandos regeneran las evidencias versionadas sin consultar las APIs. La última orden prospectiva requiere SIAR_API_TOKEN y AEMET_API_KEY cuando se ejecuta contra servicios vivos; las pruebas y la evaluación retrospectiva no requieren credenciales.</w:t>
       </w:r>
     </w:p>
     <w:p>
@@ -39106,6 +39375,7 @@
         <w:rPr>
           <w:sz w:val="19"/>
         </w:rPr>
+        <w:lastRenderedPageBreak/>
         <w:t>python -m src.analysis.build_etl_audit_4_1</w:t>
       </w:r>
     </w:p>
@@ -39153,7 +39423,6 @@
         <w:rPr>
           <w:sz w:val="19"/>
         </w:rPr>
-        <w:lastRenderedPageBreak/>
         <w:t>python -m src.analysis.build_validation_5_3</w:t>
       </w:r>
     </w:p>
@@ -39235,8 +39504,8 @@
       </w:r>
     </w:p>
     <w:sectPr>
-      <w:headerReference w:type="default" r:id="rId67"/>
-      <w:footerReference w:type="default" r:id="rId68"/>
+      <w:headerReference w:type="default" r:id="rId64"/>
+      <w:footerReference w:type="default" r:id="rId65"/>
       <w:pgSz w:w="11906" w:h="16838" w:code="9"/>
       <w:pgMar w:top="1134" w:right="1134" w:bottom="1134" w:left="1134" w:header="567" w:footer="567" w:gutter="0"/>
       <w:cols w:space="708"/>
@@ -42297,6 +42566,21 @@
 </file>
 
 <file path=customXml/item1.xml><?xml version="1.0" encoding="utf-8"?>
+<?mso-contentType ?>
+<FormTemplates xmlns="http://schemas.microsoft.com/sharepoint/v3/contenttype/forms">
+  <Display>DocumentLibraryForm</Display>
+  <Edit>DocumentLibraryForm</Edit>
+  <New>DocumentLibraryForm</New>
+</FormTemplates>
+</file>
+
+<file path=customXml/item2.xml><?xml version="1.0" encoding="utf-8"?>
+<p:properties xmlns:p="http://schemas.microsoft.com/office/2006/metadata/properties" xmlns:xsi="http://www.w3.org/2001/XMLSchema-instance" xmlns:pc="http://schemas.microsoft.com/office/infopath/2007/PartnerControls">
+  <documentManagement/>
+</p:properties>
+</file>
+
+<file path=customXml/item3.xml><?xml version="1.0" encoding="utf-8"?>
 <ct:contentTypeSchema xmlns:ct="http://schemas.microsoft.com/office/2006/metadata/contentType" xmlns:ma="http://schemas.microsoft.com/office/2006/metadata/properties/metaAttributes" ct:_="" ma:_="" ma:contentTypeName="Documento" ma:contentTypeID="0x01010019FAAD7208B57F46B26AFFED99BCE0D3" ma:contentTypeVersion="12" ma:contentTypeDescription="Crear nuevo documento." ma:contentTypeScope="" ma:versionID="1ef574cbf204855aeab3c40b347ffcdd">
   <xsd:schema xmlns:xsd="http://www.w3.org/2001/XMLSchema" xmlns:xs="http://www.w3.org/2001/XMLSchema" xmlns:p="http://schemas.microsoft.com/office/2006/metadata/properties" xmlns:ns2="9d7b9a5c-6b4f-4ca1-bb03-c38cacb734bc" xmlns:ns3="7d80c08f-e909-465c-8aa4-0e649fbe85d0" targetNamespace="http://schemas.microsoft.com/office/2006/metadata/properties" ma:root="true" ma:fieldsID="d90f8574e5bf50e8ad773515e43a9e2d" ns2:_="" ns3:_="">
     <xsd:import namespace="9d7b9a5c-6b4f-4ca1-bb03-c38cacb734bc"/>
@@ -42513,22 +42797,24 @@
 </ct:contentTypeSchema>
 </file>
 
-<file path=customXml/item2.xml><?xml version="1.0" encoding="utf-8"?>
-<?mso-contentType ?>
-<FormTemplates xmlns="http://schemas.microsoft.com/sharepoint/v3/contenttype/forms">
-  <Display>DocumentLibraryForm</Display>
-  <Edit>DocumentLibraryForm</Edit>
-  <New>DocumentLibraryForm</New>
-</FormTemplates>
+<file path=customXml/itemProps1.xml><?xml version="1.0" encoding="utf-8"?>
+<ds:datastoreItem xmlns:ds="http://schemas.openxmlformats.org/officeDocument/2006/customXml" ds:itemID="{E5FD6A2B-9479-4129-9D84-6C858DBE1A90}">
+  <ds:schemaRefs>
+    <ds:schemaRef ds:uri="http://schemas.microsoft.com/sharepoint/v3/contenttype/forms"/>
+  </ds:schemaRefs>
+</ds:datastoreItem>
 </file>
 
-<file path=customXml/item3.xml><?xml version="1.0" encoding="utf-8"?>
-<p:properties xmlns:p="http://schemas.microsoft.com/office/2006/metadata/properties" xmlns:xsi="http://www.w3.org/2001/XMLSchema-instance" xmlns:pc="http://schemas.microsoft.com/office/infopath/2007/PartnerControls">
-  <documentManagement/>
-</p:properties>
+<file path=customXml/itemProps2.xml><?xml version="1.0" encoding="utf-8"?>
+<ds:datastoreItem xmlns:ds="http://schemas.openxmlformats.org/officeDocument/2006/customXml" ds:itemID="{261B0A37-6C6C-45CF-A5C4-83D994BC3980}">
+  <ds:schemaRefs>
+    <ds:schemaRef ds:uri="http://schemas.microsoft.com/office/2006/metadata/properties"/>
+    <ds:schemaRef ds:uri="http://schemas.microsoft.com/office/infopath/2007/PartnerControls"/>
+  </ds:schemaRefs>
+</ds:datastoreItem>
 </file>
 
-<file path=customXml/itemProps1.xml><?xml version="1.0" encoding="utf-8"?>
+<file path=customXml/itemProps3.xml><?xml version="1.0" encoding="utf-8"?>
 <ds:datastoreItem xmlns:ds="http://schemas.openxmlformats.org/officeDocument/2006/customXml" ds:itemID="{01B4916B-2905-40FE-B973-786E02856A77}">
   <ds:schemaRefs>
     <ds:schemaRef ds:uri="http://schemas.microsoft.com/office/2006/metadata/contentType"/>
@@ -42545,21 +42831,4 @@
     <ds:schemaRef ds:uri="http://schemas.microsoft.com/internal/obd"/>
   </ds:schemaRefs>
 </ds:datastoreItem>
-</file>
-
-<file path=customXml/itemProps2.xml><?xml version="1.0" encoding="utf-8"?>
-<ds:datastoreItem xmlns:ds="http://schemas.openxmlformats.org/officeDocument/2006/customXml" ds:itemID="{E5FD6A2B-9479-4129-9D84-6C858DBE1A90}">
-  <ds:schemaRefs>
-    <ds:schemaRef ds:uri="http://schemas.microsoft.com/sharepoint/v3/contenttype/forms"/>
-  </ds:schemaRefs>
-</ds:datastoreItem>
-</file>
-
-<file path=customXml/itemProps3.xml><?xml version="1.0" encoding="utf-8"?>
-<ds:datastoreItem xmlns:ds="http://schemas.openxmlformats.org/officeDocument/2006/customXml" ds:itemID="{261B0A37-6C6C-45CF-A5C4-83D994BC3980}">
-  <ds:schemaRefs>
-    <ds:schemaRef ds:uri="http://schemas.microsoft.com/office/2006/metadata/properties"/>
-    <ds:schemaRef ds:uri="http://schemas.microsoft.com/office/infopath/2007/PartnerControls"/>
-  </ds:schemaRefs>
-</ds:datastoreItem>
 </file>
</xml_diff>